<commit_message>
Add newer laws, rules and case law to the DTIA India redline as tracked changes
Adds tracked insertions with sourced comments for the IT Intermediary Rules (as amended to Feb 2026), Telecom Cyber Security Rules 2024/2025 and SIM-binding directions, Principal Telecom Services Authorisation Rules 2026, DPDP constitutional challenges, Immigration and Foreigners Act 2025, recent High Court interception rulings (Madras, Chhattisgarh, Delhi), pending SC digital-device matters, X Corp (Art. 19), Anuradha Bhasin, Latombe and the UK DUAA 2025; annex extended.

Co-Authored-By: Claude Opus 5.5 <noreply@anthropic.com>
Claude-Session: https://claude.ai/code/session_01Ne9FcuM3um21sC2rt3Q8um
</commit_message>
<xml_diff>
--- a/DTIA India - Surveillance Law Redline (28 Oct 2026).docx
+++ b/DTIA India - Surveillance Law Redline (28 Oct 2026).docx
@@ -106,7 +106,7 @@
         </w:rPr>
         <w:t xml:space="preserve"> to provide certain information, for instance by breaking the encryption key or hacking the network.</w:t>
       </w:r>
-      <w:commentRangeStart w:id="32"/>
+      <w:commentRangeStart w:id="46"/>
       <w:ins w:id="6" w:author="Claude" w:date="2026-10-28T00:00:00Z">
         <w:r>
           <w:rPr>
@@ -116,9 +116,23 @@
           <w:t xml:space="preserve"> The United States Foreign Intelligence Surveillance Act of 1978 (FISA) is United States legislation and cannot be invoked by Indian authorities; it is relevant only to the extent that the data importer or its sub-processors are, or use, United States electronic communication service providers (for example, US-based cloud or email services).</w:t>
         </w:r>
       </w:ins>
-      <w:commentRangeEnd w:id="32"/>
-      <w:r>
-        <w:commentReference w:id="32"/>
+      <w:commentRangeEnd w:id="46"/>
+      <w:r>
+        <w:commentReference w:id="46"/>
+      </w:r>
+      <w:commentRangeStart w:id="44"/>
+      <w:ins w:id="7" w:author="Claude" w:date="2026-10-28T00:00:00Z">
+        <w:r>
+          <w:rPr>
+            <w:b w:val="false"/>
+            <w:bCs w:val="false"/>
+          </w:rPr>
+          <w:t xml:space="preserve"> For transfers to certified US recipients, the EU–US Data Privacy Framework adequacy decision was upheld by the General Court on 3 September 2025 (Latombe v. Commission, Case T-553/23); an appeal (Case C-703/25 P) is pending before the Court of Justice.</w:t>
+        </w:r>
+      </w:ins>
+      <w:commentRangeEnd w:id="44"/>
+      <w:r>
+        <w:commentReference w:id="44"/>
       </w:r>
       <w:r>
         <w:rPr>
@@ -167,7 +181,7 @@
         <w:t xml:space="preserve">Section 69 of the IT Act empowers the central and state governments to direct any agencies of the appropriate government to intercept, monitor, or decrypt or cause to be intercepted or monitored or decrypted any information generated, transmitted, received or stored in any computer resource. Such direction may be provided by the central </w:t>
       </w:r>
       <w:commentRangeStart w:id="1"/>
-      <w:del w:id="7" w:author="Claude" w:date="2026-10-28T00:00:00Z">
+      <w:del w:id="8" w:author="Claude" w:date="2026-10-28T00:00:00Z">
         <w:r>
           <w:rPr>
             <w:b w:val="false"/>
@@ -176,7 +190,7 @@
           <w:delText xml:space="preserve">and</w:delText>
         </w:r>
       </w:del>
-      <w:ins w:id="8" w:author="Claude" w:date="2026-10-28T00:00:00Z">
+      <w:ins w:id="9" w:author="Claude" w:date="2026-10-28T00:00:00Z">
         <w:r>
           <w:rPr>
             <w:b w:val="false"/>
@@ -192,7 +206,7 @@
         </w:rPr>
         <w:t xml:space="preserve"> state governments or any </w:t>
       </w:r>
-      <w:del w:id="9" w:author="Claude" w:date="2026-10-28T00:00:00Z">
+      <w:del w:id="10" w:author="Claude" w:date="2026-10-28T00:00:00Z">
         <w:r>
           <w:rPr>
             <w:b w:val="false"/>
@@ -201,7 +215,7 @@
           <w:delText xml:space="preserve">authorized officers authorized by such governments</w:delText>
         </w:r>
       </w:del>
-      <w:ins w:id="10" w:author="Claude" w:date="2026-10-28T00:00:00Z">
+      <w:ins w:id="11" w:author="Claude" w:date="2026-10-28T00:00:00Z">
         <w:r>
           <w:rPr>
             <w:b w:val="false"/>
@@ -217,7 +231,7 @@
         </w:rPr>
         <w:t xml:space="preserve"> in the interest of sovereignty</w:t>
       </w:r>
-      <w:del w:id="11" w:author="Claude" w:date="2026-10-28T00:00:00Z">
+      <w:del w:id="12" w:author="Claude" w:date="2026-10-28T00:00:00Z">
         <w:r>
           <w:rPr>
             <w:b w:val="false"/>
@@ -226,7 +240,7 @@
           <w:delText xml:space="preserve">, integrity, security of the state of India and defense of India</w:delText>
         </w:r>
       </w:del>
-      <w:ins w:id="12" w:author="Claude" w:date="2026-10-28T00:00:00Z">
+      <w:ins w:id="13" w:author="Claude" w:date="2026-10-28T00:00:00Z">
         <w:r>
           <w:rPr>
             <w:b w:val="false"/>
@@ -259,7 +273,7 @@
         </w:rPr>
         <w:t xml:space="preserve">Furthermore, Section 69B of the IT Act grants the central government power to authorize any government agency by notification in the Official Gazette to monitor and collect traffic data, that is, data identifying or purporting to </w:t>
       </w:r>
-      <w:del w:id="13" w:author="Claude" w:date="2026-10-28T00:00:00Z">
+      <w:del w:id="14" w:author="Claude" w:date="2026-10-28T00:00:00Z">
         <w:r>
           <w:rPr>
             <w:b w:val="false"/>
@@ -268,7 +282,7 @@
           <w:delText xml:space="preserve">the identity of</w:delText>
         </w:r>
       </w:del>
-      <w:ins w:id="14" w:author="Claude" w:date="2026-10-28T00:00:00Z">
+      <w:ins w:id="15" w:author="Claude" w:date="2026-10-28T00:00:00Z">
         <w:r>
           <w:rPr>
             <w:b w:val="false"/>
@@ -284,7 +298,7 @@
         </w:rPr>
         <w:t xml:space="preserve"> any person, computer system or computer network, or location to or from which the communication is or may be transmitted, and includes communications origin, destination, route, time, data, size, duration or type of underlying service, and any other information</w:t>
       </w:r>
-      <w:ins w:id="15" w:author="Claude" w:date="2026-10-28T00:00:00Z">
+      <w:ins w:id="16" w:author="Claude" w:date="2026-10-28T00:00:00Z">
         <w:r>
           <w:rPr>
             <w:b w:val="false"/>
@@ -300,7 +314,7 @@
         </w:rPr>
         <w:t xml:space="preserve"> to enhance cybersecurity</w:t>
       </w:r>
-      <w:del w:id="16" w:author="Claude" w:date="2026-10-28T00:00:00Z">
+      <w:del w:id="17" w:author="Claude" w:date="2026-10-28T00:00:00Z">
         <w:r>
           <w:rPr>
             <w:b w:val="false"/>
@@ -309,7 +323,7 @@
           <w:delText xml:space="preserve">,</w:delText>
         </w:r>
       </w:del>
-      <w:ins w:id="17" w:author="Claude" w:date="2026-10-28T00:00:00Z">
+      <w:ins w:id="18" w:author="Claude" w:date="2026-10-28T00:00:00Z">
         <w:r>
           <w:rPr>
             <w:b w:val="false"/>
@@ -326,7 +340,7 @@
         <w:t xml:space="preserve"> identification, analysis and prevention of intrusion or spread of </w:t>
       </w:r>
       <w:commentRangeStart w:id="2"/>
-      <w:del w:id="18" w:author="Claude" w:date="2026-10-28T00:00:00Z">
+      <w:del w:id="19" w:author="Claude" w:date="2026-10-28T00:00:00Z">
         <w:r>
           <w:rPr>
             <w:b w:val="false"/>
@@ -335,7 +349,7 @@
           <w:delText xml:space="preserve">a computer containment</w:delText>
         </w:r>
       </w:del>
-      <w:ins w:id="19" w:author="Claude" w:date="2026-10-28T00:00:00Z">
+      <w:ins w:id="20" w:author="Claude" w:date="2026-10-28T00:00:00Z">
         <w:r>
           <w:rPr>
             <w:b w:val="false"/>
@@ -356,7 +370,7 @@
         <w:t xml:space="preserve">. </w:t>
       </w:r>
       <w:commentRangeStart w:id="3"/>
-      <w:del w:id="20" w:author="Claude" w:date="2026-10-28T00:00:00Z">
+      <w:del w:id="21" w:author="Claude" w:date="2026-10-28T00:00:00Z">
         <w:r>
           <w:rPr>
             <w:b w:val="false"/>
@@ -365,7 +379,7 @@
           <w:delText xml:space="preserve">The intermediary or persons in charge of such computer resources, when called upon, are required to extend all facilities and technical assistance to facilitate such interception, monitoring or decryption, or face imprisonment and/or fines for non-compliance.</w:delText>
         </w:r>
       </w:del>
-      <w:ins w:id="21" w:author="Claude" w:date="2026-10-28T00:00:00Z">
+      <w:ins w:id="22" w:author="Claude" w:date="2026-10-28T00:00:00Z">
         <w:r>
           <w:rPr>
             <w:b w:val="false"/>
@@ -410,7 +424,7 @@
         <w:t xml:space="preserve">In this regard, the </w:t>
       </w:r>
       <w:commentRangeStart w:id="5"/>
-      <w:del w:id="22" w:author="Claude" w:date="2026-10-28T00:00:00Z">
+      <w:del w:id="23" w:author="Claude" w:date="2026-10-28T00:00:00Z">
         <w:r>
           <w:rPr>
             <w:b w:val="false"/>
@@ -419,7 +433,7 @@
           <w:delText xml:space="preserve">information technology procedure and safeguards for interception, monitoring and decryption of information rules 2009, the interception rules,</w:delText>
         </w:r>
       </w:del>
-      <w:ins w:id="23" w:author="Claude" w:date="2026-10-28T00:00:00Z">
+      <w:ins w:id="24" w:author="Claude" w:date="2026-10-28T00:00:00Z">
         <w:r>
           <w:rPr>
             <w:b w:val="false"/>
@@ -435,7 +449,7 @@
         </w:rPr>
         <w:t xml:space="preserve"> and the </w:t>
       </w:r>
-      <w:del w:id="24" w:author="Claude" w:date="2026-10-28T00:00:00Z">
+      <w:del w:id="25" w:author="Claude" w:date="2026-10-28T00:00:00Z">
         <w:r>
           <w:rPr>
             <w:b w:val="false"/>
@@ -444,7 +458,7 @@
           <w:delText xml:space="preserve">information technology procedure and safeguards for monitoring and collecting traffic data or information rules of 2009, the monitoring rules,</w:delText>
         </w:r>
       </w:del>
-      <w:ins w:id="25" w:author="Claude" w:date="2026-10-28T00:00:00Z">
+      <w:ins w:id="26" w:author="Claude" w:date="2026-10-28T00:00:00Z">
         <w:r>
           <w:rPr>
             <w:b w:val="false"/>
@@ -460,7 +474,7 @@
         </w:rPr>
         <w:t xml:space="preserve"> set out the procedural law for any cyber surveillance conducted under Section</w:t>
       </w:r>
-      <w:del w:id="26" w:author="Claude" w:date="2026-10-28T00:00:00Z">
+      <w:del w:id="27" w:author="Claude" w:date="2026-10-28T00:00:00Z">
         <w:r>
           <w:rPr>
             <w:b w:val="false"/>
@@ -469,7 +483,7 @@
           <w:delText xml:space="preserve"> 69</w:delText>
         </w:r>
       </w:del>
-      <w:ins w:id="27" w:author="Claude" w:date="2026-10-28T00:00:00Z">
+      <w:ins w:id="28" w:author="Claude" w:date="2026-10-28T00:00:00Z">
         <w:r>
           <w:rPr>
             <w:b w:val="false"/>
@@ -485,7 +499,7 @@
         </w:rPr>
         <w:t xml:space="preserve"> of the Information Technology Act, including interception, monitoring and decryption of information and monitoring and collecting traffic data processed through a computer resource.</w:t>
       </w:r>
-      <w:ins w:id="28" w:author="Claude" w:date="2026-10-28T00:00:00Z">
+      <w:ins w:id="29" w:author="Claude" w:date="2026-10-28T00:00:00Z">
         <w:r>
           <w:rPr>
             <w:b w:val="false"/>
@@ -504,8 +518,28 @@
         <w:spacing w:after="120" w:before="0" w:line="276"/>
         <w:jc w:val="both"/>
       </w:pPr>
+      <w:commentRangeStart w:id="32"/>
+      <w:ins w:id="30" w:author="Claude" w:date="2026-10-28T00:00:00Z">
+        <w:r>
+          <w:rPr>
+            <w:b w:val="false"/>
+            <w:bCs w:val="false"/>
+          </w:rPr>
+          <w:t xml:space="preserve">The Information Technology (Intermediary Guidelines and Digital Media Ethics Code) Rules, 2021 (the Intermediary Rules), made under the IT Act, also facilitate government access to data held by intermediaries, which include the email, messaging, cloud and hosting providers that the data importer may use. Under rule 3(1)(j), an intermediary must, as soon as possible and not later than seventy-two hours after receiving an order, provide information under its control or possession, or assistance, to a government agency lawfully authorised for investigative, protective or cyber security activities, for verification of identity, for the prevention, detection, investigation or prosecution of offences, or for cyber security incidents. Under rule 4(2), a significant social media intermediary providing messaging services must enable identification of the first originator of information when required by a court order or by an order of the competent authority under Section 69 of the IT Act; WhatsApp's challenge to this traceability requirement remains pending before the Delhi High Court. The Intermediary Rules were last amended with effect from 20 February 2026 (G.S.R. 120(E), dated 10 February 2026), principally to regulate synthetically generated information and to shorten takedown timelines (for example, to three hours for unlawful content notified by a court or the government under rule 3(1)(d)); the access obligations in rules 3(1)(j) and 4(2) continue to apply.</w:t>
+        </w:r>
+      </w:ins>
+      <w:commentRangeEnd w:id="32"/>
+      <w:r>
+        <w:commentReference w:id="32"/>
+      </w:r>
+    </w:p>
+    <w:p>
+      <w:pPr>
+        <w:spacing w:after="120" w:before="0" w:line="276"/>
+        <w:jc w:val="both"/>
+      </w:pPr>
       <w:commentRangeStart w:id="6"/>
-      <w:del w:id="29" w:author="Claude" w:date="2026-10-28T00:00:00Z">
+      <w:del w:id="31" w:author="Claude" w:date="2026-10-28T00:00:00Z">
         <w:r>
           <w:rPr>
             <w:b w:val="false"/>
@@ -514,7 +548,7 @@
           <w:delText xml:space="preserve">pursuant</w:delText>
         </w:r>
       </w:del>
-      <w:ins w:id="30" w:author="Claude" w:date="2026-10-28T00:00:00Z">
+      <w:ins w:id="32" w:author="Claude" w:date="2026-10-28T00:00:00Z">
         <w:r>
           <w:rPr>
             <w:b w:val="false"/>
@@ -530,7 +564,7 @@
         </w:rPr>
         <w:t xml:space="preserve"> to </w:t>
       </w:r>
-      <w:ins w:id="31" w:author="Claude" w:date="2026-10-28T00:00:00Z">
+      <w:ins w:id="33" w:author="Claude" w:date="2026-10-28T00:00:00Z">
         <w:r>
           <w:rPr>
             <w:b w:val="false"/>
@@ -546,7 +580,7 @@
         </w:rPr>
         <w:t xml:space="preserve">rule 6(1) of the </w:t>
       </w:r>
-      <w:del w:id="32" w:author="Claude" w:date="2026-10-28T00:00:00Z">
+      <w:del w:id="34" w:author="Claude" w:date="2026-10-28T00:00:00Z">
         <w:r>
           <w:rPr>
             <w:b w:val="false"/>
@@ -555,7 +589,7 @@
           <w:delText xml:space="preserve">information technology reasonable security practices and procedures and sensitive personal data or information rules 2011, the SPDI rules. Sensitive</w:delText>
         </w:r>
       </w:del>
-      <w:ins w:id="33" w:author="Claude" w:date="2026-10-28T00:00:00Z">
+      <w:ins w:id="35" w:author="Claude" w:date="2026-10-28T00:00:00Z">
         <w:r>
           <w:rPr>
             <w:b w:val="false"/>
@@ -571,7 +605,7 @@
         </w:rPr>
         <w:t xml:space="preserve"> personal data or information may be shared without obtaining the prior consent of the data subject with a government agency </w:t>
       </w:r>
-      <w:del w:id="34" w:author="Claude" w:date="2026-10-28T00:00:00Z">
+      <w:del w:id="36" w:author="Claude" w:date="2026-10-28T00:00:00Z">
         <w:r>
           <w:rPr>
             <w:b w:val="false"/>
@@ -580,7 +614,7 @@
           <w:delText xml:space="preserve">if such activity is</w:delText>
         </w:r>
       </w:del>
-      <w:ins w:id="35" w:author="Claude" w:date="2026-10-28T00:00:00Z">
+      <w:ins w:id="37" w:author="Claude" w:date="2026-10-28T00:00:00Z">
         <w:r>
           <w:rPr>
             <w:b w:val="false"/>
@@ -596,7 +630,7 @@
         </w:rPr>
         <w:t xml:space="preserve"> mandated under law</w:t>
       </w:r>
-      <w:ins w:id="36" w:author="Claude" w:date="2026-10-28T00:00:00Z">
+      <w:ins w:id="38" w:author="Claude" w:date="2026-10-28T00:00:00Z">
         <w:r>
           <w:rPr>
             <w:b w:val="false"/>
@@ -612,7 +646,7 @@
         </w:rPr>
         <w:t xml:space="preserve"> for verification of identity, prevention, detection and investigation purposes, including cyber incidents, prosecution and punishment of offenses. Such data sharing activity would require the government agency to send a request in writing to the </w:t>
       </w:r>
-      <w:del w:id="37" w:author="Claude" w:date="2026-10-28T00:00:00Z">
+      <w:del w:id="39" w:author="Claude" w:date="2026-10-28T00:00:00Z">
         <w:r>
           <w:rPr>
             <w:b w:val="false"/>
@@ -621,7 +655,7 @@
           <w:delText xml:space="preserve">data controller or data processor</w:delText>
         </w:r>
       </w:del>
-      <w:ins w:id="38" w:author="Claude" w:date="2026-10-28T00:00:00Z">
+      <w:ins w:id="40" w:author="Claude" w:date="2026-10-28T00:00:00Z">
         <w:r>
           <w:rPr>
             <w:b w:val="false"/>
@@ -637,7 +671,7 @@
         </w:rPr>
         <w:t xml:space="preserve"> stating </w:t>
       </w:r>
-      <w:ins w:id="39" w:author="Claude" w:date="2026-10-28T00:00:00Z">
+      <w:ins w:id="41" w:author="Claude" w:date="2026-10-28T00:00:00Z">
         <w:r>
           <w:rPr>
             <w:b w:val="false"/>
@@ -653,7 +687,7 @@
         </w:rPr>
         <w:t xml:space="preserve">the purpose of seeking such disclosure. The government agency </w:t>
       </w:r>
-      <w:del w:id="40" w:author="Claude" w:date="2026-10-28T00:00:00Z">
+      <w:del w:id="42" w:author="Claude" w:date="2026-10-28T00:00:00Z">
         <w:r>
           <w:rPr>
             <w:b w:val="false"/>
@@ -662,7 +696,7 @@
           <w:delText xml:space="preserve">shall not be allowed to share</w:delText>
         </w:r>
       </w:del>
-      <w:ins w:id="41" w:author="Claude" w:date="2026-10-28T00:00:00Z">
+      <w:ins w:id="43" w:author="Claude" w:date="2026-10-28T00:00:00Z">
         <w:r>
           <w:rPr>
             <w:b w:val="false"/>
@@ -678,7 +712,7 @@
         </w:rPr>
         <w:t xml:space="preserve"> the information </w:t>
       </w:r>
-      <w:del w:id="42" w:author="Claude" w:date="2026-10-28T00:00:00Z">
+      <w:del w:id="44" w:author="Claude" w:date="2026-10-28T00:00:00Z">
         <w:r>
           <w:rPr>
             <w:b w:val="false"/>
@@ -687,7 +721,7 @@
           <w:delText xml:space="preserve">obtained under Rule 6 of the SPDI rules</w:delText>
         </w:r>
       </w:del>
-      <w:ins w:id="43" w:author="Claude" w:date="2026-10-28T00:00:00Z">
+      <w:ins w:id="45" w:author="Claude" w:date="2026-10-28T00:00:00Z">
         <w:r>
           <w:rPr>
             <w:b w:val="false"/>
@@ -703,7 +737,7 @@
         </w:rPr>
         <w:t xml:space="preserve"> with any other person. However,</w:t>
       </w:r>
-      <w:ins w:id="44" w:author="Claude" w:date="2026-10-28T00:00:00Z">
+      <w:ins w:id="46" w:author="Claude" w:date="2026-10-28T00:00:00Z">
         <w:r>
           <w:rPr>
             <w:b w:val="false"/>
@@ -719,7 +753,7 @@
         </w:rPr>
         <w:t xml:space="preserve"> such personal sensitive data or information can be shared with a third party by an order under the law</w:t>
       </w:r>
-      <w:ins w:id="45" w:author="Claude" w:date="2026-10-28T00:00:00Z">
+      <w:ins w:id="47" w:author="Claude" w:date="2026-10-28T00:00:00Z">
         <w:r>
           <w:rPr>
             <w:b w:val="false"/>
@@ -740,7 +774,7 @@
         <w:commentReference w:id="6"/>
       </w:r>
       <w:commentRangeStart w:id="7"/>
-      <w:ins w:id="46" w:author="Claude" w:date="2026-10-28T00:00:00Z">
+      <w:ins w:id="48" w:author="Claude" w:date="2026-10-28T00:00:00Z">
         <w:r>
           <w:rPr>
             <w:b w:val="false"/>
@@ -766,7 +800,7 @@
         </w:rPr>
         <w:t xml:space="preserve">The Telecommunications Act of 2023 was passed in both houses of parliament and has received presidential assent </w:t>
       </w:r>
-      <w:del w:id="47" w:author="Claude" w:date="2026-10-28T00:00:00Z">
+      <w:del w:id="49" w:author="Claude" w:date="2026-10-28T00:00:00Z">
         <w:r>
           <w:rPr>
             <w:b w:val="false"/>
@@ -775,7 +809,7 @@
           <w:delText xml:space="preserve">in</w:delText>
         </w:r>
       </w:del>
-      <w:ins w:id="48" w:author="Claude" w:date="2026-10-28T00:00:00Z">
+      <w:ins w:id="50" w:author="Claude" w:date="2026-10-28T00:00:00Z">
         <w:r>
           <w:rPr>
             <w:b w:val="false"/>
@@ -799,7 +833,7 @@
         </w:rPr>
         <w:t xml:space="preserve">While it has been </w:t>
       </w:r>
-      <w:del w:id="49" w:author="Claude" w:date="2026-10-28T00:00:00Z">
+      <w:del w:id="51" w:author="Claude" w:date="2026-10-28T00:00:00Z">
         <w:r>
           <w:rPr>
             <w:b w:val="false"/>
@@ -808,7 +842,7 @@
           <w:delText xml:space="preserve">notified by the government</w:delText>
         </w:r>
       </w:del>
-      <w:ins w:id="50" w:author="Claude" w:date="2026-10-28T00:00:00Z">
+      <w:ins w:id="52" w:author="Claude" w:date="2026-10-28T00:00:00Z">
         <w:r>
           <w:rPr>
             <w:b w:val="false"/>
@@ -824,7 +858,7 @@
         </w:rPr>
         <w:t xml:space="preserve">, it is yet to fully come into effect, and as of now, only </w:t>
       </w:r>
-      <w:del w:id="51" w:author="Claude" w:date="2026-10-28T00:00:00Z">
+      <w:del w:id="53" w:author="Claude" w:date="2026-10-28T00:00:00Z">
         <w:r>
           <w:rPr>
             <w:b w:val="false"/>
@@ -833,7 +867,7 @@
           <w:delText xml:space="preserve">a few</w:delText>
         </w:r>
       </w:del>
-      <w:ins w:id="52" w:author="Claude" w:date="2026-10-28T00:00:00Z">
+      <w:ins w:id="54" w:author="Claude" w:date="2026-10-28T00:00:00Z">
         <w:r>
           <w:rPr>
             <w:b w:val="false"/>
@@ -849,7 +883,7 @@
         </w:rPr>
         <w:t xml:space="preserve"> sections of the Telecommunications Act, specifically sections 1, 2, 10 to 30, 42 to 44, 46, 47, 50 to 58, 61 and 62</w:t>
       </w:r>
-      <w:ins w:id="53" w:author="Claude" w:date="2026-10-28T00:00:00Z">
+      <w:ins w:id="55" w:author="Claude" w:date="2026-10-28T00:00:00Z">
         <w:r>
           <w:rPr>
             <w:b w:val="false"/>
@@ -865,7 +899,7 @@
         </w:rPr>
         <w:t xml:space="preserve">, have come into effect. </w:t>
       </w:r>
-      <w:del w:id="54" w:author="Claude" w:date="2026-10-28T00:00:00Z">
+      <w:del w:id="56" w:author="Claude" w:date="2026-10-28T00:00:00Z">
         <w:r>
           <w:rPr>
             <w:b w:val="false"/>
@@ -874,7 +908,7 @@
           <w:delText xml:space="preserve">However, the Indian government intends on making the act fully effective in this year 2025.</w:delText>
         </w:r>
       </w:del>
-      <w:ins w:id="55" w:author="Claude" w:date="2026-10-28T00:00:00Z">
+      <w:ins w:id="57" w:author="Claude" w:date="2026-10-28T00:00:00Z">
         <w:r>
           <w:rPr>
             <w:b w:val="false"/>
@@ -902,7 +936,7 @@
         </w:rPr>
         <w:t xml:space="preserve">Once </w:t>
       </w:r>
-      <w:del w:id="56" w:author="Claude" w:date="2026-10-28T00:00:00Z">
+      <w:del w:id="58" w:author="Claude" w:date="2026-10-28T00:00:00Z">
         <w:r>
           <w:rPr>
             <w:b w:val="false"/>
@@ -911,7 +945,7 @@
           <w:delText xml:space="preserve">the Telecommunication Act fully comes into effect</w:delText>
         </w:r>
       </w:del>
-      <w:ins w:id="57" w:author="Claude" w:date="2026-10-28T00:00:00Z">
+      <w:ins w:id="59" w:author="Claude" w:date="2026-10-28T00:00:00Z">
         <w:r>
           <w:rPr>
             <w:b w:val="false"/>
@@ -927,7 +961,7 @@
         </w:rPr>
         <w:t xml:space="preserve">, it will </w:t>
       </w:r>
-      <w:del w:id="58" w:author="Claude" w:date="2026-10-28T00:00:00Z">
+      <w:del w:id="60" w:author="Claude" w:date="2026-10-28T00:00:00Z">
         <w:r>
           <w:rPr>
             <w:b w:val="false"/>
@@ -936,7 +970,7 @@
           <w:delText xml:space="preserve">replace</w:delText>
         </w:r>
       </w:del>
-      <w:ins w:id="59" w:author="Claude" w:date="2026-10-28T00:00:00Z">
+      <w:ins w:id="61" w:author="Claude" w:date="2026-10-28T00:00:00Z">
         <w:r>
           <w:rPr>
             <w:b w:val="false"/>
@@ -952,7 +986,7 @@
         </w:rPr>
         <w:t xml:space="preserve"> the Indian Telegraph Act 1885</w:t>
       </w:r>
-      <w:ins w:id="60" w:author="Claude" w:date="2026-10-28T00:00:00Z">
+      <w:ins w:id="62" w:author="Claude" w:date="2026-10-28T00:00:00Z">
         <w:r>
           <w:rPr>
             <w:b w:val="false"/>
@@ -961,7 +995,7 @@
           <w:t xml:space="preserve"> (</w:t>
         </w:r>
       </w:ins>
-      <w:del w:id="61" w:author="Claude" w:date="2026-10-28T00:00:00Z">
+      <w:del w:id="63" w:author="Claude" w:date="2026-10-28T00:00:00Z">
         <w:r>
           <w:rPr>
             <w:b w:val="false"/>
@@ -977,7 +1011,7 @@
         </w:rPr>
         <w:t xml:space="preserve">the Telegraph Act</w:t>
       </w:r>
-      <w:ins w:id="62" w:author="Claude" w:date="2026-10-28T00:00:00Z">
+      <w:ins w:id="64" w:author="Claude" w:date="2026-10-28T00:00:00Z">
         <w:r>
           <w:rPr>
             <w:b w:val="false"/>
@@ -993,7 +1027,7 @@
         </w:rPr>
         <w:t xml:space="preserve">, the Indian Wireless Telegraphy Act 1933, and the Telegraph Wires </w:t>
       </w:r>
-      <w:ins w:id="63" w:author="Claude" w:date="2026-10-28T00:00:00Z">
+      <w:ins w:id="65" w:author="Claude" w:date="2026-10-28T00:00:00Z">
         <w:r>
           <w:rPr>
             <w:b w:val="false"/>
@@ -1009,7 +1043,7 @@
         </w:rPr>
         <w:t xml:space="preserve">Unlawful Possession</w:t>
       </w:r>
-      <w:ins w:id="64" w:author="Claude" w:date="2026-10-28T00:00:00Z">
+      <w:ins w:id="66" w:author="Claude" w:date="2026-10-28T00:00:00Z">
         <w:r>
           <w:rPr>
             <w:b w:val="false"/>
@@ -1025,7 +1059,7 @@
         </w:rPr>
         <w:t xml:space="preserve"> Act 1950. However, Section 61 of the Telecommunication Act provides for all orders and rules</w:t>
       </w:r>
-      <w:del w:id="65" w:author="Claude" w:date="2026-10-28T00:00:00Z">
+      <w:del w:id="67" w:author="Claude" w:date="2026-10-28T00:00:00Z">
         <w:r>
           <w:rPr>
             <w:b w:val="false"/>
@@ -1041,7 +1075,7 @@
         </w:rPr>
         <w:t xml:space="preserve"> made under the Telegraph Act, the Indian Wireless Telegraphy Act 1933, and the Telegraph Wires </w:t>
       </w:r>
-      <w:ins w:id="66" w:author="Claude" w:date="2026-10-28T00:00:00Z">
+      <w:ins w:id="68" w:author="Claude" w:date="2026-10-28T00:00:00Z">
         <w:r>
           <w:rPr>
             <w:b w:val="false"/>
@@ -1057,7 +1091,7 @@
         </w:rPr>
         <w:t xml:space="preserve">Unlawful Possession</w:t>
       </w:r>
-      <w:ins w:id="67" w:author="Claude" w:date="2026-10-28T00:00:00Z">
+      <w:ins w:id="69" w:author="Claude" w:date="2026-10-28T00:00:00Z">
         <w:r>
           <w:rPr>
             <w:b w:val="false"/>
@@ -1073,7 +1107,7 @@
         </w:rPr>
         <w:t xml:space="preserve"> Act 1950 to </w:t>
       </w:r>
-      <w:del w:id="68" w:author="Claude" w:date="2026-10-28T00:00:00Z">
+      <w:del w:id="70" w:author="Claude" w:date="2026-10-28T00:00:00Z">
         <w:r>
           <w:rPr>
             <w:b w:val="false"/>
@@ -1082,7 +1116,7 @@
           <w:delText xml:space="preserve">be valid unless such orders and rules are inconsistent with the Telecommunications Act.</w:delText>
         </w:r>
       </w:del>
-      <w:ins w:id="69" w:author="Claude" w:date="2026-10-28T00:00:00Z">
+      <w:ins w:id="71" w:author="Claude" w:date="2026-10-28T00:00:00Z">
         <w:r>
           <w:rPr>
             <w:b w:val="false"/>
@@ -1109,7 +1143,7 @@
         </w:rPr>
         <w:t xml:space="preserve">Section 20(2)(a) of the Telecommunication Act also confers upon the central </w:t>
       </w:r>
-      <w:del w:id="70" w:author="Claude" w:date="2026-10-28T00:00:00Z">
+      <w:del w:id="72" w:author="Claude" w:date="2026-10-28T00:00:00Z">
         <w:r>
           <w:rPr>
             <w:b w:val="false"/>
@@ -1118,7 +1152,7 @@
           <w:delText xml:space="preserve">and state government, central or state government,</w:delText>
         </w:r>
       </w:del>
-      <w:ins w:id="71" w:author="Claude" w:date="2026-10-28T00:00:00Z">
+      <w:ins w:id="73" w:author="Claude" w:date="2026-10-28T00:00:00Z">
         <w:r>
           <w:rPr>
             <w:b w:val="false"/>
@@ -1134,7 +1168,7 @@
         </w:rPr>
         <w:t xml:space="preserve"> the </w:t>
       </w:r>
-      <w:del w:id="72" w:author="Claude" w:date="2026-10-28T00:00:00Z">
+      <w:del w:id="74" w:author="Claude" w:date="2026-10-28T00:00:00Z">
         <w:r>
           <w:rPr>
             <w:b w:val="false"/>
@@ -1143,7 +1177,7 @@
           <w:delText xml:space="preserve">right to conduct surveillance over</w:delText>
         </w:r>
       </w:del>
-      <w:ins w:id="73" w:author="Claude" w:date="2026-10-28T00:00:00Z">
+      <w:ins w:id="75" w:author="Claude" w:date="2026-10-28T00:00:00Z">
         <w:r>
           <w:rPr>
             <w:b w:val="false"/>
@@ -1159,7 +1193,7 @@
         </w:rPr>
         <w:t xml:space="preserve"> any messages</w:t>
       </w:r>
-      <w:ins w:id="74" w:author="Claude" w:date="2026-10-28T00:00:00Z">
+      <w:ins w:id="76" w:author="Claude" w:date="2026-10-28T00:00:00Z">
         <w:r>
           <w:rPr>
             <w:b w:val="false"/>
@@ -1175,7 +1209,7 @@
         </w:rPr>
         <w:t xml:space="preserve"> to or from any telecommunication equipment</w:t>
       </w:r>
-      <w:ins w:id="75" w:author="Claude" w:date="2026-10-28T00:00:00Z">
+      <w:ins w:id="77" w:author="Claude" w:date="2026-10-28T00:00:00Z">
         <w:r>
           <w:rPr>
             <w:b w:val="false"/>
@@ -1191,7 +1225,7 @@
         </w:rPr>
         <w:t xml:space="preserve"> or relating to any </w:t>
       </w:r>
-      <w:ins w:id="76" w:author="Claude" w:date="2026-10-28T00:00:00Z">
+      <w:ins w:id="78" w:author="Claude" w:date="2026-10-28T00:00:00Z">
         <w:r>
           <w:rPr>
             <w:b w:val="false"/>
@@ -1207,7 +1241,7 @@
         </w:rPr>
         <w:t xml:space="preserve">subject</w:t>
       </w:r>
-      <w:ins w:id="77" w:author="Claude" w:date="2026-10-28T00:00:00Z">
+      <w:ins w:id="79" w:author="Claude" w:date="2026-10-28T00:00:00Z">
         <w:r>
           <w:rPr>
             <w:b w:val="false"/>
@@ -1223,7 +1257,7 @@
         </w:rPr>
         <w:t xml:space="preserve"> brought for transmission by or transmitted or received by any telecommunication service or telecommunication network</w:t>
       </w:r>
-      <w:ins w:id="78" w:author="Claude" w:date="2026-10-28T00:00:00Z">
+      <w:ins w:id="80" w:author="Claude" w:date="2026-10-28T00:00:00Z">
         <w:r>
           <w:rPr>
             <w:b w:val="false"/>
@@ -1239,7 +1273,7 @@
         </w:rPr>
         <w:t xml:space="preserve"> </w:t>
       </w:r>
-      <w:del w:id="79" w:author="Claude" w:date="2026-10-28T00:00:00Z">
+      <w:del w:id="81" w:author="Claude" w:date="2026-10-28T00:00:00Z">
         <w:r>
           <w:rPr>
             <w:b w:val="false"/>
@@ -1248,7 +1282,7 @@
           <w:delText xml:space="preserve">in case of</w:delText>
         </w:r>
       </w:del>
-      <w:ins w:id="80" w:author="Claude" w:date="2026-10-28T00:00:00Z">
+      <w:ins w:id="82" w:author="Claude" w:date="2026-10-28T00:00:00Z">
         <w:r>
           <w:rPr>
             <w:b w:val="false"/>
@@ -1264,7 +1298,7 @@
         </w:rPr>
         <w:t xml:space="preserve"> a public emergency or in the interest of public safety, </w:t>
       </w:r>
-      <w:del w:id="81" w:author="Claude" w:date="2026-10-28T00:00:00Z">
+      <w:del w:id="83" w:author="Claude" w:date="2026-10-28T00:00:00Z">
         <w:r>
           <w:rPr>
             <w:b w:val="false"/>
@@ -1273,7 +1307,7 @@
           <w:delText xml:space="preserve">or if it is</w:delText>
         </w:r>
       </w:del>
-      <w:ins w:id="82" w:author="Claude" w:date="2026-10-28T00:00:00Z">
+      <w:ins w:id="84" w:author="Claude" w:date="2026-10-28T00:00:00Z">
         <w:r>
           <w:rPr>
             <w:b w:val="false"/>
@@ -1289,7 +1323,7 @@
         </w:rPr>
         <w:t xml:space="preserve"> in the interest of sovereignty and integrity </w:t>
       </w:r>
-      <w:del w:id="83" w:author="Claude" w:date="2026-10-28T00:00:00Z">
+      <w:del w:id="85" w:author="Claude" w:date="2026-10-28T00:00:00Z">
         <w:r>
           <w:rPr>
             <w:b w:val="false"/>
@@ -1298,7 +1332,7 @@
           <w:delText xml:space="preserve">in</w:delText>
         </w:r>
       </w:del>
-      <w:ins w:id="84" w:author="Claude" w:date="2026-10-28T00:00:00Z">
+      <w:ins w:id="86" w:author="Claude" w:date="2026-10-28T00:00:00Z">
         <w:r>
           <w:rPr>
             <w:b w:val="false"/>
@@ -1314,7 +1348,7 @@
         </w:rPr>
         <w:t xml:space="preserve"> India, the defense and security of the state, friendly relations with foreign states or public order, or for preventing incitement to the commission of an offense</w:t>
       </w:r>
-      <w:ins w:id="85" w:author="Claude" w:date="2026-10-28T00:00:00Z">
+      <w:ins w:id="87" w:author="Claude" w:date="2026-10-28T00:00:00Z">
         <w:r>
           <w:rPr>
             <w:b w:val="false"/>
@@ -1355,7 +1389,7 @@
         </w:rPr>
         <w:t xml:space="preserve">The definition of telecommunication</w:t>
       </w:r>
-      <w:ins w:id="86" w:author="Claude" w:date="2026-10-28T00:00:00Z">
+      <w:ins w:id="88" w:author="Claude" w:date="2026-10-28T00:00:00Z">
         <w:r>
           <w:rPr>
             <w:b w:val="false"/>
@@ -1371,7 +1405,7 @@
         </w:rPr>
         <w:t xml:space="preserve"> is wide, and it includes any equipment, appliance, instrument, device, radio station, radio equipment, material, apparatus or user equipment that may be or is being used for telecommunication, including software and intelligence integral to such telecommunication equipment.</w:t>
       </w:r>
-      <w:ins w:id="87" w:author="Claude" w:date="2026-10-28T00:00:00Z">
+      <w:ins w:id="89" w:author="Claude" w:date="2026-10-28T00:00:00Z">
         <w:r>
           <w:rPr>
             <w:b w:val="false"/>
@@ -1391,7 +1425,7 @@
         </w:rPr>
         <w:t xml:space="preserve"> And the term telecommunication service has been defined</w:t>
       </w:r>
-      <w:ins w:id="88" w:author="Claude" w:date="2026-10-28T00:00:00Z">
+      <w:ins w:id="90" w:author="Claude" w:date="2026-10-28T00:00:00Z">
         <w:r>
           <w:rPr>
             <w:b w:val="false"/>
@@ -1439,7 +1473,7 @@
         </w:rPr>
         <w:t xml:space="preserve">On 6 December 2024, the Department of Telecommunications, DOT, issued the Telecommunications </w:t>
       </w:r>
-      <w:ins w:id="89" w:author="Claude" w:date="2026-10-28T00:00:00Z">
+      <w:ins w:id="91" w:author="Claude" w:date="2026-10-28T00:00:00Z">
         <w:r>
           <w:rPr>
             <w:b w:val="false"/>
@@ -1455,7 +1489,7 @@
         </w:rPr>
         <w:t xml:space="preserve">Procedure</w:t>
       </w:r>
-      <w:ins w:id="90" w:author="Claude" w:date="2026-10-28T00:00:00Z">
+      <w:ins w:id="92" w:author="Claude" w:date="2026-10-28T00:00:00Z">
         <w:r>
           <w:rPr>
             <w:b w:val="false"/>
@@ -1471,7 +1505,7 @@
         </w:rPr>
         <w:t xml:space="preserve"> and Safeguards for Lawful Interception of Messages</w:t>
       </w:r>
-      <w:ins w:id="91" w:author="Claude" w:date="2026-10-28T00:00:00Z">
+      <w:ins w:id="93" w:author="Claude" w:date="2026-10-28T00:00:00Z">
         <w:r>
           <w:rPr>
             <w:b w:val="false"/>
@@ -1487,7 +1521,7 @@
         </w:rPr>
         <w:t xml:space="preserve"> Rules</w:t>
       </w:r>
-      <w:ins w:id="92" w:author="Claude" w:date="2026-10-28T00:00:00Z">
+      <w:ins w:id="94" w:author="Claude" w:date="2026-10-28T00:00:00Z">
         <w:r>
           <w:rPr>
             <w:b w:val="false"/>
@@ -1503,7 +1537,7 @@
         </w:rPr>
         <w:t xml:space="preserve"> 2024</w:t>
       </w:r>
-      <w:ins w:id="93" w:author="Claude" w:date="2026-10-28T00:00:00Z">
+      <w:ins w:id="95" w:author="Claude" w:date="2026-10-28T00:00:00Z">
         <w:r>
           <w:rPr>
             <w:b w:val="false"/>
@@ -1519,7 +1553,7 @@
         </w:rPr>
         <w:t xml:space="preserve">, the Telecommunications Interception Rules, under the Telecommunications Act. The Telecommunications Interception Rules lay down the procedural law in accordance with which such lawful interception under the Telecommunications Act must be carried out.</w:t>
       </w:r>
-      <w:ins w:id="94" w:author="Claude" w:date="2026-10-28T00:00:00Z">
+      <w:ins w:id="96" w:author="Claude" w:date="2026-10-28T00:00:00Z">
         <w:r>
           <w:rPr>
             <w:b w:val="false"/>
@@ -1538,6 +1572,69 @@
         <w:spacing w:after="120" w:before="0" w:line="276"/>
         <w:jc w:val="both"/>
       </w:pPr>
+      <w:commentRangeStart w:id="33"/>
+      <w:ins w:id="97" w:author="Claude" w:date="2026-10-28T00:00:00Z">
+        <w:r>
+          <w:rPr>
+            <w:b w:val="false"/>
+            <w:bCs w:val="false"/>
+          </w:rPr>
+          <w:t xml:space="preserve">The Telecommunications (Telecom Cyber Security) Rules, 2024 (G.S.R. 720(E), dated 21 November 2024), made under the Telecommunications Act, allow the Central Government or its authorised agency, for the purpose of telecom cyber security, to seek traffic data and any other data (other than the content of messages) from telecommunication entities, to direct them to set up infrastructure for collecting and providing such data, and to share the resulting analysis with central law enforcement and security agencies (rule 3).</w:t>
+        </w:r>
+      </w:ins>
+      <w:commentRangeEnd w:id="33"/>
+      <w:r>
+        <w:commentReference w:id="33"/>
+      </w:r>
+      <w:ins w:id="98" w:author="Claude" w:date="2026-10-28T00:00:00Z">
+        <w:r>
+          <w:rPr>
+            <w:b w:val="false"/>
+            <w:bCs w:val="false"/>
+          </w:rPr>
+          <w:t xml:space="preserve"> </w:t>
+        </w:r>
+      </w:ins>
+      <w:commentRangeStart w:id="34"/>
+      <w:ins w:id="99" w:author="Claude" w:date="2026-10-28T00:00:00Z">
+        <w:r>
+          <w:rPr>
+            <w:b w:val="false"/>
+            <w:bCs w:val="false"/>
+          </w:rPr>
+          <w:t xml:space="preserve">The Telecommunications (Telecom Cyber Security) Amendment Rules, 2025 (G.S.R. 771(E), dated 22 October 2025) extended these powers to "telecommunication identifier user entities", meaning persons other than telecom licensees that use mobile numbers or other telecommunication identifiers to identify their customers or users or to deliver services. The definition is broad enough to cover many businesses that identify customers by mobile number. The government may now seek data relating to the telecommunication identifiers used by such entities, direct them to suspend the use of particular identifiers, and validate identifiers through a government-run mobile number validation platform. Relying on these rules, the Department of Telecommunications issued directions on 28 November 2025 requiring app-based communication services that use Indian mobile numbers (including WhatsApp, Telegram and Signal) to keep the service continuously linked to the SIM card in the device and to log out web sessions periodically. The implementation deadline has reportedly been extended to 31 December 2026.</w:t>
+        </w:r>
+      </w:ins>
+      <w:commentRangeEnd w:id="34"/>
+      <w:r>
+        <w:commentReference w:id="34"/>
+      </w:r>
+    </w:p>
+    <w:p>
+      <w:pPr>
+        <w:spacing w:after="120" w:before="0" w:line="276"/>
+        <w:jc w:val="both"/>
+      </w:pPr>
+      <w:commentRangeStart w:id="35"/>
+      <w:ins w:id="100" w:author="Claude" w:date="2026-10-28T00:00:00Z">
+        <w:r>
+          <w:rPr>
+            <w:b w:val="false"/>
+            <w:bCs w:val="false"/>
+          </w:rPr>
+          <w:t xml:space="preserve">Since 24 June 2026, telecommunication service providers have operated under authorisations granted under section 3 of the Telecommunications Act and the Telecommunications (Authorisation for Provision of Principal Telecommunication Services) Rules, 2026 (G.S.R. 513(E), dated 23 June 2026), which replace licences issued under the Telegraph Act. Authorised entities must deploy technical measures to give effect to interception orders under section 20(2) of the Telecommunications Act (rule 33(1)); establish, at their own cost, lawful interception and monitoring facilities (rule 33(3)); retain call detail records, internet protocol detail records and other subscriber records for two years, or longer if directed (rule 45(2)); and provide records of messages and other data to the government on receiving a lawful direction (proviso to rule 47(2)). The government may evaluate any equipment used for encryption that is connected to an authorised entity's network and require its removal (rule 37(1)), and user information may not, subject to limited exceptions, be transferred outside India (rule 44).</w:t>
+        </w:r>
+      </w:ins>
+      <w:commentRangeEnd w:id="35"/>
+      <w:r>
+        <w:commentReference w:id="35"/>
+      </w:r>
+    </w:p>
+    <w:p>
+      <w:pPr>
+        <w:spacing w:after="120" w:before="0" w:line="276"/>
+        <w:jc w:val="both"/>
+      </w:pPr>
       <w:commentRangeStart w:id="14"/>
       <w:r>
         <w:rPr>
@@ -1546,7 +1643,7 @@
         </w:rPr>
         <w:t xml:space="preserve">In early August 2023, the Indian Parliament passed the Digital Personal Data Protection Act</w:t>
       </w:r>
-      <w:ins w:id="95" w:author="Claude" w:date="2026-10-28T00:00:00Z">
+      <w:ins w:id="101" w:author="Claude" w:date="2026-10-28T00:00:00Z">
         <w:r>
           <w:rPr>
             <w:b w:val="false"/>
@@ -1555,7 +1652,7 @@
           <w:t xml:space="preserve">, 2023</w:t>
         </w:r>
       </w:ins>
-      <w:ins w:id="96" w:author="Claude" w:date="2026-10-28T00:00:00Z">
+      <w:ins w:id="102" w:author="Claude" w:date="2026-10-28T00:00:00Z">
         <w:r>
           <w:rPr>
             <w:b w:val="false"/>
@@ -1564,7 +1661,7 @@
           <w:t xml:space="preserve"> (</w:t>
         </w:r>
       </w:ins>
-      <w:del w:id="97" w:author="Claude" w:date="2026-10-28T00:00:00Z">
+      <w:del w:id="103" w:author="Claude" w:date="2026-10-28T00:00:00Z">
         <w:r>
           <w:rPr>
             <w:b w:val="false"/>
@@ -1580,7 +1677,7 @@
         </w:rPr>
         <w:t xml:space="preserve">the DPDP</w:t>
       </w:r>
-      <w:ins w:id="98" w:author="Claude" w:date="2026-10-28T00:00:00Z">
+      <w:ins w:id="104" w:author="Claude" w:date="2026-10-28T00:00:00Z">
         <w:r>
           <w:rPr>
             <w:b w:val="false"/>
@@ -1596,7 +1693,7 @@
         </w:rPr>
         <w:t xml:space="preserve">, and it </w:t>
       </w:r>
-      <w:del w:id="99" w:author="Claude" w:date="2026-10-28T00:00:00Z">
+      <w:del w:id="105" w:author="Claude" w:date="2026-10-28T00:00:00Z">
         <w:r>
           <w:rPr>
             <w:b w:val="false"/>
@@ -1605,7 +1702,7 @@
           <w:delText xml:space="preserve">was ratified by</w:delText>
         </w:r>
       </w:del>
-      <w:ins w:id="100" w:author="Claude" w:date="2026-10-28T00:00:00Z">
+      <w:ins w:id="106" w:author="Claude" w:date="2026-10-28T00:00:00Z">
         <w:r>
           <w:rPr>
             <w:b w:val="false"/>
@@ -1621,7 +1718,7 @@
         </w:rPr>
         <w:t xml:space="preserve"> the President of India</w:t>
       </w:r>
-      <w:ins w:id="101" w:author="Claude" w:date="2026-10-28T00:00:00Z">
+      <w:ins w:id="107" w:author="Claude" w:date="2026-10-28T00:00:00Z">
         <w:r>
           <w:rPr>
             <w:b w:val="false"/>
@@ -1637,7 +1734,7 @@
         </w:rPr>
         <w:t xml:space="preserve">. </w:t>
       </w:r>
-      <w:del w:id="102" w:author="Claude" w:date="2026-10-28T00:00:00Z">
+      <w:del w:id="108" w:author="Claude" w:date="2026-10-28T00:00:00Z">
         <w:r>
           <w:rPr>
             <w:b w:val="false"/>
@@ -1646,7 +1743,7 @@
           <w:delText xml:space="preserve">DPDP, once notified by the government, will replace the SPDI rules. However, the full implementation and enforcement of the DPDP is contingent upon the finalization and official notifications of the accompanying rules, which are currently still in draft form. The draft rules were released for public consultation in January 2025, and the consultation period for the rules concluded on March 5, 2025. The Ministry of Electronics and Information Technology is presently in the process of reviewing the feedback received from various stakeholders. Earlier this year, certain media outlets reported that the draft rules may be finalized in April or May 2025 and that a two-year implementation period from the date finalization and notification of the rules will be provided to organizations to be compliant with the new data protection regime. However, there is currently no clarity on when the rules will be finalized or laid before Parliament.</w:delText>
         </w:r>
       </w:del>
-      <w:ins w:id="103" w:author="Claude" w:date="2026-10-28T00:00:00Z">
+      <w:ins w:id="109" w:author="Claude" w:date="2026-10-28T00:00:00Z">
         <w:r>
           <w:rPr>
             <w:b w:val="false"/>
@@ -1673,7 +1770,7 @@
         </w:rPr>
         <w:t xml:space="preserve">The DPDP </w:t>
       </w:r>
-      <w:del w:id="104" w:author="Claude" w:date="2026-10-28T00:00:00Z">
+      <w:del w:id="110" w:author="Claude" w:date="2026-10-28T00:00:00Z">
         <w:r>
           <w:rPr>
             <w:b w:val="false"/>
@@ -1682,7 +1779,7 @@
           <w:delText xml:space="preserve">does not apply to</w:delText>
         </w:r>
       </w:del>
-      <w:ins w:id="105" w:author="Claude" w:date="2026-10-28T00:00:00Z">
+      <w:ins w:id="111" w:author="Claude" w:date="2026-10-28T00:00:00Z">
         <w:r>
           <w:rPr>
             <w:b w:val="false"/>
@@ -1698,7 +1795,7 @@
         </w:rPr>
         <w:t xml:space="preserve"> foreign personal data processed in India</w:t>
       </w:r>
-      <w:ins w:id="106" w:author="Claude" w:date="2026-10-28T00:00:00Z">
+      <w:ins w:id="112" w:author="Claude" w:date="2026-10-28T00:00:00Z">
         <w:r>
           <w:rPr>
             <w:b w:val="false"/>
@@ -1714,7 +1811,7 @@
         </w:rPr>
         <w:t xml:space="preserve">, and there are no</w:t>
       </w:r>
-      <w:ins w:id="107" w:author="Claude" w:date="2026-10-28T00:00:00Z">
+      <w:ins w:id="113" w:author="Claude" w:date="2026-10-28T00:00:00Z">
         <w:r>
           <w:rPr>
             <w:b w:val="false"/>
@@ -1730,7 +1827,7 @@
         </w:rPr>
         <w:t xml:space="preserve"> </w:t>
       </w:r>
-      <w:del w:id="108" w:author="Claude" w:date="2026-10-28T00:00:00Z">
+      <w:del w:id="114" w:author="Claude" w:date="2026-10-28T00:00:00Z">
         <w:r>
           <w:rPr>
             <w:b w:val="false"/>
@@ -1739,7 +1836,7 @@
           <w:delText xml:space="preserve">efforts</w:delText>
         </w:r>
       </w:del>
-      <w:ins w:id="109" w:author="Claude" w:date="2026-10-28T00:00:00Z">
+      <w:ins w:id="115" w:author="Claude" w:date="2026-10-28T00:00:00Z">
         <w:r>
           <w:rPr>
             <w:b w:val="false"/>
@@ -1755,7 +1852,7 @@
         </w:rPr>
         <w:t xml:space="preserve"> to obtain </w:t>
       </w:r>
-      <w:del w:id="110" w:author="Claude" w:date="2026-10-28T00:00:00Z">
+      <w:del w:id="116" w:author="Claude" w:date="2026-10-28T00:00:00Z">
         <w:r>
           <w:rPr>
             <w:b w:val="false"/>
@@ -1764,7 +1861,7 @@
           <w:delText xml:space="preserve">an adequacy ruling from the EU</w:delText>
         </w:r>
       </w:del>
-      <w:ins w:id="111" w:author="Claude" w:date="2026-10-28T00:00:00Z">
+      <w:ins w:id="117" w:author="Claude" w:date="2026-10-28T00:00:00Z">
         <w:r>
           <w:rPr>
             <w:b w:val="false"/>
@@ -1799,7 +1896,7 @@
         </w:rPr>
         <w:t xml:space="preserve">Because India lacks independent oversight over government surveillance, Indian law does not fully comply with the GDPR</w:t>
       </w:r>
-      <w:ins w:id="112" w:author="Claude" w:date="2026-10-28T00:00:00Z">
+      <w:ins w:id="118" w:author="Claude" w:date="2026-10-28T00:00:00Z">
         <w:r>
           <w:rPr>
             <w:b w:val="false"/>
@@ -1808,7 +1905,7 @@
           <w:t xml:space="preserve">, given the</w:t>
         </w:r>
       </w:ins>
-      <w:del w:id="113" w:author="Claude" w:date="2026-10-28T00:00:00Z">
+      <w:del w:id="119" w:author="Claude" w:date="2026-10-28T00:00:00Z">
         <w:r>
           <w:rPr>
             <w:b w:val="false"/>
@@ -1824,7 +1921,7 @@
         </w:rPr>
         <w:t xml:space="preserve"> extraordinary powers and exemptions granted to the government under the DPDP.</w:t>
       </w:r>
-      <w:ins w:id="114" w:author="Claude" w:date="2026-10-28T00:00:00Z">
+      <w:ins w:id="120" w:author="Claude" w:date="2026-10-28T00:00:00Z">
         <w:r>
           <w:rPr>
             <w:b w:val="false"/>
@@ -1845,7 +1942,7 @@
         <w:t xml:space="preserve"> Nevertheless, given that almost all of Indian industry will be covered by the DPDP, even with fewer obligations than the GDPR and similar laws, it is a positive factor for businesses subject to the law. Critics such as the Internet Freedom Foundation, a digital rights group, continue to believe that the DPDP does not contain any meaningful safeguards against overbroad surveillance, while the Editors Guild of India has said it affects press freedom and dilutes the right to information law</w:t>
       </w:r>
       <w:commentRangeStart w:id="17"/>
-      <w:ins w:id="115" w:author="Claude" w:date="2026-10-28T00:00:00Z">
+      <w:ins w:id="121" w:author="Claude" w:date="2026-10-28T00:00:00Z">
         <w:r>
           <w:rPr>
             <w:b w:val="false"/>
@@ -1871,6 +1968,26 @@
         <w:spacing w:after="120" w:before="0" w:line="276"/>
         <w:jc w:val="both"/>
       </w:pPr>
+      <w:commentRangeStart w:id="36"/>
+      <w:ins w:id="122" w:author="Claude" w:date="2026-10-28T00:00:00Z">
+        <w:r>
+          <w:rPr>
+            <w:b w:val="false"/>
+            <w:bCs w:val="false"/>
+          </w:rPr>
+          <w:t xml:space="preserve">The DPDP is under constitutional challenge before the Supreme Court. On 16 February 2026, the Court issued notice in Venkatesh Nayak v. Union of India (W.P.(C) No. 177 of 2026) and connected petitions (W.P.(C) Nos. 211 and 212 of 2026). Among other provisions, these petitions challenge sections 17(1)(c), 17(2), 33(1), 36 and 44(3) of the DPDP and rule 23(2) of the DPDP Rules, on grounds including the absence of safeguards against State access to personal data. According to press reports, the Court also referred the matter to a larger bench and declined to stay the DPDP. On 27 October 2026, the Court issued notice, returnable on 17 November 2026, on a further petition by the Digital News Publishers Association, which also challenges section 36 and rule 23. No notification exempting any State instrumentality under section 17(2)(a) has been located.</w:t>
+        </w:r>
+      </w:ins>
+      <w:commentRangeEnd w:id="36"/>
+      <w:r>
+        <w:commentReference w:id="36"/>
+      </w:r>
+    </w:p>
+    <w:p>
+      <w:pPr>
+        <w:spacing w:after="120" w:before="0" w:line="276"/>
+        <w:jc w:val="both"/>
+      </w:pPr>
       <w:commentRangeStart w:id="18"/>
       <w:r>
         <w:rPr>
@@ -1879,7 +1996,7 @@
         </w:rPr>
         <w:t xml:space="preserve">The Bharatiya Nagarik Suraksha Sanhita 2023, the BNSS, is a new procedural law that </w:t>
       </w:r>
-      <w:del w:id="116" w:author="Claude" w:date="2026-10-28T00:00:00Z">
+      <w:del w:id="123" w:author="Claude" w:date="2026-10-28T00:00:00Z">
         <w:r>
           <w:rPr>
             <w:b w:val="false"/>
@@ -1888,7 +2005,7 @@
           <w:delText xml:space="preserve">will govern</w:delText>
         </w:r>
       </w:del>
-      <w:ins w:id="117" w:author="Claude" w:date="2026-10-28T00:00:00Z">
+      <w:ins w:id="124" w:author="Claude" w:date="2026-10-28T00:00:00Z">
         <w:r>
           <w:rPr>
             <w:b w:val="false"/>
@@ -1904,7 +2021,7 @@
         </w:rPr>
         <w:t xml:space="preserve"> criminal investigations and prosecutions in India</w:t>
       </w:r>
-      <w:ins w:id="118" w:author="Claude" w:date="2026-10-28T00:00:00Z">
+      <w:ins w:id="125" w:author="Claude" w:date="2026-10-28T00:00:00Z">
         <w:r>
           <w:rPr>
             <w:b w:val="false"/>
@@ -1920,7 +2037,7 @@
         </w:rPr>
         <w:t xml:space="preserve"> and </w:t>
       </w:r>
-      <w:del w:id="119" w:author="Claude" w:date="2026-10-28T00:00:00Z">
+      <w:del w:id="126" w:author="Claude" w:date="2026-10-28T00:00:00Z">
         <w:r>
           <w:rPr>
             <w:b w:val="false"/>
@@ -1929,7 +2046,7 @@
           <w:delText xml:space="preserve">replaces</w:delText>
         </w:r>
       </w:del>
-      <w:ins w:id="120" w:author="Claude" w:date="2026-10-28T00:00:00Z">
+      <w:ins w:id="127" w:author="Claude" w:date="2026-10-28T00:00:00Z">
         <w:r>
           <w:rPr>
             <w:b w:val="false"/>
@@ -1945,7 +2062,7 @@
         </w:rPr>
         <w:t xml:space="preserve"> the Code of Criminal Procedure 1973, CRPC. While the CRPC did not specifically govern access to data, it provided courts, police, and law enforcement agencies wide powers to seek data and information through procedures such as search, seizure, and production of documents. The BNSS retains similar powers</w:t>
       </w:r>
-      <w:ins w:id="121" w:author="Claude" w:date="2026-10-28T00:00:00Z">
+      <w:ins w:id="128" w:author="Claude" w:date="2026-10-28T00:00:00Z">
         <w:r>
           <w:rPr>
             <w:b w:val="false"/>
@@ -1978,7 +2095,7 @@
         </w:rPr>
         <w:t xml:space="preserve">Separately, the Indian government has instituted certain surveillance frameworks such as the Central Monitoring System, CMS, the National Intelligence Grid, NATGRID, and the Network Traffic Analysis, NETRA, which are presently not regulated or authorized by any legislation. The Indian government has, however, stated that the procedure for surveillance through CMS, NATGRID, and NETRA is undertaken in accordance with the interception rules</w:t>
       </w:r>
-      <w:ins w:id="122" w:author="Claude" w:date="2026-10-28T00:00:00Z">
+      <w:ins w:id="129" w:author="Claude" w:date="2026-10-28T00:00:00Z">
         <w:r>
           <w:rPr>
             <w:b w:val="false"/>
@@ -2002,7 +2119,7 @@
         </w:rPr>
         <w:t xml:space="preserve">This case is currently pending before the courts in India</w:t>
       </w:r>
-      <w:ins w:id="123" w:author="Claude" w:date="2026-10-28T00:00:00Z">
+      <w:ins w:id="130" w:author="Claude" w:date="2026-10-28T00:00:00Z">
         <w:r>
           <w:rPr>
             <w:b w:val="false"/>
@@ -2018,7 +2135,7 @@
         </w:rPr>
         <w:t xml:space="preserve">. </w:t>
       </w:r>
-      <w:del w:id="124" w:author="Claude" w:date="2026-10-28T00:00:00Z">
+      <w:del w:id="131" w:author="Claude" w:date="2026-10-28T00:00:00Z">
         <w:r>
           <w:rPr>
             <w:b w:val="false"/>
@@ -2027,7 +2144,7 @@
           <w:delText xml:space="preserve">As per the cases of Center</w:delText>
         </w:r>
       </w:del>
-      <w:ins w:id="125" w:author="Claude" w:date="2026-10-28T00:00:00Z">
+      <w:ins w:id="132" w:author="Claude" w:date="2026-10-28T00:00:00Z">
         <w:r>
           <w:rPr>
             <w:b w:val="false"/>
@@ -2043,7 +2160,7 @@
         </w:rPr>
         <w:t xml:space="preserve"> for Public Interest Litigation and </w:t>
       </w:r>
-      <w:del w:id="126" w:author="Claude" w:date="2026-10-28T00:00:00Z">
+      <w:del w:id="133" w:author="Claude" w:date="2026-10-28T00:00:00Z">
         <w:r>
           <w:rPr>
             <w:b w:val="false"/>
@@ -2052,7 +2169,7 @@
           <w:delText xml:space="preserve">another versus</w:delText>
         </w:r>
       </w:del>
-      <w:ins w:id="127" w:author="Claude" w:date="2026-10-28T00:00:00Z">
+      <w:ins w:id="134" w:author="Claude" w:date="2026-10-28T00:00:00Z">
         <w:r>
           <w:rPr>
             <w:b w:val="false"/>
@@ -2068,7 +2185,7 @@
         </w:rPr>
         <w:t xml:space="preserve"> Union of India and </w:t>
       </w:r>
-      <w:del w:id="128" w:author="Claude" w:date="2026-10-28T00:00:00Z">
+      <w:del w:id="135" w:author="Claude" w:date="2026-10-28T00:00:00Z">
         <w:r>
           <w:rPr>
             <w:b w:val="false"/>
@@ -2077,7 +2194,7 @@
           <w:delText xml:space="preserve">others, writ petition civil 8998/2020, comma, Center</w:delText>
         </w:r>
       </w:del>
-      <w:ins w:id="129" w:author="Claude" w:date="2026-10-28T00:00:00Z">
+      <w:ins w:id="136" w:author="Claude" w:date="2026-10-28T00:00:00Z">
         <w:r>
           <w:rPr>
             <w:b w:val="false"/>
@@ -2093,7 +2210,7 @@
         </w:rPr>
         <w:t xml:space="preserve"> for Public Interest Litigation and </w:t>
       </w:r>
-      <w:del w:id="130" w:author="Claude" w:date="2026-10-28T00:00:00Z">
+      <w:del w:id="137" w:author="Claude" w:date="2026-10-28T00:00:00Z">
         <w:r>
           <w:rPr>
             <w:b w:val="false"/>
@@ -2102,7 +2219,7 @@
           <w:delText xml:space="preserve">another versus</w:delText>
         </w:r>
       </w:del>
-      <w:ins w:id="131" w:author="Claude" w:date="2026-10-28T00:00:00Z">
+      <w:ins w:id="138" w:author="Claude" w:date="2026-10-28T00:00:00Z">
         <w:r>
           <w:rPr>
             <w:b w:val="false"/>
@@ -2118,7 +2235,7 @@
         </w:rPr>
         <w:t xml:space="preserve"> Union of India and </w:t>
       </w:r>
-      <w:del w:id="132" w:author="Claude" w:date="2026-10-28T00:00:00Z">
+      <w:del w:id="139" w:author="Claude" w:date="2026-10-28T00:00:00Z">
         <w:r>
           <w:rPr>
             <w:b w:val="false"/>
@@ -2127,7 +2244,7 @@
           <w:delText xml:space="preserve">others, transfer petition (TP) civil number 002567 of 2023</w:delText>
         </w:r>
       </w:del>
-      <w:ins w:id="133" w:author="Claude" w:date="2026-10-28T00:00:00Z">
+      <w:ins w:id="140" w:author="Claude" w:date="2026-10-28T00:00:00Z">
         <w:r>
           <w:rPr>
             <w:b w:val="false"/>
@@ -2161,7 +2278,7 @@
         </w:rPr>
         <w:t xml:space="preserve">Additionally,</w:t>
       </w:r>
-      <w:ins w:id="134" w:author="Claude" w:date="2026-10-28T00:00:00Z">
+      <w:ins w:id="141" w:author="Claude" w:date="2026-10-28T00:00:00Z">
         <w:r>
           <w:rPr>
             <w:b w:val="false"/>
@@ -2177,7 +2294,7 @@
         </w:rPr>
         <w:t xml:space="preserve"> Intelligence Bureau, Narcotics Control Bureau, Directorate of Enforcement, Central Board of Direct Taxes, Directorate of Revenue Intelligence, Central Bureau of Investigation, National Investigation Agency, </w:t>
       </w:r>
-      <w:ins w:id="135" w:author="Claude" w:date="2026-10-28T00:00:00Z">
+      <w:ins w:id="142" w:author="Claude" w:date="2026-10-28T00:00:00Z">
         <w:r>
           <w:rPr>
             <w:b w:val="false"/>
@@ -2193,7 +2310,7 @@
         </w:rPr>
         <w:t xml:space="preserve">Research and Analysis Wing</w:t>
       </w:r>
-      <w:ins w:id="136" w:author="Claude" w:date="2026-10-28T00:00:00Z">
+      <w:ins w:id="143" w:author="Claude" w:date="2026-10-28T00:00:00Z">
         <w:r>
           <w:rPr>
             <w:b w:val="false"/>
@@ -2209,7 +2326,7 @@
         </w:rPr>
         <w:t xml:space="preserve">, Directorate of Signal Intelligence </w:t>
       </w:r>
-      <w:del w:id="137" w:author="Claude" w:date="2026-10-28T00:00:00Z">
+      <w:del w:id="144" w:author="Claude" w:date="2026-10-28T00:00:00Z">
         <w:r>
           <w:rPr>
             <w:b w:val="false"/>
@@ -2218,7 +2335,7 @@
           <w:delText xml:space="preserve">and Ministry of Defense, and such other</w:delText>
         </w:r>
       </w:del>
-      <w:ins w:id="138" w:author="Claude" w:date="2026-10-28T00:00:00Z">
+      <w:ins w:id="145" w:author="Claude" w:date="2026-10-28T00:00:00Z">
         <w:r>
           <w:rPr>
             <w:b w:val="false"/>
@@ -2234,7 +2351,7 @@
         </w:rPr>
         <w:t xml:space="preserve"> intelligence</w:t>
       </w:r>
-      <w:ins w:id="139" w:author="Claude" w:date="2026-10-28T00:00:00Z">
+      <w:ins w:id="146" w:author="Claude" w:date="2026-10-28T00:00:00Z">
         <w:r>
           <w:rPr>
             <w:b w:val="false"/>
@@ -2250,7 +2367,7 @@
         </w:rPr>
         <w:t xml:space="preserve"> agencies </w:t>
       </w:r>
-      <w:del w:id="140" w:author="Claude" w:date="2026-10-28T00:00:00Z">
+      <w:del w:id="147" w:author="Claude" w:date="2026-10-28T00:00:00Z">
         <w:r>
           <w:rPr>
             <w:b w:val="false"/>
@@ -2259,7 +2376,7 @@
           <w:delText xml:space="preserve">have also been</w:delText>
         </w:r>
       </w:del>
-      <w:ins w:id="141" w:author="Claude" w:date="2026-10-28T00:00:00Z">
+      <w:ins w:id="148" w:author="Claude" w:date="2026-10-28T00:00:00Z">
         <w:r>
           <w:rPr>
             <w:b w:val="false"/>
@@ -2275,7 +2392,7 @@
         </w:rPr>
         <w:t xml:space="preserve"> granted certain surveillance powers under the</w:t>
       </w:r>
-      <w:ins w:id="142" w:author="Claude" w:date="2026-10-28T00:00:00Z">
+      <w:ins w:id="149" w:author="Claude" w:date="2026-10-28T00:00:00Z">
         <w:r>
           <w:rPr>
             <w:b w:val="false"/>
@@ -2291,7 +2408,7 @@
         </w:rPr>
         <w:t xml:space="preserve"> legislations</w:t>
       </w:r>
-      <w:del w:id="143" w:author="Claude" w:date="2026-10-28T00:00:00Z">
+      <w:del w:id="150" w:author="Claude" w:date="2026-10-28T00:00:00Z">
         <w:r>
           <w:rPr>
             <w:b w:val="false"/>
@@ -2325,7 +2442,7 @@
         </w:rPr>
         <w:t xml:space="preserve">It is also pertinent to note that Indian Computer Emergency Response Team, CERT-IN, by way of notification dated 28th April 2022, issued directions under subsection 6 of section 70B of the Information Technology Act 2000 relating to information security practices, procedure, prevention, response, and reporting of cyber incidents for safe and trusted internet, also known as the directions. The directions require virtual private server providers</w:t>
       </w:r>
-      <w:del w:id="144" w:author="Claude" w:date="2026-10-28T00:00:00Z">
+      <w:del w:id="151" w:author="Claude" w:date="2026-10-28T00:00:00Z">
         <w:r>
           <w:rPr>
             <w:b w:val="false"/>
@@ -2341,7 +2458,7 @@
         </w:rPr>
         <w:t xml:space="preserve"> and VPN service providers, data centers, and cloud service providers to collect certain information in relation to customer accounts and store it for at least 5 years after </w:t>
       </w:r>
-      <w:del w:id="145" w:author="Claude" w:date="2026-10-28T00:00:00Z">
+      <w:del w:id="152" w:author="Claude" w:date="2026-10-28T00:00:00Z">
         <w:r>
           <w:rPr>
             <w:b w:val="false"/>
@@ -2350,7 +2467,7 @@
           <w:delText xml:space="preserve">such accounts are closed</w:delText>
         </w:r>
       </w:del>
-      <w:ins w:id="146" w:author="Claude" w:date="2026-10-28T00:00:00Z">
+      <w:ins w:id="153" w:author="Claude" w:date="2026-10-28T00:00:00Z">
         <w:r>
           <w:rPr>
             <w:b w:val="false"/>
@@ -2366,7 +2483,7 @@
         </w:rPr>
         <w:t xml:space="preserve">. This includes validated names, addresses, and contact numbers of customers and their ownership patterns, along with usage details such as IP addresses allotted, email addresses, and timestamps used at the time of registration, purpose of hiring the service, and period of hiring. Additionally, under these directions, CERT-IN may also seek information from various service providers in case of cybersecurity incidents and cyber incidents on case-to-case basis for discharge of its statutory obligations to enhance cybersecurity in the country. This may result in CERT-IN receiving access to such data of the EU firm that is in the data importer's possession.</w:t>
       </w:r>
-      <w:ins w:id="147" w:author="Claude" w:date="2026-10-28T00:00:00Z">
+      <w:ins w:id="154" w:author="Claude" w:date="2026-10-28T00:00:00Z">
         <w:r>
           <w:rPr>
             <w:b w:val="false"/>
@@ -2378,6 +2495,26 @@
       <w:commentRangeEnd w:id="21"/>
       <w:r>
         <w:commentReference w:id="21"/>
+      </w:r>
+    </w:p>
+    <w:p>
+      <w:pPr>
+        <w:spacing w:after="120" w:before="0" w:line="276"/>
+        <w:jc w:val="both"/>
+      </w:pPr>
+      <w:commentRangeStart w:id="37"/>
+      <w:ins w:id="155" w:author="Claude" w:date="2026-10-28T00:00:00Z">
+        <w:r>
+          <w:rPr>
+            <w:b w:val="false"/>
+            <w:bCs w:val="false"/>
+          </w:rPr>
+          <w:t xml:space="preserve">Because the data importer acts as the firm's immigration counsel, it should also be noted that the Immigration and Foreigners Act, 2025 (Act No. 13 of 2025) came into force on 1 September 2025, repealing the Passport (Entry into India) Act, 1920, the Registration of Foreigners Act, 1939, the Foreigners Act, 1946 and the Immigration (Carriers' Liability) Act, 2000. The Act and the Immigration and Foreigners Rules, 2025 (G.S.R. 596(E), dated 1 September 2025, as amended by G.S.R. 424(E), dated 1 June 2026) require accommodation providers, universities and other educational institutions, and hospitals to report information about foreigners to the Registration Officer (sections 8 to 10), and require carriers to share passenger manifests, advance passenger information and passenger name record data with the immigration authorities (section 17). Personal data of EU employees relocating to India will therefore reach the Indian immigration authorities independently of the data importer. These reporting duties fall on foreigners, hosts, institutions and carriers, not on legal advisers.</w:t>
+        </w:r>
+      </w:ins>
+      <w:commentRangeEnd w:id="37"/>
+      <w:r>
+        <w:commentReference w:id="37"/>
       </w:r>
     </w:p>
     <w:p>
@@ -2385,7 +2522,7 @@
         <w:spacing w:after="120" w:before="240" w:line="276"/>
         <w:jc w:val="left"/>
       </w:pPr>
-      <w:del w:id="148" w:author="Claude" w:date="2026-10-28T00:00:00Z">
+      <w:del w:id="156" w:author="Claude" w:date="2026-10-28T00:00:00Z">
         <w:r>
           <w:rPr>
             <w:b/>
@@ -2394,7 +2531,7 @@
           <w:delText xml:space="preserve">Now, factors</w:delText>
         </w:r>
       </w:del>
-      <w:ins w:id="149" w:author="Claude" w:date="2026-10-28T00:00:00Z">
+      <w:ins w:id="157" w:author="Claude" w:date="2026-10-28T00:00:00Z">
         <w:r>
           <w:rPr>
             <w:b/>
@@ -2436,6 +2573,20 @@
         </w:rPr>
         <w:t xml:space="preserve">The above mentioned legislations give the government, including any of its agencies, the right to access personal data without consent for national security interests, for maintaining sovereignty and integrity of India, or for maintaining friendly relations with foreign states, or for maintaining public order, or for preventing incitement to the commission of an offense. The following factors weigh against a potential surveillance of EEA and UK data, and that any such surveillance would violate the GDPR or UK law.</w:t>
       </w:r>
+      <w:commentRangeStart w:id="45"/>
+      <w:ins w:id="158" w:author="Claude" w:date="2026-10-28T00:00:00Z">
+        <w:r>
+          <w:rPr>
+            <w:b w:val="false"/>
+            <w:bCs w:val="false"/>
+          </w:rPr>
+          <w:t xml:space="preserve"> For UK personal data, since 5 February 2026 transfers have been governed by Chapter V of the UK GDPR as amended by the Data (Use and Access) Act 2025, under which the question is whether the standard of protection after transfer is "not materially lower" than that under UK data protection law.</w:t>
+        </w:r>
+      </w:ins>
+      <w:commentRangeEnd w:id="45"/>
+      <w:r>
+        <w:commentReference w:id="45"/>
+      </w:r>
     </w:p>
     <w:p>
       <w:pPr>
@@ -2463,7 +2614,7 @@
         </w:rPr>
         <w:t xml:space="preserve">The Indian courts have stepped in several times against unlimited surveillance</w:t>
       </w:r>
-      <w:ins w:id="150" w:author="Claude" w:date="2026-10-28T00:00:00Z">
+      <w:ins w:id="159" w:author="Claude" w:date="2026-10-28T00:00:00Z">
         <w:r>
           <w:rPr>
             <w:b w:val="false"/>
@@ -2472,7 +2623,7 @@
           <w:t xml:space="preserve">, relying on the right to privacy under Article 21 and the freedom of speech and expression under Article 19(1)(a) (and the permitted restrictions under Article 19(2))</w:t>
         </w:r>
       </w:ins>
-      <w:del w:id="151" w:author="Claude" w:date="2026-10-28T00:00:00Z">
+      <w:del w:id="160" w:author="Claude" w:date="2026-10-28T00:00:00Z">
         <w:r>
           <w:rPr>
             <w:b w:val="false"/>
@@ -2488,7 +2639,7 @@
         </w:rPr>
         <w:t xml:space="preserve"> of the Indian Constitution</w:t>
       </w:r>
-      <w:del w:id="152" w:author="Claude" w:date="2026-10-28T00:00:00Z">
+      <w:del w:id="161" w:author="Claude" w:date="2026-10-28T00:00:00Z">
         <w:r>
           <w:rPr>
             <w:b w:val="false"/>
@@ -2497,7 +2648,7 @@
           <w:delText xml:space="preserve">, in</w:delText>
         </w:r>
       </w:del>
-      <w:ins w:id="153" w:author="Claude" w:date="2026-10-28T00:00:00Z">
+      <w:ins w:id="162" w:author="Claude" w:date="2026-10-28T00:00:00Z">
         <w:r>
           <w:rPr>
             <w:b w:val="false"/>
@@ -2513,7 +2664,7 @@
         </w:rPr>
         <w:t xml:space="preserve"> the case of </w:t>
       </w:r>
-      <w:del w:id="154" w:author="Claude" w:date="2026-10-28T00:00:00Z">
+      <w:del w:id="163" w:author="Claude" w:date="2026-10-28T00:00:00Z">
         <w:r>
           <w:rPr>
             <w:b w:val="false"/>
@@ -2522,7 +2673,7 @@
           <w:delText xml:space="preserve">Public</w:delText>
         </w:r>
       </w:del>
-      <w:ins w:id="155" w:author="Claude" w:date="2026-10-28T00:00:00Z">
+      <w:ins w:id="164" w:author="Claude" w:date="2026-10-28T00:00:00Z">
         <w:r>
           <w:rPr>
             <w:b w:val="false"/>
@@ -2538,7 +2689,7 @@
         </w:rPr>
         <w:t xml:space="preserve"> Union for Civil Liberties </w:t>
       </w:r>
-      <w:del w:id="156" w:author="Claude" w:date="2026-10-28T00:00:00Z">
+      <w:del w:id="165" w:author="Claude" w:date="2026-10-28T00:00:00Z">
         <w:r>
           <w:rPr>
             <w:b w:val="false"/>
@@ -2547,7 +2698,7 @@
           <w:delText xml:space="preserve">versus</w:delText>
         </w:r>
       </w:del>
-      <w:ins w:id="157" w:author="Claude" w:date="2026-10-28T00:00:00Z">
+      <w:ins w:id="166" w:author="Claude" w:date="2026-10-28T00:00:00Z">
         <w:r>
           <w:rPr>
             <w:b w:val="false"/>
@@ -2563,7 +2714,7 @@
         </w:rPr>
         <w:t xml:space="preserve"> Union of India </w:t>
       </w:r>
-      <w:ins w:id="158" w:author="Claude" w:date="2026-10-28T00:00:00Z">
+      <w:ins w:id="167" w:author="Claude" w:date="2026-10-28T00:00:00Z">
         <w:r>
           <w:rPr>
             <w:b w:val="false"/>
@@ -2579,7 +2730,7 @@
         </w:rPr>
         <w:t xml:space="preserve">1996</w:t>
       </w:r>
-      <w:ins w:id="159" w:author="Claude" w:date="2026-10-28T00:00:00Z">
+      <w:ins w:id="168" w:author="Claude" w:date="2026-10-28T00:00:00Z">
         <w:r>
           <w:rPr>
             <w:b w:val="false"/>
@@ -2595,7 +2746,7 @@
         </w:rPr>
         <w:t xml:space="preserve">, the Indian Supreme Court laid down certain guidelines for interceptions. The court noted that the authorities engaged in interception were not even maintaining adequate records and logs on interception. Among the guidelines issued by the court was setting up a review committee that can look into authorizations made under Section 5(2) of the Telegraph Act. The Supreme Court's guidelines formed the basis of introducing Rule </w:t>
       </w:r>
-      <w:del w:id="160" w:author="Claude" w:date="2026-10-28T00:00:00Z">
+      <w:del w:id="169" w:author="Claude" w:date="2026-10-28T00:00:00Z">
         <w:r>
           <w:rPr>
             <w:b w:val="false"/>
@@ -2604,7 +2755,7 @@
           <w:delText xml:space="preserve">419, capital A,</w:delText>
         </w:r>
       </w:del>
-      <w:ins w:id="161" w:author="Claude" w:date="2026-10-28T00:00:00Z">
+      <w:ins w:id="170" w:author="Claude" w:date="2026-10-28T00:00:00Z">
         <w:r>
           <w:rPr>
             <w:b w:val="false"/>
@@ -2620,7 +2771,7 @@
         </w:rPr>
         <w:t xml:space="preserve"> in the </w:t>
       </w:r>
-      <w:ins w:id="162" w:author="Claude" w:date="2026-10-28T00:00:00Z">
+      <w:ins w:id="171" w:author="Claude" w:date="2026-10-28T00:00:00Z">
         <w:r>
           <w:rPr>
             <w:b w:val="false"/>
@@ -2636,7 +2787,7 @@
         </w:rPr>
         <w:t xml:space="preserve">Telegraph Rules</w:t>
       </w:r>
-      <w:ins w:id="163" w:author="Claude" w:date="2026-10-28T00:00:00Z">
+      <w:ins w:id="172" w:author="Claude" w:date="2026-10-28T00:00:00Z">
         <w:r>
           <w:rPr>
             <w:b w:val="false"/>
@@ -2652,7 +2803,7 @@
         </w:rPr>
         <w:t xml:space="preserve"> in 2007 and later </w:t>
       </w:r>
-      <w:del w:id="164" w:author="Claude" w:date="2026-10-28T00:00:00Z">
+      <w:del w:id="173" w:author="Claude" w:date="2026-10-28T00:00:00Z">
         <w:r>
           <w:rPr>
             <w:b w:val="false"/>
@@ -2661,7 +2812,7 @@
           <w:delText xml:space="preserve">in Surveillance Rules</w:delText>
         </w:r>
       </w:del>
-      <w:ins w:id="165" w:author="Claude" w:date="2026-10-28T00:00:00Z">
+      <w:ins w:id="174" w:author="Claude" w:date="2026-10-28T00:00:00Z">
         <w:r>
           <w:rPr>
             <w:b w:val="false"/>
@@ -2677,7 +2828,7 @@
         </w:rPr>
         <w:t xml:space="preserve"> prescribed under the IT Act in 2009.</w:t>
       </w:r>
-      <w:ins w:id="166" w:author="Claude" w:date="2026-10-28T00:00:00Z">
+      <w:ins w:id="175" w:author="Claude" w:date="2026-10-28T00:00:00Z">
         <w:r>
           <w:rPr>
             <w:b w:val="false"/>
@@ -2704,7 +2855,7 @@
         </w:rPr>
         <w:t xml:space="preserve">Another digital rights case </w:t>
       </w:r>
-      <w:del w:id="167" w:author="Claude" w:date="2026-10-28T00:00:00Z">
+      <w:del w:id="176" w:author="Claude" w:date="2026-10-28T00:00:00Z">
         <w:r>
           <w:rPr>
             <w:b w:val="false"/>
@@ -2713,7 +2864,7 @@
           <w:delText xml:space="preserve">in</w:delText>
         </w:r>
       </w:del>
-      <w:ins w:id="168" w:author="Claude" w:date="2026-10-28T00:00:00Z">
+      <w:ins w:id="177" w:author="Claude" w:date="2026-10-28T00:00:00Z">
         <w:r>
           <w:rPr>
             <w:b w:val="false"/>
@@ -2729,7 +2880,7 @@
         </w:rPr>
         <w:t xml:space="preserve"> Puttaswamy</w:t>
       </w:r>
-      <w:ins w:id="169" w:author="Claude" w:date="2026-10-28T00:00:00Z">
+      <w:ins w:id="178" w:author="Claude" w:date="2026-10-28T00:00:00Z">
         <w:r>
           <w:rPr>
             <w:b w:val="false"/>
@@ -2745,7 +2896,7 @@
         </w:rPr>
         <w:t xml:space="preserve"> </w:t>
       </w:r>
-      <w:del w:id="170" w:author="Claude" w:date="2026-10-28T00:00:00Z">
+      <w:del w:id="179" w:author="Claude" w:date="2026-10-28T00:00:00Z">
         <w:r>
           <w:rPr>
             <w:b w:val="false"/>
@@ -2754,7 +2905,7 @@
           <w:delText xml:space="preserve">versus</w:delText>
         </w:r>
       </w:del>
-      <w:ins w:id="171" w:author="Claude" w:date="2026-10-28T00:00:00Z">
+      <w:ins w:id="180" w:author="Claude" w:date="2026-10-28T00:00:00Z">
         <w:r>
           <w:rPr>
             <w:b w:val="false"/>
@@ -2770,7 +2921,7 @@
         </w:rPr>
         <w:t xml:space="preserve"> Union of India </w:t>
       </w:r>
-      <w:ins w:id="172" w:author="Claude" w:date="2026-10-28T00:00:00Z">
+      <w:ins w:id="181" w:author="Claude" w:date="2026-10-28T00:00:00Z">
         <w:r>
           <w:rPr>
             <w:b w:val="false"/>
@@ -2786,7 +2937,7 @@
         </w:rPr>
         <w:t xml:space="preserve">2017</w:t>
       </w:r>
-      <w:ins w:id="173" w:author="Claude" w:date="2026-10-28T00:00:00Z">
+      <w:ins w:id="182" w:author="Claude" w:date="2026-10-28T00:00:00Z">
         <w:r>
           <w:rPr>
             <w:b w:val="false"/>
@@ -2802,7 +2953,7 @@
         </w:rPr>
         <w:t xml:space="preserve">, in which </w:t>
       </w:r>
-      <w:ins w:id="174" w:author="Claude" w:date="2026-10-28T00:00:00Z">
+      <w:ins w:id="183" w:author="Claude" w:date="2026-10-28T00:00:00Z">
         <w:r>
           <w:rPr>
             <w:b w:val="false"/>
@@ -2843,7 +2994,7 @@
         </w:rPr>
         <w:t xml:space="preserve"> </w:t>
       </w:r>
-      <w:del w:id="175" w:author="Claude" w:date="2026-10-28T00:00:00Z">
+      <w:del w:id="184" w:author="Claude" w:date="2026-10-28T00:00:00Z">
         <w:r>
           <w:rPr>
             <w:b w:val="false"/>
@@ -2852,7 +3003,7 @@
           <w:delText xml:space="preserve">and enacting robust data protection mechanisms</w:delText>
         </w:r>
       </w:del>
-      <w:ins w:id="176" w:author="Claude" w:date="2026-10-28T00:00:00Z">
+      <w:ins w:id="185" w:author="Claude" w:date="2026-10-28T00:00:00Z">
         <w:r>
           <w:rPr>
             <w:b w:val="false"/>
@@ -2886,7 +3037,7 @@
         </w:rPr>
         <w:t xml:space="preserve">The Bombay High Court in </w:t>
       </w:r>
-      <w:del w:id="177" w:author="Claude" w:date="2026-10-28T00:00:00Z">
+      <w:del w:id="186" w:author="Claude" w:date="2026-10-28T00:00:00Z">
         <w:r>
           <w:rPr>
             <w:b w:val="false"/>
@@ -2895,7 +3046,7 @@
           <w:delText xml:space="preserve">Vineet</w:delText>
         </w:r>
       </w:del>
-      <w:ins w:id="178" w:author="Claude" w:date="2026-10-28T00:00:00Z">
+      <w:ins w:id="187" w:author="Claude" w:date="2026-10-28T00:00:00Z">
         <w:r>
           <w:rPr>
             <w:b w:val="false"/>
@@ -2911,7 +3062,7 @@
         </w:rPr>
         <w:t xml:space="preserve"> Kumar </w:t>
       </w:r>
-      <w:del w:id="179" w:author="Claude" w:date="2026-10-28T00:00:00Z">
+      <w:del w:id="188" w:author="Claude" w:date="2026-10-28T00:00:00Z">
         <w:r>
           <w:rPr>
             <w:b w:val="false"/>
@@ -2920,7 +3071,7 @@
           <w:delText xml:space="preserve">versus</w:delText>
         </w:r>
       </w:del>
-      <w:ins w:id="180" w:author="Claude" w:date="2026-10-28T00:00:00Z">
+      <w:ins w:id="189" w:author="Claude" w:date="2026-10-28T00:00:00Z">
         <w:r>
           <w:rPr>
             <w:b w:val="false"/>
@@ -2936,7 +3087,7 @@
         </w:rPr>
         <w:t xml:space="preserve"> CBI </w:t>
       </w:r>
-      <w:ins w:id="181" w:author="Claude" w:date="2026-10-28T00:00:00Z">
+      <w:ins w:id="190" w:author="Claude" w:date="2026-10-28T00:00:00Z">
         <w:r>
           <w:rPr>
             <w:b w:val="false"/>
@@ -2952,7 +3103,7 @@
         </w:rPr>
         <w:t xml:space="preserve">2019</w:t>
       </w:r>
-      <w:ins w:id="182" w:author="Claude" w:date="2026-10-28T00:00:00Z">
+      <w:ins w:id="191" w:author="Claude" w:date="2026-10-28T00:00:00Z">
         <w:r>
           <w:rPr>
             <w:b w:val="false"/>
@@ -2968,7 +3119,7 @@
         </w:rPr>
         <w:t xml:space="preserve"> set aside three interception orders of the Ministry of Home Affairs of India</w:t>
       </w:r>
-      <w:ins w:id="183" w:author="Claude" w:date="2026-10-28T00:00:00Z">
+      <w:ins w:id="192" w:author="Claude" w:date="2026-10-28T00:00:00Z">
         <w:r>
           <w:rPr>
             <w:b w:val="false"/>
@@ -2994,6 +3145,72 @@
         <w:spacing w:after="120" w:before="0" w:line="276"/>
         <w:jc w:val="both"/>
       </w:pPr>
+      <w:commentRangeStart w:id="38"/>
+      <w:ins w:id="193" w:author="Claude" w:date="2026-10-28T00:00:00Z">
+        <w:r>
+          <w:rPr>
+            <w:b w:val="false"/>
+            <w:bCs w:val="false"/>
+          </w:rPr>
+          <w:t xml:space="preserve">More recent High Court decisions follow the same approach, although not uniformly. In P. Kishore v. Secretary to Government of India (W.P. No. 143 of 2018, decided on 2 July 2025), the Madras High Court quashed a 2011 interception order issued in a bribery investigation, holding that the words "public emergency" and "public safety" in Section 5(2) of the Telegraph Act cannot be stretched to include the detection of ordinary crime, and that the intercepted material could not be used.</w:t>
+        </w:r>
+      </w:ins>
+      <w:commentRangeEnd w:id="38"/>
+      <w:r>
+        <w:commentReference w:id="38"/>
+      </w:r>
+      <w:ins w:id="194" w:author="Claude" w:date="2026-10-28T00:00:00Z">
+        <w:r>
+          <w:rPr>
+            <w:b w:val="false"/>
+            <w:bCs w:val="false"/>
+          </w:rPr>
+          <w:t xml:space="preserve"> </w:t>
+        </w:r>
+      </w:ins>
+      <w:commentRangeStart w:id="39"/>
+      <w:ins w:id="195" w:author="Claude" w:date="2026-10-28T00:00:00Z">
+        <w:r>
+          <w:rPr>
+            <w:b w:val="false"/>
+            <w:bCs w:val="false"/>
+          </w:rPr>
+          <w:t xml:space="preserve">In Shri Ravi Shankar Ji Maharaj v. Central Bureau of Investigation (CRMP No. 1504 of 2026, decided on 3 August 2026), apparently the first reported decision applying Section 20(2) of the Telecommunications Act and the Telecommunications Interception Rules, a Division Bench of the Chhattisgarh High Court set aside an interception order dated 28 June 2025 and the later confirmation and review committee proceedings. It held that a valid prior authorisation by the competent authority is a jurisdictional fact that cannot be supplied retrospectively, and directed destruction of the intercepted messages, while declining to quash the criminal proceedings.</w:t>
+        </w:r>
+      </w:ins>
+      <w:commentRangeEnd w:id="39"/>
+      <w:r>
+        <w:commentReference w:id="39"/>
+      </w:r>
+      <w:ins w:id="196" w:author="Claude" w:date="2026-10-28T00:00:00Z">
+        <w:r>
+          <w:rPr>
+            <w:b w:val="false"/>
+            <w:bCs w:val="false"/>
+          </w:rPr>
+          <w:t xml:space="preserve"> </w:t>
+        </w:r>
+      </w:ins>
+      <w:commentRangeStart w:id="40"/>
+      <w:ins w:id="197" w:author="Claude" w:date="2026-10-28T00:00:00Z">
+        <w:r>
+          <w:rPr>
+            <w:b w:val="false"/>
+            <w:bCs w:val="false"/>
+          </w:rPr>
+          <w:t xml:space="preserve">By contrast, in Aakash Deep Chouhan v. CBI (CRL.M.C. 204 of 2020, decided on 26 June 2025), the Delhi High Court upheld interceptions in a large corruption case as justified in the interest of public safety, reasoning that corruption threatens the economic safety of the country, and held that the admissibility of intercepted material depends on its reliability rather than on how it was obtained. The High Courts are therefore divided on whether interception can be justified for economic offences.</w:t>
+        </w:r>
+      </w:ins>
+      <w:commentRangeEnd w:id="40"/>
+      <w:r>
+        <w:commentReference w:id="40"/>
+      </w:r>
+    </w:p>
+    <w:p>
+      <w:pPr>
+        <w:spacing w:after="120" w:before="0" w:line="276"/>
+        <w:jc w:val="both"/>
+      </w:pPr>
       <w:commentRangeStart w:id="26"/>
       <w:r>
         <w:rPr>
@@ -3002,7 +3219,7 @@
         </w:rPr>
         <w:t xml:space="preserve">While there are reports by Human Rights Watch </w:t>
       </w:r>
-      <w:del w:id="184" w:author="Claude" w:date="2026-10-28T00:00:00Z">
+      <w:del w:id="198" w:author="Claude" w:date="2026-10-28T00:00:00Z">
         <w:r>
           <w:rPr>
             <w:b w:val="false"/>
@@ -3011,7 +3228,7 @@
           <w:delText xml:space="preserve">on </w:delText>
         </w:r>
       </w:del>
-      <w:ins w:id="185" w:author="Claude" w:date="2026-10-28T00:00:00Z">
+      <w:ins w:id="199" w:author="Claude" w:date="2026-10-28T00:00:00Z">
         <w:r>
           <w:rPr>
             <w:b w:val="false"/>
@@ -3027,7 +3244,7 @@
         </w:rPr>
         <w:t xml:space="preserve">26</w:t>
       </w:r>
-      <w:del w:id="186" w:author="Claude" w:date="2026-10-28T00:00:00Z">
+      <w:del w:id="200" w:author="Claude" w:date="2026-10-28T00:00:00Z">
         <w:r>
           <w:rPr>
             <w:b w:val="false"/>
@@ -3043,7 +3260,7 @@
         </w:rPr>
         <w:t xml:space="preserve"> August 2021 and others that the Indian government has allegedly used advanced spyware to target activists and apparently its opponents in opposition, </w:t>
       </w:r>
-      <w:del w:id="187" w:author="Claude" w:date="2026-10-28T00:00:00Z">
+      <w:del w:id="201" w:author="Claude" w:date="2026-10-28T00:00:00Z">
         <w:r>
           <w:rPr>
             <w:b w:val="false"/>
@@ -3052,7 +3269,7 @@
           <w:delText xml:space="preserve">probably in the range of 300 people in India</w:delText>
         </w:r>
       </w:del>
-      <w:ins w:id="188" w:author="Claude" w:date="2026-10-28T00:00:00Z">
+      <w:ins w:id="202" w:author="Claude" w:date="2026-10-28T00:00:00Z">
         <w:r>
           <w:rPr>
             <w:b w:val="false"/>
@@ -3068,7 +3285,7 @@
         </w:rPr>
         <w:t xml:space="preserve">, there is </w:t>
       </w:r>
-      <w:del w:id="189" w:author="Claude" w:date="2026-10-28T00:00:00Z">
+      <w:del w:id="203" w:author="Claude" w:date="2026-10-28T00:00:00Z">
         <w:r>
           <w:rPr>
             <w:b w:val="false"/>
@@ -3077,7 +3294,7 @@
           <w:delText xml:space="preserve">and has been no</w:delText>
         </w:r>
       </w:del>
-      <w:ins w:id="190" w:author="Claude" w:date="2026-10-28T00:00:00Z">
+      <w:ins w:id="204" w:author="Claude" w:date="2026-10-28T00:00:00Z">
         <w:r>
           <w:rPr>
             <w:b w:val="false"/>
@@ -3093,7 +3310,7 @@
         </w:rPr>
         <w:t xml:space="preserve"> evidence in the public domain of </w:t>
       </w:r>
-      <w:del w:id="191" w:author="Claude" w:date="2026-10-28T00:00:00Z">
+      <w:del w:id="205" w:author="Claude" w:date="2026-10-28T00:00:00Z">
         <w:r>
           <w:rPr>
             <w:b w:val="false"/>
@@ -3109,7 +3326,7 @@
         </w:rPr>
         <w:t xml:space="preserve">bulk data collection or communication surveillance on a large scale by the Indian government.</w:t>
       </w:r>
-      <w:ins w:id="192" w:author="Claude" w:date="2026-10-28T00:00:00Z">
+      <w:ins w:id="206" w:author="Claude" w:date="2026-10-28T00:00:00Z">
         <w:r>
           <w:rPr>
             <w:b w:val="false"/>
@@ -3125,7 +3342,7 @@
         </w:rPr>
         <w:t xml:space="preserve"> Human Rights Watch states that hacking is illegal under Indian law, and thus far, the Indian government has not stated whether it used Israeli spyware Pegasus to hack into devices.</w:t>
       </w:r>
-      <w:ins w:id="193" w:author="Claude" w:date="2026-10-28T00:00:00Z">
+      <w:ins w:id="207" w:author="Claude" w:date="2026-10-28T00:00:00Z">
         <w:r>
           <w:rPr>
             <w:b w:val="false"/>
@@ -3137,6 +3354,26 @@
       <w:commentRangeEnd w:id="26"/>
       <w:r>
         <w:commentReference w:id="26"/>
+      </w:r>
+    </w:p>
+    <w:p>
+      <w:pPr>
+        <w:spacing w:after="120" w:before="0" w:line="276"/>
+        <w:jc w:val="both"/>
+      </w:pPr>
+      <w:commentRangeStart w:id="41"/>
+      <w:ins w:id="208" w:author="Claude" w:date="2026-10-28T00:00:00Z">
+        <w:r>
+          <w:rPr>
+            <w:b w:val="false"/>
+            <w:bCs w:val="false"/>
+          </w:rPr>
+          <w:t xml:space="preserve">The Supreme Court is also considering the limits of State access to data on seized digital devices. In Future Gaming and Hotels Services Pvt. Ltd. v. Directorate of Enforcement (W.P.(Crl.) No. 515 of 2024), the Court by an ad-interim order dated 13 December 2024 restrained the Directorate of Enforcement from accessing and copying the contents of seized mobile phones and other electronic devices, and directed that the matter be heard with W.P.(C) No. 1081 of 2022 and connected cases. In Foundation for Media Professionals v. Union of India (W.P.(Crl.) No. 395 of 2022), the petitioners seek guidelines for the search and seizure of digital devices, including prior judicial authorisation. Both matters remain pending.</w:t>
+        </w:r>
+      </w:ins>
+      <w:commentRangeEnd w:id="41"/>
+      <w:r>
+        <w:commentReference w:id="41"/>
       </w:r>
     </w:p>
     <w:p>
@@ -3165,7 +3402,7 @@
         <w:t xml:space="preserve">The probability is very low that the extraordinary and exceptional authorities provided by certain narrowly targeted statutes allowing for broad and secret surveillance related to matters of national security, requiring authorization by a limited set of senior officials of the </w:t>
       </w:r>
       <w:commentRangeStart w:id="27"/>
-      <w:del w:id="194" w:author="Claude" w:date="2026-10-28T00:00:00Z">
+      <w:del w:id="209" w:author="Claude" w:date="2026-10-28T00:00:00Z">
         <w:r>
           <w:rPr>
             <w:b w:val="false"/>
@@ -3174,7 +3411,7 @@
           <w:delText xml:space="preserve">federal government</w:delText>
         </w:r>
       </w:del>
-      <w:ins w:id="195" w:author="Claude" w:date="2026-10-28T00:00:00Z">
+      <w:ins w:id="210" w:author="Claude" w:date="2026-10-28T00:00:00Z">
         <w:r>
           <w:rPr>
             <w:b w:val="false"/>
@@ -3202,7 +3439,7 @@
         </w:rPr>
         <w:t xml:space="preserve">Further, the data importer is a law firm and</w:t>
       </w:r>
-      <w:ins w:id="196" w:author="Claude" w:date="2026-10-28T00:00:00Z">
+      <w:ins w:id="211" w:author="Claude" w:date="2026-10-28T00:00:00Z">
         <w:r>
           <w:rPr>
             <w:b w:val="false"/>
@@ -3218,7 +3455,7 @@
         </w:rPr>
         <w:t xml:space="preserve"> </w:t>
       </w:r>
-      <w:del w:id="197" w:author="Claude" w:date="2026-10-28T00:00:00Z">
+      <w:del w:id="212" w:author="Claude" w:date="2026-10-28T00:00:00Z">
         <w:r>
           <w:rPr>
             <w:b w:val="false"/>
@@ -3227,7 +3464,7 @@
           <w:delText xml:space="preserve">is thus</w:delText>
         </w:r>
       </w:del>
-      <w:ins w:id="198" w:author="Claude" w:date="2026-10-28T00:00:00Z">
+      <w:ins w:id="213" w:author="Claude" w:date="2026-10-28T00:00:00Z">
         <w:r>
           <w:rPr>
             <w:b w:val="false"/>
@@ -3243,7 +3480,7 @@
         </w:rPr>
         <w:t xml:space="preserve"> protected by </w:t>
       </w:r>
-      <w:del w:id="199" w:author="Claude" w:date="2026-10-28T00:00:00Z">
+      <w:del w:id="214" w:author="Claude" w:date="2026-10-28T00:00:00Z">
         <w:r>
           <w:rPr>
             <w:b w:val="false"/>
@@ -3252,7 +3489,7 @@
           <w:delText xml:space="preserve">rules on attorney-client</w:delText>
         </w:r>
       </w:del>
-      <w:ins w:id="200" w:author="Claude" w:date="2026-10-28T00:00:00Z">
+      <w:ins w:id="215" w:author="Claude" w:date="2026-10-28T00:00:00Z">
         <w:r>
           <w:rPr>
             <w:b w:val="false"/>
@@ -3268,7 +3505,7 @@
         </w:rPr>
         <w:t xml:space="preserve"> privilege in India</w:t>
       </w:r>
-      <w:ins w:id="201" w:author="Claude" w:date="2026-10-28T00:00:00Z">
+      <w:ins w:id="216" w:author="Claude" w:date="2026-10-28T00:00:00Z">
         <w:r>
           <w:rPr>
             <w:b w:val="false"/>
@@ -3284,7 +3521,7 @@
         </w:rPr>
         <w:t xml:space="preserve">. In particular, professional communications between </w:t>
       </w:r>
-      <w:del w:id="202" w:author="Claude" w:date="2026-10-28T00:00:00Z">
+      <w:del w:id="217" w:author="Claude" w:date="2026-10-28T00:00:00Z">
         <w:r>
           <w:rPr>
             <w:b w:val="false"/>
@@ -3293,7 +3530,7 @@
           <w:delText xml:space="preserve">attorneys</w:delText>
         </w:r>
       </w:del>
-      <w:ins w:id="203" w:author="Claude" w:date="2026-10-28T00:00:00Z">
+      <w:ins w:id="218" w:author="Claude" w:date="2026-10-28T00:00:00Z">
         <w:r>
           <w:rPr>
             <w:b w:val="false"/>
@@ -3309,7 +3546,7 @@
         </w:rPr>
         <w:t xml:space="preserve"> and clients are protected in India as privileged communications under </w:t>
       </w:r>
-      <w:ins w:id="204" w:author="Claude" w:date="2026-10-28T00:00:00Z">
+      <w:ins w:id="219" w:author="Claude" w:date="2026-10-28T00:00:00Z">
         <w:r>
           <w:rPr>
             <w:b w:val="false"/>
@@ -3325,7 +3562,7 @@
         </w:rPr>
         <w:t xml:space="preserve">the Bharatiya </w:t>
       </w:r>
-      <w:del w:id="205" w:author="Claude" w:date="2026-10-28T00:00:00Z">
+      <w:del w:id="220" w:author="Claude" w:date="2026-10-28T00:00:00Z">
         <w:r>
           <w:rPr>
             <w:b w:val="false"/>
@@ -3334,7 +3571,7 @@
           <w:delText xml:space="preserve">Saksha</w:delText>
         </w:r>
       </w:del>
-      <w:ins w:id="206" w:author="Claude" w:date="2026-10-28T00:00:00Z">
+      <w:ins w:id="221" w:author="Claude" w:date="2026-10-28T00:00:00Z">
         <w:r>
           <w:rPr>
             <w:b w:val="false"/>
@@ -3350,7 +3587,7 @@
         </w:rPr>
         <w:t xml:space="preserve"> Adhiniyam</w:t>
       </w:r>
-      <w:ins w:id="207" w:author="Claude" w:date="2026-10-28T00:00:00Z">
+      <w:ins w:id="222" w:author="Claude" w:date="2026-10-28T00:00:00Z">
         <w:r>
           <w:rPr>
             <w:b w:val="false"/>
@@ -3366,7 +3603,7 @@
         </w:rPr>
         <w:t xml:space="preserve"> 2023</w:t>
       </w:r>
-      <w:ins w:id="208" w:author="Claude" w:date="2026-10-28T00:00:00Z">
+      <w:ins w:id="223" w:author="Claude" w:date="2026-10-28T00:00:00Z">
         <w:r>
           <w:rPr>
             <w:b w:val="false"/>
@@ -3382,7 +3619,7 @@
         </w:rPr>
         <w:t xml:space="preserve">, which replaced the Indian Evidence Act 1872 </w:t>
       </w:r>
-      <w:del w:id="209" w:author="Claude" w:date="2026-10-28T00:00:00Z">
+      <w:del w:id="224" w:author="Claude" w:date="2026-10-28T00:00:00Z">
         <w:r>
           <w:rPr>
             <w:b w:val="false"/>
@@ -3391,7 +3628,7 @@
           <w:delText xml:space="preserve">and is known as the BSA</w:delText>
         </w:r>
       </w:del>
-      <w:ins w:id="210" w:author="Claude" w:date="2026-10-28T00:00:00Z">
+      <w:ins w:id="225" w:author="Claude" w:date="2026-10-28T00:00:00Z">
         <w:r>
           <w:rPr>
             <w:b w:val="false"/>
@@ -3407,7 +3644,7 @@
         </w:rPr>
         <w:t xml:space="preserve">.</w:t>
       </w:r>
-      <w:ins w:id="211" w:author="Claude" w:date="2026-10-28T00:00:00Z">
+      <w:ins w:id="226" w:author="Claude" w:date="2026-10-28T00:00:00Z">
         <w:r>
           <w:rPr>
             <w:b w:val="false"/>
@@ -3447,7 +3684,7 @@
         </w:rPr>
         <w:t xml:space="preserve">In India, judicial redress is available against illegal surveillance, so individuals, regardless of their citizenship, have a right to seek judicial and constitutional remedies before the Indian Supreme Court and High Courts</w:t>
       </w:r>
-      <w:ins w:id="212" w:author="Claude" w:date="2026-10-28T00:00:00Z">
+      <w:ins w:id="227" w:author="Claude" w:date="2026-10-28T00:00:00Z">
         <w:r>
           <w:rPr>
             <w:b w:val="false"/>
@@ -3463,7 +3700,7 @@
         </w:rPr>
         <w:t xml:space="preserve"> in case of breach of right to privacy. Individuals can challenge any action of the state that does not follow a procedure established by law and/or that is otherwise unreasonable, arbitrary, or disproportionate to the objectives that the action seeks to accomplish.</w:t>
       </w:r>
-      <w:ins w:id="213" w:author="Claude" w:date="2026-10-28T00:00:00Z">
+      <w:ins w:id="228" w:author="Claude" w:date="2026-10-28T00:00:00Z">
         <w:r>
           <w:rPr>
             <w:b w:val="false"/>
@@ -3491,7 +3728,7 @@
         </w:rPr>
         <w:t xml:space="preserve">Instead, the </w:t>
       </w:r>
-      <w:del w:id="214" w:author="Claude" w:date="2026-10-28T00:00:00Z">
+      <w:del w:id="229" w:author="Claude" w:date="2026-10-28T00:00:00Z">
         <w:r>
           <w:rPr>
             <w:b w:val="false"/>
@@ -3500,7 +3737,7 @@
           <w:delText xml:space="preserve">details would be revealed to a government-appointed committee of experts</w:delText>
         </w:r>
       </w:del>
-      <w:ins w:id="215" w:author="Claude" w:date="2026-10-28T00:00:00Z">
+      <w:ins w:id="230" w:author="Claude" w:date="2026-10-28T00:00:00Z">
         <w:r>
           <w:rPr>
             <w:b w:val="false"/>
@@ -3535,7 +3772,7 @@
         </w:rPr>
         <w:t xml:space="preserve">The </w:t>
       </w:r>
-      <w:del w:id="216" w:author="Claude" w:date="2026-10-28T00:00:00Z">
+      <w:del w:id="231" w:author="Claude" w:date="2026-10-28T00:00:00Z">
         <w:r>
           <w:rPr>
             <w:b w:val="false"/>
@@ -3544,7 +3781,7 @@
           <w:delText xml:space="preserve">Center</w:delText>
         </w:r>
       </w:del>
-      <w:ins w:id="217" w:author="Claude" w:date="2026-10-28T00:00:00Z">
+      <w:ins w:id="232" w:author="Claude" w:date="2026-10-28T00:00:00Z">
         <w:r>
           <w:rPr>
             <w:b w:val="false"/>
@@ -3560,7 +3797,7 @@
         </w:rPr>
         <w:t xml:space="preserve"> for Internet and Society, CIS, recommends that current national laws which regulate surveillance in India be amended in accordance with the national privacy principles and the international principles on the application of human rights to communication surveillance, and that a privacy law be enacted. </w:t>
       </w:r>
-      <w:ins w:id="218" w:author="Claude" w:date="2026-10-28T00:00:00Z">
+      <w:ins w:id="233" w:author="Claude" w:date="2026-10-28T00:00:00Z">
         <w:r>
           <w:rPr>
             <w:b w:val="false"/>
@@ -3569,7 +3806,7 @@
           <w:t xml:space="preserve">The latter recommendation has since been addressed in part by the enactment of the DPDP, but the</w:t>
         </w:r>
       </w:ins>
-      <w:del w:id="219" w:author="Claude" w:date="2026-10-28T00:00:00Z">
+      <w:del w:id="234" w:author="Claude" w:date="2026-10-28T00:00:00Z">
         <w:r>
           <w:rPr>
             <w:b w:val="false"/>
@@ -3585,7 +3822,7 @@
         </w:rPr>
         <w:t xml:space="preserve"> discussion</w:t>
       </w:r>
-      <w:ins w:id="220" w:author="Claude" w:date="2026-10-28T00:00:00Z">
+      <w:ins w:id="235" w:author="Claude" w:date="2026-10-28T00:00:00Z">
         <w:r>
           <w:rPr>
             <w:b w:val="false"/>
@@ -3601,7 +3838,7 @@
         </w:rPr>
         <w:t xml:space="preserve"> is ongoing in India</w:t>
       </w:r>
-      <w:ins w:id="221" w:author="Claude" w:date="2026-10-28T00:00:00Z">
+      <w:ins w:id="236" w:author="Claude" w:date="2026-10-28T00:00:00Z">
         <w:r>
           <w:rPr>
             <w:b w:val="false"/>
@@ -3617,7 +3854,7 @@
         </w:rPr>
         <w:t xml:space="preserve">. Legal experts and rights groups have underlined their concern about the </w:t>
       </w:r>
-      <w:del w:id="222" w:author="Claude" w:date="2026-10-28T00:00:00Z">
+      <w:del w:id="237" w:author="Claude" w:date="2026-10-28T00:00:00Z">
         <w:r>
           <w:rPr>
             <w:b w:val="false"/>
@@ -3626,7 +3863,7 @@
           <w:delText xml:space="preserve">Act</w:delText>
         </w:r>
       </w:del>
-      <w:ins w:id="223" w:author="Claude" w:date="2026-10-28T00:00:00Z">
+      <w:ins w:id="238" w:author="Claude" w:date="2026-10-28T00:00:00Z">
         <w:r>
           <w:rPr>
             <w:b w:val="false"/>
@@ -3642,7 +3879,7 @@
         </w:rPr>
         <w:t xml:space="preserve">, especially over the potential for unfettered government surveillance</w:t>
       </w:r>
-      <w:ins w:id="224" w:author="Claude" w:date="2026-10-28T00:00:00Z">
+      <w:ins w:id="239" w:author="Claude" w:date="2026-10-28T00:00:00Z">
         <w:r>
           <w:rPr>
             <w:b w:val="false"/>
@@ -3651,7 +3888,7 @@
           <w:t xml:space="preserve"> (see sections 17(2)(a) and 36 of the DPDP)</w:t>
         </w:r>
       </w:ins>
-      <w:del w:id="225" w:author="Claude" w:date="2026-10-28T00:00:00Z">
+      <w:del w:id="240" w:author="Claude" w:date="2026-10-28T00:00:00Z">
         <w:r>
           <w:rPr>
             <w:b w:val="false"/>
@@ -3660,7 +3897,7 @@
           <w:delText xml:space="preserve"> that</w:delText>
         </w:r>
       </w:del>
-      <w:ins w:id="226" w:author="Claude" w:date="2026-10-28T00:00:00Z">
+      <w:ins w:id="241" w:author="Claude" w:date="2026-10-28T00:00:00Z">
         <w:r>
           <w:rPr>
             <w:b w:val="false"/>
@@ -3679,6 +3916,49 @@
       <w:commentRangeEnd w:id="31"/>
       <w:r>
         <w:commentReference w:id="31"/>
+      </w:r>
+    </w:p>
+    <w:p>
+      <w:pPr>
+        <w:spacing w:after="120" w:before="0" w:line="276"/>
+        <w:jc w:val="both"/>
+      </w:pPr>
+      <w:commentRangeStart w:id="42"/>
+      <w:ins w:id="242" w:author="Claude" w:date="2026-10-28T00:00:00Z">
+        <w:r>
+          <w:rPr>
+            <w:b w:val="false"/>
+            <w:bCs w:val="false"/>
+          </w:rPr>
+          <w:t xml:space="preserve">Two qualifications apply to non-citizens. Although Articles 14 and 21 of the Constitution protect all persons, the freedoms in Article 19 (including freedom of speech and expression) are available only to citizens. On this basis, in X Corp v. Union of India (W.P. No. 7405 of 2025, decided on 24 September 2025), the Karnataka High Court held that a foreign company could not invoke Article 19; X Corp has said it will appeal. Challenges by EU data subjects would therefore rest principally on Article 21.</w:t>
+        </w:r>
+      </w:ins>
+      <w:commentRangeEnd w:id="42"/>
+      <w:r>
+        <w:commentReference w:id="42"/>
+      </w:r>
+      <w:ins w:id="243" w:author="Claude" w:date="2026-10-28T00:00:00Z">
+        <w:r>
+          <w:rPr>
+            <w:b w:val="false"/>
+            <w:bCs w:val="false"/>
+          </w:rPr>
+          <w:t xml:space="preserve"> </w:t>
+        </w:r>
+      </w:ins>
+      <w:commentRangeStart w:id="43"/>
+      <w:ins w:id="244" w:author="Claude" w:date="2026-10-28T00:00:00Z">
+        <w:r>
+          <w:rPr>
+            <w:b w:val="false"/>
+            <w:bCs w:val="false"/>
+          </w:rPr>
+          <w:t xml:space="preserve">In Anuradha Bhasin v. Union of India ((2020) 3 SCC 637, decided on 10 January 2020), the Supreme Court required that orders restricting telecommunication services be published, be reviewed periodically and satisfy the proportionality test. Interception orders, by contrast, are not published, which limits the practical availability of review.</w:t>
+        </w:r>
+      </w:ins>
+      <w:commentRangeEnd w:id="43"/>
+      <w:r>
+        <w:commentReference w:id="43"/>
       </w:r>
     </w:p>
     <w:p>
@@ -3689,7 +3969,7 @@
           <w:ins w:id="9003" w:author="Claude" w:date="2026-10-28T00:00:00Z"/>
         </w:rPr>
       </w:pPr>
-      <w:ins w:id="228" w:author="Claude" w:date="2026-10-28T00:00:00Z">
+      <w:ins w:id="246" w:author="Claude" w:date="2026-10-28T00:00:00Z">
         <w:r>
           <w:rPr>
             <w:b/>
@@ -3707,7 +3987,7 @@
           <w:ins w:id="9004" w:author="Claude" w:date="2026-10-28T00:00:00Z"/>
         </w:rPr>
       </w:pPr>
-      <w:ins w:id="229" w:author="Claude" w:date="2026-10-28T00:00:00Z">
+      <w:ins w:id="247" w:author="Claude" w:date="2026-10-28T00:00:00Z">
         <w:r>
           <w:rPr>
             <w:b/>
@@ -3730,7 +4010,7 @@
           <w:ins w:id="9005" w:author="Claude" w:date="2026-10-28T00:00:00Z"/>
         </w:rPr>
       </w:pPr>
-      <w:ins w:id="230" w:author="Claude" w:date="2026-10-28T00:00:00Z">
+      <w:ins w:id="248" w:author="Claude" w:date="2026-10-28T00:00:00Z">
         <w:r>
           <w:rPr>
             <w:b w:val="false"/>
@@ -3753,7 +4033,7 @@
           <w:ins w:id="9006" w:author="Claude" w:date="2026-10-28T00:00:00Z"/>
         </w:rPr>
       </w:pPr>
-      <w:ins w:id="231" w:author="Claude" w:date="2026-10-28T00:00:00Z">
+      <w:ins w:id="249" w:author="Claude" w:date="2026-10-28T00:00:00Z">
         <w:r>
           <w:rPr>
             <w:b w:val="false"/>
@@ -3776,7 +4056,7 @@
           <w:ins w:id="9007" w:author="Claude" w:date="2026-10-28T00:00:00Z"/>
         </w:rPr>
       </w:pPr>
-      <w:ins w:id="232" w:author="Claude" w:date="2026-10-28T00:00:00Z">
+      <w:ins w:id="250" w:author="Claude" w:date="2026-10-28T00:00:00Z">
         <w:r>
           <w:rPr>
             <w:b w:val="false"/>
@@ -3799,7 +4079,7 @@
           <w:ins w:id="9008" w:author="Claude" w:date="2026-10-28T00:00:00Z"/>
         </w:rPr>
       </w:pPr>
-      <w:ins w:id="233" w:author="Claude" w:date="2026-10-28T00:00:00Z">
+      <w:ins w:id="251" w:author="Claude" w:date="2026-10-28T00:00:00Z">
         <w:r>
           <w:rPr>
             <w:b w:val="false"/>
@@ -3822,7 +4102,7 @@
           <w:ins w:id="9009" w:author="Claude" w:date="2026-10-28T00:00:00Z"/>
         </w:rPr>
       </w:pPr>
-      <w:ins w:id="234" w:author="Claude" w:date="2026-10-28T00:00:00Z">
+      <w:ins w:id="252" w:author="Claude" w:date="2026-10-28T00:00:00Z">
         <w:r>
           <w:rPr>
             <w:b w:val="false"/>
@@ -3845,7 +4125,7 @@
           <w:ins w:id="9010" w:author="Claude" w:date="2026-10-28T00:00:00Z"/>
         </w:rPr>
       </w:pPr>
-      <w:ins w:id="235" w:author="Claude" w:date="2026-10-28T00:00:00Z">
+      <w:ins w:id="253" w:author="Claude" w:date="2026-10-28T00:00:00Z">
         <w:r>
           <w:rPr>
             <w:b w:val="false"/>
@@ -3868,7 +4148,7 @@
           <w:ins w:id="9011" w:author="Claude" w:date="2026-10-28T00:00:00Z"/>
         </w:rPr>
       </w:pPr>
-      <w:ins w:id="236" w:author="Claude" w:date="2026-10-28T00:00:00Z">
+      <w:ins w:id="254" w:author="Claude" w:date="2026-10-28T00:00:00Z">
         <w:r>
           <w:rPr>
             <w:b w:val="false"/>
@@ -3891,7 +4171,7 @@
           <w:ins w:id="9012" w:author="Claude" w:date="2026-10-28T00:00:00Z"/>
         </w:rPr>
       </w:pPr>
-      <w:ins w:id="237" w:author="Claude" w:date="2026-10-28T00:00:00Z">
+      <w:ins w:id="255" w:author="Claude" w:date="2026-10-28T00:00:00Z">
         <w:r>
           <w:rPr>
             <w:b w:val="false"/>
@@ -3914,7 +4194,7 @@
           <w:ins w:id="9013" w:author="Claude" w:date="2026-10-28T00:00:00Z"/>
         </w:rPr>
       </w:pPr>
-      <w:ins w:id="238" w:author="Claude" w:date="2026-10-28T00:00:00Z">
+      <w:ins w:id="256" w:author="Claude" w:date="2026-10-28T00:00:00Z">
         <w:r>
           <w:rPr>
             <w:b w:val="false"/>
@@ -3937,7 +4217,7 @@
           <w:ins w:id="9014" w:author="Claude" w:date="2026-10-28T00:00:00Z"/>
         </w:rPr>
       </w:pPr>
-      <w:ins w:id="239" w:author="Claude" w:date="2026-10-28T00:00:00Z">
+      <w:ins w:id="257" w:author="Claude" w:date="2026-10-28T00:00:00Z">
         <w:r>
           <w:rPr>
             <w:b w:val="false"/>
@@ -3960,7 +4240,7 @@
           <w:ins w:id="9015" w:author="Claude" w:date="2026-10-28T00:00:00Z"/>
         </w:rPr>
       </w:pPr>
-      <w:ins w:id="240" w:author="Claude" w:date="2026-10-28T00:00:00Z">
+      <w:ins w:id="258" w:author="Claude" w:date="2026-10-28T00:00:00Z">
         <w:r>
           <w:rPr>
             <w:b w:val="false"/>
@@ -3983,7 +4263,7 @@
           <w:ins w:id="9016" w:author="Claude" w:date="2026-10-28T00:00:00Z"/>
         </w:rPr>
       </w:pPr>
-      <w:ins w:id="241" w:author="Claude" w:date="2026-10-28T00:00:00Z">
+      <w:ins w:id="259" w:author="Claude" w:date="2026-10-28T00:00:00Z">
         <w:r>
           <w:rPr>
             <w:b w:val="false"/>
@@ -4006,7 +4286,7 @@
           <w:ins w:id="9017" w:author="Claude" w:date="2026-10-28T00:00:00Z"/>
         </w:rPr>
       </w:pPr>
-      <w:ins w:id="242" w:author="Claude" w:date="2026-10-28T00:00:00Z">
+      <w:ins w:id="260" w:author="Claude" w:date="2026-10-28T00:00:00Z">
         <w:r>
           <w:rPr>
             <w:b w:val="false"/>
@@ -4029,7 +4309,7 @@
           <w:ins w:id="9018" w:author="Claude" w:date="2026-10-28T00:00:00Z"/>
         </w:rPr>
       </w:pPr>
-      <w:ins w:id="243" w:author="Claude" w:date="2026-10-28T00:00:00Z">
+      <w:ins w:id="261" w:author="Claude" w:date="2026-10-28T00:00:00Z">
         <w:r>
           <w:rPr>
             <w:b w:val="false"/>
@@ -4052,7 +4332,7 @@
           <w:ins w:id="9019" w:author="Claude" w:date="2026-10-28T00:00:00Z"/>
         </w:rPr>
       </w:pPr>
-      <w:ins w:id="244" w:author="Claude" w:date="2026-10-28T00:00:00Z">
+      <w:ins w:id="262" w:author="Claude" w:date="2026-10-28T00:00:00Z">
         <w:r>
           <w:rPr>
             <w:b w:val="false"/>
@@ -4075,7 +4355,7 @@
           <w:ins w:id="9020" w:author="Claude" w:date="2026-10-28T00:00:00Z"/>
         </w:rPr>
       </w:pPr>
-      <w:ins w:id="245" w:author="Claude" w:date="2026-10-28T00:00:00Z">
+      <w:ins w:id="263" w:author="Claude" w:date="2026-10-28T00:00:00Z">
         <w:r>
           <w:rPr>
             <w:b w:val="false"/>
@@ -4098,7 +4378,7 @@
           <w:ins w:id="9021" w:author="Claude" w:date="2026-10-28T00:00:00Z"/>
         </w:rPr>
       </w:pPr>
-      <w:ins w:id="246" w:author="Claude" w:date="2026-10-28T00:00:00Z">
+      <w:ins w:id="264" w:author="Claude" w:date="2026-10-28T00:00:00Z">
         <w:r>
           <w:rPr>
             <w:b w:val="false"/>
@@ -4121,7 +4401,7 @@
           <w:ins w:id="9022" w:author="Claude" w:date="2026-10-28T00:00:00Z"/>
         </w:rPr>
       </w:pPr>
-      <w:ins w:id="247" w:author="Claude" w:date="2026-10-28T00:00:00Z">
+      <w:ins w:id="265" w:author="Claude" w:date="2026-10-28T00:00:00Z">
         <w:r>
           <w:rPr>
             <w:b w:val="false"/>
@@ -4144,31 +4424,13 @@
           <w:ins w:id="9023" w:author="Claude" w:date="2026-10-28T00:00:00Z"/>
         </w:rPr>
       </w:pPr>
-      <w:ins w:id="248" w:author="Claude" w:date="2026-10-28T00:00:00Z">
+      <w:ins w:id="266" w:author="Claude" w:date="2026-10-28T00:00:00Z">
         <w:r>
           <w:rPr>
             <w:b w:val="false"/>
             <w:bCs w:val="false"/>
           </w:rPr>
           <w:t xml:space="preserve">[P] European Commission, adequacy decisions: https://commission.europa.eu/law/law-topic/data-protection/international-dimension-data-protection/adequacy-decisions_en; Standard Contractual Clauses, Decision (EU) 2021/914: https://eur-lex.europa.eu/legal-content/EN/TXT/?uri=CELEX%3A32021D0914; EDPB Recommendations 01/2020: https://www.edpb.europa.eu/system/files/documents/2021-06/edpb_recommendations_202001vo.2.0_supplementarymeasurestransferstools_en.pdf</w:t>
-        </w:r>
-      </w:ins>
-    </w:p>
-    <w:p>
-      <w:pPr>
-        <w:spacing w:after="120" w:before="240" w:line="276"/>
-        <w:jc w:val="left"/>
-        <w:rPr>
-          <w:ins w:id="9024" w:author="Claude" w:date="2026-10-28T00:00:00Z"/>
-        </w:rPr>
-      </w:pPr>
-      <w:ins w:id="249" w:author="Claude" w:date="2026-10-28T00:00:00Z">
-        <w:r>
-          <w:rPr>
-            <w:b/>
-            <w:bCs/>
-          </w:rPr>
-          <w:t xml:space="preserve">Primary sources: judgments</w:t>
         </w:r>
       </w:ins>
     </w:p>
@@ -4182,16 +4444,16 @@
         <w:spacing w:after="120" w:before="0" w:line="276"/>
         <w:jc w:val="left"/>
         <w:rPr>
-          <w:ins w:id="9025" w:author="Claude" w:date="2026-10-28T00:00:00Z"/>
-        </w:rPr>
-      </w:pPr>
-      <w:ins w:id="250" w:author="Claude" w:date="2026-10-28T00:00:00Z">
-        <w:r>
-          <w:rPr>
-            <w:b w:val="false"/>
-            <w:bCs w:val="false"/>
-          </w:rPr>
-          <w:t xml:space="preserve">[P] People's Union for Civil Liberties v. Union of India, (1997) 1 SCC 301 (18 December 1996): https://api.sci.gov.in/jonew/judis/14584.pdf</w:t>
+          <w:ins w:id="9024" w:author="Claude" w:date="2026-10-28T00:00:00Z"/>
+        </w:rPr>
+      </w:pPr>
+      <w:ins w:id="267" w:author="Claude" w:date="2026-10-28T00:00:00Z">
+        <w:r>
+          <w:rPr>
+            <w:b w:val="false"/>
+            <w:bCs w:val="false"/>
+          </w:rPr>
+          <w:t xml:space="preserve">[P] IT (Intermediary Guidelines and Digital Media Ethics Code) Rules, 2021, consolidated to 10 February 2026 (MeitY): https://www.meity.gov.in/static/uploads/2026/03/0b576f2071694b52e4cd6bb1b6dfab1e.pdf; original G.S.R. 139(E) (Telangana High Court copy): https://www.thc.nic.in/Central%20Governmental%20Rules/IT(Intermediary%20Guidelines%20and%20Digital%20Media%20Ethics%20Code)%20Rules,%202021.pdf</w:t>
         </w:r>
       </w:ins>
     </w:p>
@@ -4205,16 +4467,16 @@
         <w:spacing w:after="120" w:before="0" w:line="276"/>
         <w:jc w:val="left"/>
         <w:rPr>
-          <w:ins w:id="9026" w:author="Claude" w:date="2026-10-28T00:00:00Z"/>
-        </w:rPr>
-      </w:pPr>
-      <w:ins w:id="251" w:author="Claude" w:date="2026-10-28T00:00:00Z">
-        <w:r>
-          <w:rPr>
-            <w:b w:val="false"/>
-            <w:bCs w:val="false"/>
-          </w:rPr>
-          <w:t xml:space="preserve">[P] Justice K.S. Puttaswamy (Retd.) v. Union of India, (2017) 10 SCC 1 (24 August 2017): https://api.sci.gov.in/supremecourt/2012/35071/35071_2012_Judgement_24-Aug-2017.pdf</w:t>
+          <w:ins w:id="9025" w:author="Claude" w:date="2026-10-28T00:00:00Z"/>
+        </w:rPr>
+      </w:pPr>
+      <w:ins w:id="268" w:author="Claude" w:date="2026-10-28T00:00:00Z">
+        <w:r>
+          <w:rPr>
+            <w:b w:val="false"/>
+            <w:bCs w:val="false"/>
+          </w:rPr>
+          <w:t xml:space="preserve">[P] Telecommunications (Telecom Cyber Security) Rules, 2024, G.S.R. 720(E), and Amendment Rules, 2025, G.S.R. 771(E) (Telangana High Court copy): https://www.thc.nic.in/Central%20Governmental%20Rules/Telecommunications%20(Telecom%20Cyber%20Security)%20Rules,%202024.pdf</w:t>
         </w:r>
       </w:ins>
     </w:p>
@@ -4228,16 +4490,16 @@
         <w:spacing w:after="120" w:before="0" w:line="276"/>
         <w:jc w:val="left"/>
         <w:rPr>
-          <w:ins w:id="9027" w:author="Claude" w:date="2026-10-28T00:00:00Z"/>
-        </w:rPr>
-      </w:pPr>
-      <w:ins w:id="252" w:author="Claude" w:date="2026-10-28T00:00:00Z">
-        <w:r>
-          <w:rPr>
-            <w:b w:val="false"/>
-            <w:bCs w:val="false"/>
-          </w:rPr>
-          <w:t xml:space="preserve">[P] Vinit Kumar v. CBI, Bombay High Court, Cr. WP 2367 of 2019 (22 October 2019) (signed judgment, hosted by Columbia Global Freedom of Expression): https://globalfreedomofexpression.columbia.edu/wp-content/uploads/2019/12/Official-Judgment.pdf</w:t>
+          <w:ins w:id="9026" w:author="Claude" w:date="2026-10-28T00:00:00Z"/>
+        </w:rPr>
+      </w:pPr>
+      <w:ins w:id="269" w:author="Claude" w:date="2026-10-28T00:00:00Z">
+        <w:r>
+          <w:rPr>
+            <w:b w:val="false"/>
+            <w:bCs w:val="false"/>
+          </w:rPr>
+          <w:t xml:space="preserve">[P] PIB release on the DoT SIM-binding directions of 28 November 2025 (DoT copy): https://www.dot.gov.in/static/uploads/2025/12/4599a9925468a2648d43e3ff724e7f0c.pdf</w:t>
         </w:r>
       </w:ins>
     </w:p>
@@ -4251,16 +4513,16 @@
         <w:spacing w:after="120" w:before="0" w:line="276"/>
         <w:jc w:val="left"/>
         <w:rPr>
-          <w:ins w:id="9028" w:author="Claude" w:date="2026-10-28T00:00:00Z"/>
-        </w:rPr>
-      </w:pPr>
-      <w:ins w:id="253" w:author="Claude" w:date="2026-10-28T00:00:00Z">
-        <w:r>
-          <w:rPr>
-            <w:b w:val="false"/>
-            <w:bCs w:val="false"/>
-          </w:rPr>
-          <w:t xml:space="preserve">[P] Manohar Lal Sharma v. Union of India, W.P.(Crl.) 314 of 2021 (27 October 2021): https://api.sci.gov.in/supremecourt/2021/16884/16884_2021_1_1501_30827_Judgement_27-Oct-2021.pdf</w:t>
+          <w:ins w:id="9027" w:author="Claude" w:date="2026-10-28T00:00:00Z"/>
+        </w:rPr>
+      </w:pPr>
+      <w:ins w:id="270" w:author="Claude" w:date="2026-10-28T00:00:00Z">
+        <w:r>
+          <w:rPr>
+            <w:b w:val="false"/>
+            <w:bCs w:val="false"/>
+          </w:rPr>
+          <w:t xml:space="preserve">[P] Telecommunications (Authorisation for Provision of Principal Telecommunication Services) Rules, 2026, G.S.R. 513(E) (DoT): https://www.dot.gov.in/static/uploads/2026/06/b981573e59f32264e099912a9154dacb.pdf; Lok Sabha USQ 2902 (5 August 2026): https://sansad.in/getFile/lsapps/loksabhaquestions/annex/188/AU2902_UUpSDw.pdf</w:t>
         </w:r>
       </w:ins>
     </w:p>
@@ -4274,34 +4536,16 @@
         <w:spacing w:after="120" w:before="0" w:line="276"/>
         <w:jc w:val="left"/>
         <w:rPr>
-          <w:ins w:id="9029" w:author="Claude" w:date="2026-10-28T00:00:00Z"/>
-        </w:rPr>
-      </w:pPr>
-      <w:ins w:id="254" w:author="Claude" w:date="2026-10-28T00:00:00Z">
-        <w:r>
-          <w:rPr>
-            <w:b w:val="false"/>
-            <w:bCs w:val="false"/>
-          </w:rPr>
-          <w:t xml:space="preserve">[P] In re: Summoning Advocates, Suo Motu W.P.(Crl.) 2 of 2025 (31 October 2025) (copy hosted by LiveLaw): https://www.livelaw.in/pdf_upload/2025-livelaw-sc-1051-in-re-summoning-advocates-31-oct-2025-631600.pdf</w:t>
-        </w:r>
-      </w:ins>
-    </w:p>
-    <w:p>
-      <w:pPr>
-        <w:spacing w:after="120" w:before="240" w:line="276"/>
-        <w:jc w:val="left"/>
-        <w:rPr>
-          <w:ins w:id="9030" w:author="Claude" w:date="2026-10-28T00:00:00Z"/>
-        </w:rPr>
-      </w:pPr>
-      <w:ins w:id="255" w:author="Claude" w:date="2026-10-28T00:00:00Z">
-        <w:r>
-          <w:rPr>
-            <w:b/>
-            <w:bCs/>
-          </w:rPr>
-          <w:t xml:space="preserve">Secondary sources</w:t>
+          <w:ins w:id="9028" w:author="Claude" w:date="2026-10-28T00:00:00Z"/>
+        </w:rPr>
+      </w:pPr>
+      <w:ins w:id="271" w:author="Claude" w:date="2026-10-28T00:00:00Z">
+        <w:r>
+          <w:rPr>
+            <w:b w:val="false"/>
+            <w:bCs w:val="false"/>
+          </w:rPr>
+          <w:t xml:space="preserve">[P] Immigration and Foreigners Act, 2025 (Act 13 of 2025) (Gazette, Telangana High Court copy): https://thc.nic.in/Central%20Governmental%20Acts/Immigration%20and%20Foreigners%20Act,%202025.pdf; Immigration and Foreigners Rules, 2025, G.S.R. 596(E), and Amendment Rules, 2026, G.S.R. 424(E): https://thc.nic.in/Central%20Governmental%20Rules/Immigration%20and%20Foreigners%20Rules,%202025..pdf</w:t>
         </w:r>
       </w:ins>
     </w:p>
@@ -4315,16 +4559,34 @@
         <w:spacing w:after="120" w:before="0" w:line="276"/>
         <w:jc w:val="left"/>
         <w:rPr>
-          <w:ins w:id="9031" w:author="Claude" w:date="2026-10-28T00:00:00Z"/>
-        </w:rPr>
-      </w:pPr>
-      <w:ins w:id="256" w:author="Claude" w:date="2026-10-28T00:00:00Z">
-        <w:r>
-          <w:rPr>
-            <w:b w:val="false"/>
-            <w:bCs w:val="false"/>
-          </w:rPr>
-          <w:t xml:space="preserve">[S] Congressional Research Service, FISA Section 702 and the 2024 RISAA: https://www.congress.gov/crs-product/R48592; Brennan Center, Section 702: 2026 Resource Page: https://www.brennancenter.org/our-work/research-reports/section-702-foreign-intelligence-surveillance-act-fisa-2026-resource-page; NPR (29 April 2026): https://www.npr.org/2026/04/29/g-s1-119094/congress-fisa-702</w:t>
+          <w:ins w:id="9029" w:author="Claude" w:date="2026-10-28T00:00:00Z"/>
+        </w:rPr>
+      </w:pPr>
+      <w:ins w:id="272" w:author="Claude" w:date="2026-10-28T00:00:00Z">
+        <w:r>
+          <w:rPr>
+            <w:b w:val="false"/>
+            <w:bCs w:val="false"/>
+          </w:rPr>
+          <w:t xml:space="preserve">[P] UK Data (Use and Access) Act 2025, Schedule 7: https://www.legislation.gov.uk/ukpga/2025/18/schedule/7; S.I. 2026/82: https://www.legislation.gov.uk/uksi/2026/82/contents/made</w:t>
+        </w:r>
+      </w:ins>
+    </w:p>
+    <w:p>
+      <w:pPr>
+        <w:spacing w:after="120" w:before="240" w:line="276"/>
+        <w:jc w:val="left"/>
+        <w:rPr>
+          <w:ins w:id="9030" w:author="Claude" w:date="2026-10-28T00:00:00Z"/>
+        </w:rPr>
+      </w:pPr>
+      <w:ins w:id="273" w:author="Claude" w:date="2026-10-28T00:00:00Z">
+        <w:r>
+          <w:rPr>
+            <w:b/>
+            <w:bCs/>
+          </w:rPr>
+          <w:t xml:space="preserve">Primary sources: judgments</w:t>
         </w:r>
       </w:ins>
     </w:p>
@@ -4338,16 +4600,16 @@
         <w:spacing w:after="120" w:before="0" w:line="276"/>
         <w:jc w:val="left"/>
         <w:rPr>
-          <w:ins w:id="9032" w:author="Claude" w:date="2026-10-28T00:00:00Z"/>
-        </w:rPr>
-      </w:pPr>
-      <w:ins w:id="257" w:author="Claude" w:date="2026-10-28T00:00:00Z">
-        <w:r>
-          <w:rPr>
-            <w:b w:val="false"/>
-            <w:bCs w:val="false"/>
-          </w:rPr>
-          <w:t xml:space="preserve">[S] LegitQuest, IT Interception Amendment Rules 2024: https://www.legitquest.com/act/information-technology-procedure-and-safeguards-for-interception-monitoring-and-decryption-of-information-amendment-rules-2024/f72d; Medianama (February 2024): https://www.medianama.com/2024/02/223-meity-it-rules-interception-record-2/</w:t>
+          <w:ins w:id="9031" w:author="Claude" w:date="2026-10-28T00:00:00Z"/>
+        </w:rPr>
+      </w:pPr>
+      <w:ins w:id="274" w:author="Claude" w:date="2026-10-28T00:00:00Z">
+        <w:r>
+          <w:rPr>
+            <w:b w:val="false"/>
+            <w:bCs w:val="false"/>
+          </w:rPr>
+          <w:t xml:space="preserve">[P] People's Union for Civil Liberties v. Union of India, (1997) 1 SCC 301 (18 December 1996): https://api.sci.gov.in/jonew/judis/14584.pdf</w:t>
         </w:r>
       </w:ins>
     </w:p>
@@ -4361,16 +4623,16 @@
         <w:spacing w:after="120" w:before="0" w:line="276"/>
         <w:jc w:val="left"/>
         <w:rPr>
-          <w:ins w:id="9033" w:author="Claude" w:date="2026-10-28T00:00:00Z"/>
-        </w:rPr>
-      </w:pPr>
-      <w:ins w:id="258" w:author="Claude" w:date="2026-10-28T00:00:00Z">
-        <w:r>
-          <w:rPr>
-            <w:b w:val="false"/>
-            <w:bCs w:val="false"/>
-          </w:rPr>
-          <w:t xml:space="preserve">[S] Nishith Desai Associates, Clarification to the Indian Data Protection Laws (26 August 2011): https://www.nishithdesai.com/research-and-articles/hotline/technology-law-analysis/clarification-to-the-indian-data-protection-laws-5023</w:t>
+          <w:ins w:id="9032" w:author="Claude" w:date="2026-10-28T00:00:00Z"/>
+        </w:rPr>
+      </w:pPr>
+      <w:ins w:id="275" w:author="Claude" w:date="2026-10-28T00:00:00Z">
+        <w:r>
+          <w:rPr>
+            <w:b w:val="false"/>
+            <w:bCs w:val="false"/>
+          </w:rPr>
+          <w:t xml:space="preserve">[P] Justice K.S. Puttaswamy (Retd.) v. Union of India, (2017) 10 SCC 1 (24 August 2017): https://api.sci.gov.in/supremecourt/2012/35071/35071_2012_Judgement_24-Aug-2017.pdf</w:t>
         </w:r>
       </w:ins>
     </w:p>
@@ -4384,16 +4646,16 @@
         <w:spacing w:after="120" w:before="0" w:line="276"/>
         <w:jc w:val="left"/>
         <w:rPr>
-          <w:ins w:id="9034" w:author="Claude" w:date="2026-10-28T00:00:00Z"/>
-        </w:rPr>
-      </w:pPr>
-      <w:ins w:id="259" w:author="Claude" w:date="2026-10-28T00:00:00Z">
-        <w:r>
-          <w:rPr>
-            <w:b w:val="false"/>
-            <w:bCs w:val="false"/>
-          </w:rPr>
-          <w:t xml:space="preserve">[S] SCC Online, partial enforcement of the Telecommunications Act (24 June 2024): https://www.scconline.com/blog/post/2024/06/24/enforcement-date-for-partial-enforcement-of-the-telecommunications-act-2023-notified-legal-news/; AZB &amp; Partners, notification of sections 3(1) and 3(6) (27 July 2026): https://www.azbpartners.com/bank/sc-holds-that-courts-must-pierce-clever-drafting-and-summarily-reject-plaints-seeking-to-enforce-illegal-arrangements-such-as-benami-transactions-9/</w:t>
+          <w:ins w:id="9033" w:author="Claude" w:date="2026-10-28T00:00:00Z"/>
+        </w:rPr>
+      </w:pPr>
+      <w:ins w:id="276" w:author="Claude" w:date="2026-10-28T00:00:00Z">
+        <w:r>
+          <w:rPr>
+            <w:b w:val="false"/>
+            <w:bCs w:val="false"/>
+          </w:rPr>
+          <w:t xml:space="preserve">[P] Vinit Kumar v. CBI, Bombay High Court, Cr. WP 2367 of 2019 (22 October 2019) (signed judgment, hosted by Columbia Global Freedom of Expression): https://globalfreedomofexpression.columbia.edu/wp-content/uploads/2019/12/Official-Judgment.pdf</w:t>
         </w:r>
       </w:ins>
     </w:p>
@@ -4407,16 +4669,16 @@
         <w:spacing w:after="120" w:before="0" w:line="276"/>
         <w:jc w:val="left"/>
         <w:rPr>
-          <w:ins w:id="9035" w:author="Claude" w:date="2026-10-28T00:00:00Z"/>
-        </w:rPr>
-      </w:pPr>
-      <w:ins w:id="260" w:author="Claude" w:date="2026-10-28T00:00:00Z">
-        <w:r>
-          <w:rPr>
-            <w:b w:val="false"/>
-            <w:bCs w:val="false"/>
-          </w:rPr>
-          <w:t xml:space="preserve">[S] LegitQuest, Telecommunications Interception Rules 2024: https://legitquest.com/act/telecommunications-procedures-and-safeguards-for-lawful-interception-of-messages-rules-2024/1068D</w:t>
+          <w:ins w:id="9034" w:author="Claude" w:date="2026-10-28T00:00:00Z"/>
+        </w:rPr>
+      </w:pPr>
+      <w:ins w:id="277" w:author="Claude" w:date="2026-10-28T00:00:00Z">
+        <w:r>
+          <w:rPr>
+            <w:b w:val="false"/>
+            <w:bCs w:val="false"/>
+          </w:rPr>
+          <w:t xml:space="preserve">[P] Manohar Lal Sharma v. Union of India, W.P.(Crl.) 314 of 2021 (27 October 2021): https://api.sci.gov.in/supremecourt/2021/16884/16884_2021_1_1501_30827_Judgement_27-Oct-2021.pdf</w:t>
         </w:r>
       </w:ins>
     </w:p>
@@ -4430,16 +4692,16 @@
         <w:spacing w:after="120" w:before="0" w:line="276"/>
         <w:jc w:val="left"/>
         <w:rPr>
-          <w:ins w:id="9036" w:author="Claude" w:date="2026-10-28T00:00:00Z"/>
-        </w:rPr>
-      </w:pPr>
-      <w:ins w:id="261" w:author="Claude" w:date="2026-10-28T00:00:00Z">
-        <w:r>
-          <w:rPr>
-            <w:b w:val="false"/>
-            <w:bCs w:val="false"/>
-          </w:rPr>
-          <w:t xml:space="preserve">[S] Taxmann, India's DPDP Act and Rules 2025: https://www.taxmann.com/post/blog/analysis-indias-dpdp-act-and-rules; Business Standard (22 January 2026): https://www.business-standard.com/technology/tech-news/meity-may-cut-compliance-timeline-for-key-dpdp-rules-to-12-months-126012201293_1.html</w:t>
+          <w:ins w:id="9035" w:author="Claude" w:date="2026-10-28T00:00:00Z"/>
+        </w:rPr>
+      </w:pPr>
+      <w:ins w:id="278" w:author="Claude" w:date="2026-10-28T00:00:00Z">
+        <w:r>
+          <w:rPr>
+            <w:b w:val="false"/>
+            <w:bCs w:val="false"/>
+          </w:rPr>
+          <w:t xml:space="preserve">[P] In re: Summoning Advocates, Suo Motu W.P.(Crl.) 2 of 2025 (31 October 2025) (copy hosted by LiveLaw): https://www.livelaw.in/pdf_upload/2025-livelaw-sc-1051-in-re-summoning-advocates-31-oct-2025-631600.pdf</w:t>
         </w:r>
       </w:ins>
     </w:p>
@@ -4453,16 +4715,16 @@
         <w:spacing w:after="120" w:before="0" w:line="276"/>
         <w:jc w:val="left"/>
         <w:rPr>
-          <w:ins w:id="9037" w:author="Claude" w:date="2026-10-28T00:00:00Z"/>
-        </w:rPr>
-      </w:pPr>
-      <w:ins w:id="262" w:author="Claude" w:date="2026-10-28T00:00:00Z">
-        <w:r>
-          <w:rPr>
-            <w:b w:val="false"/>
-            <w:bCs w:val="false"/>
-          </w:rPr>
-          <w:t xml:space="preserve">[S] SFLC.in, legal challenge to CMS, NATGRID and NETRA: https://sflc.in/legal-challenge-cpil-and-sflcin-surveillance-projects-cms-natgrid-and-netra/; Outlook/PTI (October 2023): https://www.outlookindia.com/national/sc-seeks-centre-s-stand-on-plea-for-transfer-of-pil-against-netra-natgrid-surveillance-systems-news-326396</w:t>
+          <w:ins w:id="9036" w:author="Claude" w:date="2026-10-28T00:00:00Z"/>
+        </w:rPr>
+      </w:pPr>
+      <w:ins w:id="279" w:author="Claude" w:date="2026-10-28T00:00:00Z">
+        <w:r>
+          <w:rPr>
+            <w:b w:val="false"/>
+            <w:bCs w:val="false"/>
+          </w:rPr>
+          <w:t xml:space="preserve">[P] P. Kishore v. Secretary to Government of India, Madras HC, W.P. 143 of 2018 (2 July 2025): https://images.assettype.com/barandbench/2025-07-02/p0h6ap6z/P__Kishore_v__The_Secretary_to_Government.pdf</w:t>
         </w:r>
       </w:ins>
     </w:p>
@@ -4476,16 +4738,16 @@
         <w:spacing w:after="120" w:before="0" w:line="276"/>
         <w:jc w:val="left"/>
         <w:rPr>
-          <w:ins w:id="9038" w:author="Claude" w:date="2026-10-28T00:00:00Z"/>
-        </w:rPr>
-      </w:pPr>
-      <w:ins w:id="263" w:author="Claude" w:date="2026-10-28T00:00:00Z">
-        <w:r>
-          <w:rPr>
-            <w:b w:val="false"/>
-            <w:bCs w:val="false"/>
-          </w:rPr>
-          <w:t xml:space="preserve">[S] Bar &amp; Bench, MHA surveillance order challenged: https://www.barandbench.com/news/ministry-of-home-affairs-surveillance-order-challenged-in-supreme-court; Tribune India: https://www.tribuneindia.com/news/archive/nation/sc-to-hear-as-and-when-required-pil-against-computer-interception-708078</w:t>
+          <w:ins w:id="9037" w:author="Claude" w:date="2026-10-28T00:00:00Z"/>
+        </w:rPr>
+      </w:pPr>
+      <w:ins w:id="280" w:author="Claude" w:date="2026-10-28T00:00:00Z">
+        <w:r>
+          <w:rPr>
+            <w:b w:val="false"/>
+            <w:bCs w:val="false"/>
+          </w:rPr>
+          <w:t xml:space="preserve">[P] Aakash Deep Chouhan v. CBI, Delhi HC, CRL.M.C. 204 of 2020 (26 June 2025): https://lawchakra.in/wp-content/uploads/2025/07/LawChakra-AAKASH-DEEP-CHOUHAN-versus-CBI-ANR.pdf; pronouncement list: https://delhihighcourt.nic.in/files/2025-06/announcements/jud-26062025.pdf</w:t>
         </w:r>
       </w:ins>
     </w:p>
@@ -4499,16 +4761,16 @@
         <w:spacing w:after="120" w:before="0" w:line="276"/>
         <w:jc w:val="left"/>
         <w:rPr>
-          <w:ins w:id="9039" w:author="Claude" w:date="2026-10-28T00:00:00Z"/>
-        </w:rPr>
-      </w:pPr>
-      <w:ins w:id="264" w:author="Claude" w:date="2026-10-28T00:00:00Z">
-        <w:r>
-          <w:rPr>
-            <w:b w:val="false"/>
-            <w:bCs w:val="false"/>
-          </w:rPr>
-          <w:t xml:space="preserve">[S] Human Rights Watch joint statement (26 August 2021): https://www.hrw.org/news/2021/08/26/india-spyware-use-violates-supreme-court-privacy-ruling; Business Standard (29 April 2025): https://business-standard.com/india-news/supreme-court-says-technical-report-on-pegasus-will-not-be-made-public-125042900434_1.html</w:t>
+          <w:ins w:id="9038" w:author="Claude" w:date="2026-10-28T00:00:00Z"/>
+        </w:rPr>
+      </w:pPr>
+      <w:ins w:id="281" w:author="Claude" w:date="2026-10-28T00:00:00Z">
+        <w:r>
+          <w:rPr>
+            <w:b w:val="false"/>
+            <w:bCs w:val="false"/>
+          </w:rPr>
+          <w:t xml:space="preserve">[P] Shri Ravi Shankar Ji Maharaj v. CBI, Chhattisgarh HC, CRMP 1504 of 2026 (3 August 2026): https://images.assettype.com/barandbench/2026-08-07/ogupaz45/Shri_Ravi_Shankar_Ji_Maharaj_vs_CBI_and_ors_.pdf</w:t>
         </w:r>
       </w:ins>
     </w:p>
@@ -4522,16 +4784,448 @@
         <w:spacing w:after="120" w:before="0" w:line="276"/>
         <w:jc w:val="left"/>
         <w:rPr>
+          <w:ins w:id="9039" w:author="Claude" w:date="2026-10-28T00:00:00Z"/>
+        </w:rPr>
+      </w:pPr>
+      <w:ins w:id="282" w:author="Claude" w:date="2026-10-28T00:00:00Z">
+        <w:r>
+          <w:rPr>
+            <w:b w:val="false"/>
+            <w:bCs w:val="false"/>
+          </w:rPr>
+          <w:t xml:space="preserve">[P] X Corp v. Union of India, Karnataka HC, W.P. 7405 of 2025 (24 September 2025): https://images.assettype.com/barandbench/2025-09-27/zm5a4acm/X_corp_Vs_Union_of_India.pdf</w:t>
+        </w:r>
+      </w:ins>
+    </w:p>
+    <w:p>
+      <w:pPr>
+        <w:pStyle w:val="ListParagraph"/>
+        <w:numPr>
+          <w:ilvl w:val="0"/>
+          <w:numId w:val="2"/>
+        </w:numPr>
+        <w:spacing w:after="120" w:before="0" w:line="276"/>
+        <w:jc w:val="left"/>
+        <w:rPr>
           <w:ins w:id="9040" w:author="Claude" w:date="2026-10-28T00:00:00Z"/>
         </w:rPr>
       </w:pPr>
-      <w:ins w:id="265" w:author="Claude" w:date="2026-10-28T00:00:00Z">
+      <w:ins w:id="283" w:author="Claude" w:date="2026-10-28T00:00:00Z">
+        <w:r>
+          <w:rPr>
+            <w:b w:val="false"/>
+            <w:bCs w:val="false"/>
+          </w:rPr>
+          <w:t xml:space="preserve">[P] Anuradha Bhasin v. Union of India, (2020) 3 SCC 637 (10 January 2020): https://api.sci.gov.in/supremecourt/2019/28817/28817_2019_2_1501_19350_Judgement_10-Jan-2020.pdf</w:t>
+        </w:r>
+      </w:ins>
+    </w:p>
+    <w:p>
+      <w:pPr>
+        <w:pStyle w:val="ListParagraph"/>
+        <w:numPr>
+          <w:ilvl w:val="0"/>
+          <w:numId w:val="2"/>
+        </w:numPr>
+        <w:spacing w:after="120" w:before="0" w:line="276"/>
+        <w:jc w:val="left"/>
+        <w:rPr>
+          <w:ins w:id="9041" w:author="Claude" w:date="2026-10-28T00:00:00Z"/>
+        </w:rPr>
+      </w:pPr>
+      <w:ins w:id="284" w:author="Claude" w:date="2026-10-28T00:00:00Z">
+        <w:r>
+          <w:rPr>
+            <w:b w:val="false"/>
+            <w:bCs w:val="false"/>
+          </w:rPr>
+          <w:t xml:space="preserve">[P] Future Gaming and Hotels Services Pvt. Ltd. v. Directorate of Enforcement, W.P.(Crl.) 515 of 2024, order of 13 December 2024: https://api.sci.gov.in/supremecourt/2024/57510/57510_2024_5_86_58074_Order_13-Dec-2024.pdf</w:t>
+        </w:r>
+      </w:ins>
+    </w:p>
+    <w:p>
+      <w:pPr>
+        <w:pStyle w:val="ListParagraph"/>
+        <w:numPr>
+          <w:ilvl w:val="0"/>
+          <w:numId w:val="2"/>
+        </w:numPr>
+        <w:spacing w:after="120" w:before="0" w:line="276"/>
+        <w:jc w:val="left"/>
+        <w:rPr>
+          <w:ins w:id="9042" w:author="Claude" w:date="2026-10-28T00:00:00Z"/>
+        </w:rPr>
+      </w:pPr>
+      <w:ins w:id="285" w:author="Claude" w:date="2026-10-28T00:00:00Z">
+        <w:r>
+          <w:rPr>
+            <w:b w:val="false"/>
+            <w:bCs w:val="false"/>
+          </w:rPr>
+          <w:t xml:space="preserve">[P] Foundation for Media Professionals v. Union of India, W.P.(Crl.) 395 of 2022, order of 9 October 2023: https://main.sci.gov.in/supremecourt/2022/29892/29892_2022_2_802_47504_Order_09-Oct-2023.pdf</w:t>
+        </w:r>
+      </w:ins>
+    </w:p>
+    <w:p>
+      <w:pPr>
+        <w:pStyle w:val="ListParagraph"/>
+        <w:numPr>
+          <w:ilvl w:val="0"/>
+          <w:numId w:val="2"/>
+        </w:numPr>
+        <w:spacing w:after="120" w:before="0" w:line="276"/>
+        <w:jc w:val="left"/>
+        <w:rPr>
+          <w:ins w:id="9043" w:author="Claude" w:date="2026-10-28T00:00:00Z"/>
+        </w:rPr>
+      </w:pPr>
+      <w:ins w:id="286" w:author="Claude" w:date="2026-10-28T00:00:00Z">
+        <w:r>
+          <w:rPr>
+            <w:b w:val="false"/>
+            <w:bCs w:val="false"/>
+          </w:rPr>
+          <w:t xml:space="preserve">[P] Venkatesh Nayak v. Union of India, W.P.(C) 177 of 2026 and connected matters, record of proceedings of 16 February 2026: https://www.livelaw.in/pdf_upload/2026/02/18/776520262026-02-16-656727.pdf; writ petition: https://www.scobserver.in/wp-content/uploads/2026/02/Venkatesh-Nayak-v-Union-of-India-Writ-Petition.pdf</w:t>
+        </w:r>
+      </w:ins>
+    </w:p>
+    <w:p>
+      <w:pPr>
+        <w:pStyle w:val="ListParagraph"/>
+        <w:numPr>
+          <w:ilvl w:val="0"/>
+          <w:numId w:val="2"/>
+        </w:numPr>
+        <w:spacing w:after="120" w:before="0" w:line="276"/>
+        <w:jc w:val="left"/>
+        <w:rPr>
+          <w:ins w:id="9044" w:author="Claude" w:date="2026-10-28T00:00:00Z"/>
+        </w:rPr>
+      </w:pPr>
+      <w:ins w:id="287" w:author="Claude" w:date="2026-10-28T00:00:00Z">
+        <w:r>
+          <w:rPr>
+            <w:b w:val="false"/>
+            <w:bCs w:val="false"/>
+          </w:rPr>
+          <w:t xml:space="preserve">[P] Latombe v. Commission, T-553/23 (General Court, 3 September 2025): https://eur-lex.europa.eu/legal-content/EN/TXT/?uri=CELEX:62023TJ0553; appeal C-703/25 P: https://curia.europa.eu/juris/liste.jsf?num=C-703/25</w:t>
+        </w:r>
+      </w:ins>
+    </w:p>
+    <w:p>
+      <w:pPr>
+        <w:spacing w:after="120" w:before="240" w:line="276"/>
+        <w:jc w:val="left"/>
+        <w:rPr>
+          <w:ins w:id="9045" w:author="Claude" w:date="2026-10-28T00:00:00Z"/>
+        </w:rPr>
+      </w:pPr>
+      <w:ins w:id="288" w:author="Claude" w:date="2026-10-28T00:00:00Z">
+        <w:r>
+          <w:rPr>
+            <w:b/>
+            <w:bCs/>
+          </w:rPr>
+          <w:t xml:space="preserve">Secondary sources</w:t>
+        </w:r>
+      </w:ins>
+    </w:p>
+    <w:p>
+      <w:pPr>
+        <w:pStyle w:val="ListParagraph"/>
+        <w:numPr>
+          <w:ilvl w:val="0"/>
+          <w:numId w:val="2"/>
+        </w:numPr>
+        <w:spacing w:after="120" w:before="0" w:line="276"/>
+        <w:jc w:val="left"/>
+        <w:rPr>
+          <w:ins w:id="9046" w:author="Claude" w:date="2026-10-28T00:00:00Z"/>
+        </w:rPr>
+      </w:pPr>
+      <w:ins w:id="289" w:author="Claude" w:date="2026-10-28T00:00:00Z">
+        <w:r>
+          <w:rPr>
+            <w:b w:val="false"/>
+            <w:bCs w:val="false"/>
+          </w:rPr>
+          <w:t xml:space="preserve">[S] Congressional Research Service, FISA Section 702 and the 2024 RISAA: https://www.congress.gov/crs-product/R48592; Brennan Center, Section 702: 2026 Resource Page: https://www.brennancenter.org/our-work/research-reports/section-702-foreign-intelligence-surveillance-act-fisa-2026-resource-page; NPR (29 April 2026): https://www.npr.org/2026/04/29/g-s1-119094/congress-fisa-702</w:t>
+        </w:r>
+      </w:ins>
+    </w:p>
+    <w:p>
+      <w:pPr>
+        <w:pStyle w:val="ListParagraph"/>
+        <w:numPr>
+          <w:ilvl w:val="0"/>
+          <w:numId w:val="2"/>
+        </w:numPr>
+        <w:spacing w:after="120" w:before="0" w:line="276"/>
+        <w:jc w:val="left"/>
+        <w:rPr>
+          <w:ins w:id="9047" w:author="Claude" w:date="2026-10-28T00:00:00Z"/>
+        </w:rPr>
+      </w:pPr>
+      <w:ins w:id="290" w:author="Claude" w:date="2026-10-28T00:00:00Z">
+        <w:r>
+          <w:rPr>
+            <w:b w:val="false"/>
+            <w:bCs w:val="false"/>
+          </w:rPr>
+          <w:t xml:space="preserve">[S] LegitQuest, IT Interception Amendment Rules 2024: https://www.legitquest.com/act/information-technology-procedure-and-safeguards-for-interception-monitoring-and-decryption-of-information-amendment-rules-2024/f72d; Medianama (February 2024): https://www.medianama.com/2024/02/223-meity-it-rules-interception-record-2/</w:t>
+        </w:r>
+      </w:ins>
+    </w:p>
+    <w:p>
+      <w:pPr>
+        <w:pStyle w:val="ListParagraph"/>
+        <w:numPr>
+          <w:ilvl w:val="0"/>
+          <w:numId w:val="2"/>
+        </w:numPr>
+        <w:spacing w:after="120" w:before="0" w:line="276"/>
+        <w:jc w:val="left"/>
+        <w:rPr>
+          <w:ins w:id="9048" w:author="Claude" w:date="2026-10-28T00:00:00Z"/>
+        </w:rPr>
+      </w:pPr>
+      <w:ins w:id="291" w:author="Claude" w:date="2026-10-28T00:00:00Z">
+        <w:r>
+          <w:rPr>
+            <w:b w:val="false"/>
+            <w:bCs w:val="false"/>
+          </w:rPr>
+          <w:t xml:space="preserve">[S] Nishith Desai Associates, Clarification to the Indian Data Protection Laws (26 August 2011): https://www.nishithdesai.com/research-and-articles/hotline/technology-law-analysis/clarification-to-the-indian-data-protection-laws-5023</w:t>
+        </w:r>
+      </w:ins>
+    </w:p>
+    <w:p>
+      <w:pPr>
+        <w:pStyle w:val="ListParagraph"/>
+        <w:numPr>
+          <w:ilvl w:val="0"/>
+          <w:numId w:val="2"/>
+        </w:numPr>
+        <w:spacing w:after="120" w:before="0" w:line="276"/>
+        <w:jc w:val="left"/>
+        <w:rPr>
+          <w:ins w:id="9049" w:author="Claude" w:date="2026-10-28T00:00:00Z"/>
+        </w:rPr>
+      </w:pPr>
+      <w:ins w:id="292" w:author="Claude" w:date="2026-10-28T00:00:00Z">
+        <w:r>
+          <w:rPr>
+            <w:b w:val="false"/>
+            <w:bCs w:val="false"/>
+          </w:rPr>
+          <w:t xml:space="preserve">[S] SCC Online, partial enforcement of the Telecommunications Act (24 June 2024): https://www.scconline.com/blog/post/2024/06/24/enforcement-date-for-partial-enforcement-of-the-telecommunications-act-2023-notified-legal-news/; AZB &amp; Partners, notification of sections 3(1) and 3(6) (27 July 2026): https://www.azbpartners.com/bank/sc-holds-that-courts-must-pierce-clever-drafting-and-summarily-reject-plaints-seeking-to-enforce-illegal-arrangements-such-as-benami-transactions-9/</w:t>
+        </w:r>
+      </w:ins>
+    </w:p>
+    <w:p>
+      <w:pPr>
+        <w:pStyle w:val="ListParagraph"/>
+        <w:numPr>
+          <w:ilvl w:val="0"/>
+          <w:numId w:val="2"/>
+        </w:numPr>
+        <w:spacing w:after="120" w:before="0" w:line="276"/>
+        <w:jc w:val="left"/>
+        <w:rPr>
+          <w:ins w:id="9050" w:author="Claude" w:date="2026-10-28T00:00:00Z"/>
+        </w:rPr>
+      </w:pPr>
+      <w:ins w:id="293" w:author="Claude" w:date="2026-10-28T00:00:00Z">
+        <w:r>
+          <w:rPr>
+            <w:b w:val="false"/>
+            <w:bCs w:val="false"/>
+          </w:rPr>
+          <w:t xml:space="preserve">[S] LegitQuest, Telecommunications Interception Rules 2024: https://legitquest.com/act/telecommunications-procedures-and-safeguards-for-lawful-interception-of-messages-rules-2024/1068D</w:t>
+        </w:r>
+      </w:ins>
+    </w:p>
+    <w:p>
+      <w:pPr>
+        <w:pStyle w:val="ListParagraph"/>
+        <w:numPr>
+          <w:ilvl w:val="0"/>
+          <w:numId w:val="2"/>
+        </w:numPr>
+        <w:spacing w:after="120" w:before="0" w:line="276"/>
+        <w:jc w:val="left"/>
+        <w:rPr>
+          <w:ins w:id="9051" w:author="Claude" w:date="2026-10-28T00:00:00Z"/>
+        </w:rPr>
+      </w:pPr>
+      <w:ins w:id="294" w:author="Claude" w:date="2026-10-28T00:00:00Z">
+        <w:r>
+          <w:rPr>
+            <w:b w:val="false"/>
+            <w:bCs w:val="false"/>
+          </w:rPr>
+          <w:t xml:space="preserve">[S] Taxmann, India's DPDP Act and Rules 2025: https://www.taxmann.com/post/blog/analysis-indias-dpdp-act-and-rules; Business Standard (22 January 2026): https://www.business-standard.com/technology/tech-news/meity-may-cut-compliance-timeline-for-key-dpdp-rules-to-12-months-126012201293_1.html</w:t>
+        </w:r>
+      </w:ins>
+    </w:p>
+    <w:p>
+      <w:pPr>
+        <w:pStyle w:val="ListParagraph"/>
+        <w:numPr>
+          <w:ilvl w:val="0"/>
+          <w:numId w:val="2"/>
+        </w:numPr>
+        <w:spacing w:after="120" w:before="0" w:line="276"/>
+        <w:jc w:val="left"/>
+        <w:rPr>
+          <w:ins w:id="9052" w:author="Claude" w:date="2026-10-28T00:00:00Z"/>
+        </w:rPr>
+      </w:pPr>
+      <w:ins w:id="295" w:author="Claude" w:date="2026-10-28T00:00:00Z">
+        <w:r>
+          <w:rPr>
+            <w:b w:val="false"/>
+            <w:bCs w:val="false"/>
+          </w:rPr>
+          <w:t xml:space="preserve">[S] SFLC.in, legal challenge to CMS, NATGRID and NETRA: https://sflc.in/legal-challenge-cpil-and-sflcin-surveillance-projects-cms-natgrid-and-netra/; Outlook/PTI (October 2023): https://www.outlookindia.com/national/sc-seeks-centre-s-stand-on-plea-for-transfer-of-pil-against-netra-natgrid-surveillance-systems-news-326396</w:t>
+        </w:r>
+      </w:ins>
+    </w:p>
+    <w:p>
+      <w:pPr>
+        <w:pStyle w:val="ListParagraph"/>
+        <w:numPr>
+          <w:ilvl w:val="0"/>
+          <w:numId w:val="2"/>
+        </w:numPr>
+        <w:spacing w:after="120" w:before="0" w:line="276"/>
+        <w:jc w:val="left"/>
+        <w:rPr>
+          <w:ins w:id="9053" w:author="Claude" w:date="2026-10-28T00:00:00Z"/>
+        </w:rPr>
+      </w:pPr>
+      <w:ins w:id="296" w:author="Claude" w:date="2026-10-28T00:00:00Z">
+        <w:r>
+          <w:rPr>
+            <w:b w:val="false"/>
+            <w:bCs w:val="false"/>
+          </w:rPr>
+          <w:t xml:space="preserve">[S] Bar &amp; Bench, MHA surveillance order challenged: https://www.barandbench.com/news/ministry-of-home-affairs-surveillance-order-challenged-in-supreme-court; Tribune India: https://www.tribuneindia.com/news/archive/nation/sc-to-hear-as-and-when-required-pil-against-computer-interception-708078</w:t>
+        </w:r>
+      </w:ins>
+    </w:p>
+    <w:p>
+      <w:pPr>
+        <w:pStyle w:val="ListParagraph"/>
+        <w:numPr>
+          <w:ilvl w:val="0"/>
+          <w:numId w:val="2"/>
+        </w:numPr>
+        <w:spacing w:after="120" w:before="0" w:line="276"/>
+        <w:jc w:val="left"/>
+        <w:rPr>
+          <w:ins w:id="9054" w:author="Claude" w:date="2026-10-28T00:00:00Z"/>
+        </w:rPr>
+      </w:pPr>
+      <w:ins w:id="297" w:author="Claude" w:date="2026-10-28T00:00:00Z">
+        <w:r>
+          <w:rPr>
+            <w:b w:val="false"/>
+            <w:bCs w:val="false"/>
+          </w:rPr>
+          <w:t xml:space="preserve">[S] Human Rights Watch joint statement (26 August 2021): https://www.hrw.org/news/2021/08/26/india-spyware-use-violates-supreme-court-privacy-ruling; Business Standard (29 April 2025): https://business-standard.com/india-news/supreme-court-says-technical-report-on-pegasus-will-not-be-made-public-125042900434_1.html</w:t>
+        </w:r>
+      </w:ins>
+    </w:p>
+    <w:p>
+      <w:pPr>
+        <w:pStyle w:val="ListParagraph"/>
+        <w:numPr>
+          <w:ilvl w:val="0"/>
+          <w:numId w:val="2"/>
+        </w:numPr>
+        <w:spacing w:after="120" w:before="0" w:line="276"/>
+        <w:jc w:val="left"/>
+        <w:rPr>
+          <w:ins w:id="9055" w:author="Claude" w:date="2026-10-28T00:00:00Z"/>
+        </w:rPr>
+      </w:pPr>
+      <w:ins w:id="298" w:author="Claude" w:date="2026-10-28T00:00:00Z">
         <w:r>
           <w:rPr>
             <w:b w:val="false"/>
             <w:bCs w:val="false"/>
           </w:rPr>
           <w:t xml:space="preserve">[S] SCC Online, Supreme Court fortifies advocate-client privilege (11 November 2025): https://www.scconline.com/blog/post/2025/11/11/supreme-court-fortifies-advocate-client-privilege/</w:t>
+        </w:r>
+      </w:ins>
+    </w:p>
+    <w:p>
+      <w:pPr>
+        <w:pStyle w:val="ListParagraph"/>
+        <w:numPr>
+          <w:ilvl w:val="0"/>
+          <w:numId w:val="2"/>
+        </w:numPr>
+        <w:spacing w:after="120" w:before="0" w:line="276"/>
+        <w:jc w:val="left"/>
+        <w:rPr>
+          <w:ins w:id="9056" w:author="Claude" w:date="2026-10-28T00:00:00Z"/>
+        </w:rPr>
+      </w:pPr>
+      <w:ins w:id="299" w:author="Claude" w:date="2026-10-28T00:00:00Z">
+        <w:r>
+          <w:rPr>
+            <w:b w:val="false"/>
+            <w:bCs w:val="false"/>
+          </w:rPr>
+          <w:t xml:space="preserve">[S] PTI via Outlook Business (2 April 2026), SIM-binding deadline extension: https://www.outlookbusiness.com/economy-and-policy/dot-extends-sim-binding-deadline-for-messaging-apps-to-dec-31</w:t>
+        </w:r>
+      </w:ins>
+    </w:p>
+    <w:p>
+      <w:pPr>
+        <w:pStyle w:val="ListParagraph"/>
+        <w:numPr>
+          <w:ilvl w:val="0"/>
+          <w:numId w:val="2"/>
+        </w:numPr>
+        <w:spacing w:after="120" w:before="0" w:line="276"/>
+        <w:jc w:val="left"/>
+        <w:rPr>
+          <w:ins w:id="9057" w:author="Claude" w:date="2026-10-28T00:00:00Z"/>
+        </w:rPr>
+      </w:pPr>
+      <w:ins w:id="300" w:author="Claude" w:date="2026-10-28T00:00:00Z">
+        <w:r>
+          <w:rPr>
+            <w:b w:val="false"/>
+            <w:bCs w:val="false"/>
+          </w:rPr>
+          <w:t xml:space="preserve">[S] LiveLaw, DPDP challenges: https://www.livelaw.in/top-stories/supreme-court-refers-pleas-challenging-dpdp-act-amendment-to-rti-act-to-larger-bench-523266; https://www.livelaw.in/top-stories/newsrooms-will-shutdown-digital-wings-of-legacy-media-move-supreme-court-challenging-personal-data-protection-law-556103</w:t>
+        </w:r>
+      </w:ins>
+    </w:p>
+    <w:p>
+      <w:pPr>
+        <w:pStyle w:val="ListParagraph"/>
+        <w:numPr>
+          <w:ilvl w:val="0"/>
+          <w:numId w:val="2"/>
+        </w:numPr>
+        <w:spacing w:after="120" w:before="0" w:line="276"/>
+        <w:jc w:val="left"/>
+        <w:rPr>
+          <w:ins w:id="9058" w:author="Claude" w:date="2026-10-28T00:00:00Z"/>
+        </w:rPr>
+      </w:pPr>
+      <w:ins w:id="301" w:author="Claude" w:date="2026-10-28T00:00:00Z">
+        <w:r>
+          <w:rPr>
+            <w:b w:val="false"/>
+            <w:bCs w:val="false"/>
+          </w:rPr>
+          <w:t xml:space="preserve">[S] SCC Online, Immigration and Foreigners Act in force: https://www.scconline.com/blog/post/2025/09/01/immigration-and-foreigners-act-2024-comes-into-force/; Khaitan &amp; Co on the 2026 authorisation rules: https://www.khaitanco.com/sites/default/files/2026-06/Ergo_Principal%20Telecom%20Authorisation%20Rules_26062026.pdf</w:t>
         </w:r>
       </w:ins>
     </w:p>
@@ -5441,6 +6135,511 @@
     </w:p>
   </w:comment>
   <w:comment w:id="32" w:initials="CL" w:author="Claude" w:date="2026-10-28T00:00:00.000Z">
+    <w:p>
+      <w:r>
+        <w:rPr>
+          <w:sz w:val="18"/>
+          <w:szCs w:val="18"/>
+        </w:rPr>
+        <w:t xml:space="preserve">Added (new rules not covered in the original). Verified against MeitY's consolidated text of the Intermediary Rules (updated to 10 February 2026): rule 3(1)(j) (72 hours, unchanged by the 2026 amendment), rule 4(2) (traceability), rule 3(1)(d) ("three hours", substituted by G.S.R. 120(E) for "thirty-six hours"). Principal rules: G.S.R. 139(E), 25 February 2021. WhatsApp's challenge (Delhi HC, notice issued August 2021) is pending; no final judgment located.</w:t>
+      </w:r>
+    </w:p>
+    <w:p>
+      <w:r>
+        <w:rPr>
+          <w:sz w:val="18"/>
+          <w:szCs w:val="18"/>
+        </w:rPr>
+        <w:t xml:space="preserve">[P] MeitY consolidated rules (updated 10.02.2026): https://www.meity.gov.in/static/uploads/2026/03/0b576f2071694b52e4cd6bb1b6dfab1e.pdf</w:t>
+      </w:r>
+    </w:p>
+    <w:p>
+      <w:r>
+        <w:rPr>
+          <w:sz w:val="18"/>
+          <w:szCs w:val="18"/>
+        </w:rPr>
+        <w:t xml:space="preserve">[P] MeitY FAQs on the 2026 amendment: https://www.meity.gov.in/static/uploads/2025/10/065b6deb585441b5ccdf8be42502a49c.pdf</w:t>
+      </w:r>
+    </w:p>
+    <w:p>
+      <w:r>
+        <w:rPr>
+          <w:sz w:val="18"/>
+          <w:szCs w:val="18"/>
+        </w:rPr>
+        <w:t xml:space="preserve">[P] Original 2021 Gazette text (Telangana High Court copy): https://www.thc.nic.in/Central%20Governmental%20Rules/IT(Intermediary%20Guidelines%20and%20Digital%20Media%20Ethics%20Code)%20Rules,%202021.pdf</w:t>
+      </w:r>
+    </w:p>
+    <w:p>
+      <w:r>
+        <w:rPr>
+          <w:sz w:val="18"/>
+          <w:szCs w:val="18"/>
+        </w:rPr>
+        <w:t xml:space="preserve">[S] LiveLaw (WhatsApp challenge): https://www.livelaw.in/top-stories/delhi-high-court-notice-centre-whatsapps-plea-challenging-traceability-clause-under-it-rules-2021-180387</w:t>
+      </w:r>
+    </w:p>
+  </w:comment>
+  <w:comment w:id="33" w:initials="CL" w:author="Claude" w:date="2026-10-28T00:00:00.000Z">
+    <w:p>
+      <w:r>
+        <w:rPr>
+          <w:sz w:val="18"/>
+          <w:szCs w:val="18"/>
+        </w:rPr>
+        <w:t xml:space="preserve">Added. Verified against the Gazette text: G.S.R. 720(E) dated 21 November 2024, rule 3(1)–(3).</w:t>
+      </w:r>
+    </w:p>
+    <w:p>
+      <w:r>
+        <w:rPr>
+          <w:sz w:val="18"/>
+          <w:szCs w:val="18"/>
+        </w:rPr>
+        <w:t xml:space="preserve">[P] Gazette (Telangana High Court copy, which also contains the 2025 amendment): https://www.thc.nic.in/Central%20Governmental%20Rules/Telecommunications%20(Telecom%20Cyber%20Security)%20Rules,%202024.pdf</w:t>
+      </w:r>
+    </w:p>
+  </w:comment>
+  <w:comment w:id="34" w:initials="CL" w:author="Claude" w:date="2026-10-28T00:00:00.000Z">
+    <w:p>
+      <w:r>
+        <w:rPr>
+          <w:sz w:val="18"/>
+          <w:szCs w:val="18"/>
+        </w:rPr>
+        <w:t xml:space="preserve">Added. Verified against the Gazette text: G.S.R. 771(E) dated 22 October 2025 (definition of TIUE in rule 2(1)(i); new rule 3(1)(aa); substituted rule 5(6); new rule 7A, the MNV platform).</w:t>
+      </w:r>
+    </w:p>
+    <w:p>
+      <w:r>
+        <w:rPr>
+          <w:sz w:val="18"/>
+          <w:szCs w:val="18"/>
+        </w:rPr>
+        <w:t xml:space="preserve">SIM-binding directions of 28 November 2025: verified from the PIB release of 1 December 2025 (copy hosted by DoT).</w:t>
+      </w:r>
+    </w:p>
+    <w:p>
+      <w:r>
+        <w:rPr>
+          <w:sz w:val="18"/>
+          <w:szCs w:val="18"/>
+        </w:rPr>
+        <w:t xml:space="preserve">PLEASE NOTE: the extension to 31 December 2026 is reported by PTI from official sources, but no published DoT order was located.</w:t>
+      </w:r>
+    </w:p>
+    <w:p>
+      <w:r>
+        <w:rPr>
+          <w:sz w:val="18"/>
+          <w:szCs w:val="18"/>
+        </w:rPr>
+        <w:t xml:space="preserve">[P] Gazette (Telangana High Court copy): https://www.thc.nic.in/Central%20Governmental%20Rules/Telecommunications%20(Telecom%20Cyber%20Security)%20Rules,%202024.pdf</w:t>
+      </w:r>
+    </w:p>
+    <w:p>
+      <w:r>
+        <w:rPr>
+          <w:sz w:val="18"/>
+          <w:szCs w:val="18"/>
+        </w:rPr>
+        <w:t xml:space="preserve">[P] PIB release (DoT copy): https://www.dot.gov.in/static/uploads/2025/12/4599a9925468a2648d43e3ff724e7f0c.pdf ; PIB: https://www.pib.gov.in/PressReleasePage.aspx?PRID=2197146</w:t>
+      </w:r>
+    </w:p>
+    <w:p>
+      <w:r>
+        <w:rPr>
+          <w:sz w:val="18"/>
+          <w:szCs w:val="18"/>
+        </w:rPr>
+        <w:t xml:space="preserve">[S] Outlook Business/PTI (2 April 2026), extension: https://www.outlookbusiness.com/economy-and-policy/dot-extends-sim-binding-deadline-for-messaging-apps-to-dec-31</w:t>
+      </w:r>
+    </w:p>
+  </w:comment>
+  <w:comment w:id="35" w:initials="CL" w:author="Claude" w:date="2026-10-28T00:00:00.000Z">
+    <w:p>
+      <w:r>
+        <w:rPr>
+          <w:sz w:val="18"/>
+          <w:szCs w:val="18"/>
+        </w:rPr>
+        <w:t xml:space="preserve">Added. Verified against DoT's Gazette copy of G.S.R. 513(E) dated 23 June 2026: rules 33(1), 33(3), 37(1), 44, 45(2) and 47(2). The notification date is confirmed by the Lok Sabha answer of 5 August 2026.</w:t>
+      </w:r>
+    </w:p>
+    <w:p>
+      <w:r>
+        <w:rPr>
+          <w:sz w:val="18"/>
+          <w:szCs w:val="18"/>
+        </w:rPr>
+        <w:t xml:space="preserve">[P] DoT Gazette copy: https://www.dot.gov.in/static/uploads/2026/06/b981573e59f32264e099912a9154dacb.pdf</w:t>
+      </w:r>
+    </w:p>
+    <w:p>
+      <w:r>
+        <w:rPr>
+          <w:sz w:val="18"/>
+          <w:szCs w:val="18"/>
+        </w:rPr>
+        <w:t xml:space="preserve">[P] Lok Sabha Unstarred Question No. 2902 (5 August 2026): https://sansad.in/getFile/lsapps/loksabhaquestions/annex/188/AU2902_UUpSDw.pdf</w:t>
+      </w:r>
+    </w:p>
+    <w:p>
+      <w:r>
+        <w:rPr>
+          <w:sz w:val="18"/>
+          <w:szCs w:val="18"/>
+        </w:rPr>
+        <w:t xml:space="preserve">[S] Khaitan &amp; Co (26 June 2026): https://www.khaitanco.com/sites/default/files/2026-06/Ergo_Principal%20Telecom%20Authorisation%20Rules_26062026.pdf</w:t>
+      </w:r>
+    </w:p>
+  </w:comment>
+  <w:comment w:id="36" w:initials="CL" w:author="Claude" w:date="2026-10-28T00:00:00.000Z">
+    <w:p>
+      <w:r>
+        <w:rPr>
+          <w:sz w:val="18"/>
+          <w:szCs w:val="18"/>
+        </w:rPr>
+        <w:t xml:space="preserve">Added. The Supreme Court record of proceedings dated 16 February 2026 (CJI Surya Kant, Joymalya Bagchi and Vipul M. Pancholi JJ) records only "Issue notice, returnable on 23.03.2026". The larger-bench reference and refusal of a stay come from press reports, not the signed order. The provisions challenged were verified from the Venkatesh Nayak writ petition. The DNPA petition (Diary No. 45589/2026; notice issued 27 October 2026) is known from a press report only.</w:t>
+      </w:r>
+    </w:p>
+    <w:p>
+      <w:r>
+        <w:rPr>
+          <w:sz w:val="18"/>
+          <w:szCs w:val="18"/>
+        </w:rPr>
+        <w:t xml:space="preserve">[P] SC record of proceedings, 16.02.2026 (LiveLaw-hosted copy): https://www.livelaw.in/pdf_upload/2026/02/18/776520262026-02-16-656727.pdf</w:t>
+      </w:r>
+    </w:p>
+    <w:p>
+      <w:r>
+        <w:rPr>
+          <w:sz w:val="18"/>
+          <w:szCs w:val="18"/>
+        </w:rPr>
+        <w:t xml:space="preserve">[P] Venkatesh Nayak writ petition (SC Observer-hosted copy): https://www.scobserver.in/wp-content/uploads/2026/02/Venkatesh-Nayak-v-Union-of-India-Writ-Petition.pdf</w:t>
+      </w:r>
+    </w:p>
+    <w:p>
+      <w:r>
+        <w:rPr>
+          <w:sz w:val="18"/>
+          <w:szCs w:val="18"/>
+        </w:rPr>
+        <w:t xml:space="preserve">[S] LiveLaw (larger bench): https://www.livelaw.in/top-stories/supreme-court-refers-pleas-challenging-dpdp-act-amendment-to-rti-act-to-larger-bench-523266</w:t>
+      </w:r>
+    </w:p>
+    <w:p>
+      <w:r>
+        <w:rPr>
+          <w:sz w:val="18"/>
+          <w:szCs w:val="18"/>
+        </w:rPr>
+        <w:t xml:space="preserve">[S] LiveLaw (DNPA, 27.10.2026): https://www.livelaw.in/top-stories/newsrooms-will-shutdown-digital-wings-of-legacy-media-move-supreme-court-challenging-personal-data-protection-law-556103</w:t>
+      </w:r>
+    </w:p>
+  </w:comment>
+  <w:comment w:id="37" w:initials="CL" w:author="Claude" w:date="2026-10-28T00:00:00.000Z">
+    <w:p>
+      <w:r>
+        <w:rPr>
+          <w:sz w:val="18"/>
+          <w:szCs w:val="18"/>
+        </w:rPr>
+        <w:t xml:space="preserve">Added: relevant because the data importer is immigration counsel. Verified against the Gazette text of the Act (assent 4 April 2025): ss. 8, 9, 10, 17 and 36 (repeal). Rules: G.S.R. 596(E) dated 1 September 2025; amendment G.S.R. 424(E) dated 1 June 2026. The commencement notification (S.O. 3981(E), 31 August 2025, appointing 1 September 2025) is reported in secondary sources; the MHA-hosted copy was not retrievable.</w:t>
+      </w:r>
+    </w:p>
+    <w:p>
+      <w:r>
+        <w:rPr>
+          <w:sz w:val="18"/>
+          <w:szCs w:val="18"/>
+        </w:rPr>
+        <w:t xml:space="preserve">[P] Act (Gazette, Telangana High Court copy): https://thc.nic.in/Central%20Governmental%20Acts/Immigration%20and%20Foreigners%20Act,%202025.pdf</w:t>
+      </w:r>
+    </w:p>
+    <w:p>
+      <w:r>
+        <w:rPr>
+          <w:sz w:val="18"/>
+          <w:szCs w:val="18"/>
+        </w:rPr>
+        <w:t xml:space="preserve">[P] Rules and 2026 amendment (Gazette, Telangana High Court copy): https://thc.nic.in/Central%20Governmental%20Rules/Immigration%20and%20Foreigners%20Rules,%202025..pdf</w:t>
+      </w:r>
+    </w:p>
+    <w:p>
+      <w:r>
+        <w:rPr>
+          <w:sz w:val="18"/>
+          <w:szCs w:val="18"/>
+        </w:rPr>
+        <w:t xml:space="preserve">[S] SCC Online (commencement): https://www.scconline.com/blog/post/2025/09/01/immigration-and-foreigners-act-2024-comes-into-force/</w:t>
+      </w:r>
+    </w:p>
+  </w:comment>
+  <w:comment w:id="38" w:initials="CL" w:author="Claude" w:date="2026-10-28T00:00:00.000Z">
+    <w:p>
+      <w:r>
+        <w:rPr>
+          <w:sz w:val="18"/>
+          <w:szCs w:val="18"/>
+        </w:rPr>
+        <w:t xml:space="preserve">Added. Verified against the judgment (Anand Venkatesh J., delivered 02.07.2025; neutral citation 2025:MHC:1510). The order quashed was issued under s.5(2) of the Telegraph Act and rule 419A.</w:t>
+      </w:r>
+    </w:p>
+    <w:p>
+      <w:r>
+        <w:rPr>
+          <w:sz w:val="18"/>
+          <w:szCs w:val="18"/>
+        </w:rPr>
+        <w:t xml:space="preserve">[P] Judgment (Bar &amp; Bench-hosted copy): https://images.assettype.com/barandbench/2025-07-02/p0h6ap6z/P__Kishore_v__The_Secretary_to_Government.pdf</w:t>
+      </w:r>
+    </w:p>
+    <w:p>
+      <w:r>
+        <w:rPr>
+          <w:sz w:val="18"/>
+          <w:szCs w:val="18"/>
+        </w:rPr>
+        <w:t xml:space="preserve">[S] Verdictum: https://www.verdictum.in/court-updates/high-courts/madras-high-court/p-kishore-v-the-secretary-to-government-of-india-2025-mhc-1510-right-to-privacy-phone-tapping-1583376</w:t>
+      </w:r>
+    </w:p>
+  </w:comment>
+  <w:comment w:id="39" w:initials="CL" w:author="Claude" w:date="2026-10-28T00:00:00.000Z">
+    <w:p>
+      <w:r>
+        <w:rPr>
+          <w:sz w:val="18"/>
+          <w:szCs w:val="18"/>
+        </w:rPr>
+        <w:t xml:space="preserve">Added. Verified against the signed judgment (Ramesh Sinha CJ and Ravindra Kumar Agrawal J., 03.08.2026; 2026:CGHC:33468-DB). The judgment also records counsel's reliance on Jatinder Pal Singh v. CBI (Del HC, 2022), Dr. S.M. Mannan v. CBI (Kar HC, 2024) and K.L.D. Nagasree v. Government of India (AP HC, said to have been affirmed by the Supreme Court on 15.04.2025 in SLP (Crl.) 5584/2025). These were not independently verified.</w:t>
+      </w:r>
+    </w:p>
+    <w:p>
+      <w:r>
+        <w:rPr>
+          <w:sz w:val="18"/>
+          <w:szCs w:val="18"/>
+        </w:rPr>
+        <w:t xml:space="preserve">[P] Judgment (Bar &amp; Bench-hosted copy): https://images.assettype.com/barandbench/2026-08-07/ogupaz45/Shri_Ravi_Shankar_Ji_Maharaj_vs_CBI_and_ors_.pdf</w:t>
+      </w:r>
+    </w:p>
+    <w:p>
+      <w:r>
+        <w:rPr>
+          <w:sz w:val="18"/>
+          <w:szCs w:val="18"/>
+        </w:rPr>
+        <w:t xml:space="preserve">[S] Verdictum: https://www.verdictum.in/chhattisgarh-high-court/shri-ravi-shankar-ji-maharaj-v-central-bureau-of-investigation-2026cghc33468-d-phone-tapping-home-ministry-nor-review-committee-1619442</w:t>
+      </w:r>
+    </w:p>
+  </w:comment>
+  <w:comment w:id="40" w:initials="CL" w:author="Claude" w:date="2026-10-28T00:00:00.000Z">
+    <w:p>
+      <w:r>
+        <w:rPr>
+          <w:sz w:val="18"/>
+          <w:szCs w:val="18"/>
+        </w:rPr>
+        <w:t xml:space="preserve">Added (weighs against the "practically limited" factor). Verified against the judgment (Amit Mahajan J., delivered 26.06.2025; 2025:DHC:5019), paras 28 and 39; petition dismissed (para 55).</w:t>
+      </w:r>
+    </w:p>
+    <w:p>
+      <w:r>
+        <w:rPr>
+          <w:sz w:val="18"/>
+          <w:szCs w:val="18"/>
+        </w:rPr>
+        <w:t xml:space="preserve">[P] Delhi High Court pronouncement list, 26.06.2025: https://delhihighcourt.nic.in/files/2025-06/announcements/jud-26062025.pdf</w:t>
+      </w:r>
+    </w:p>
+    <w:p>
+      <w:r>
+        <w:rPr>
+          <w:sz w:val="18"/>
+          <w:szCs w:val="18"/>
+        </w:rPr>
+        <w:t xml:space="preserve">[P] Judgment (court-signed copy hosted by LawChakra): https://lawchakra.in/wp-content/uploads/2025/07/LawChakra-AAKASH-DEEP-CHOUHAN-versus-CBI-ANR.pdf</w:t>
+      </w:r>
+    </w:p>
+    <w:p>
+      <w:r>
+        <w:rPr>
+          <w:sz w:val="18"/>
+          <w:szCs w:val="18"/>
+        </w:rPr>
+        <w:t xml:space="preserve">[S] Verdictum: https://www.verdictum.in/court-updates/high-courts/delhi-high-court/aakash-deep-chouhan-v-cbi-2025-dhc-5019-phone-call-interceptions-corruption-case-1584021</w:t>
+      </w:r>
+    </w:p>
+  </w:comment>
+  <w:comment w:id="41" w:initials="CL" w:author="Claude" w:date="2026-10-28T00:00:00.000Z">
+    <w:p>
+      <w:r>
+        <w:rPr>
+          <w:sz w:val="18"/>
+          <w:szCs w:val="18"/>
+        </w:rPr>
+        <w:t xml:space="preserve">Added. Verified against the SC records of proceedings: Future Gaming (Oka and Mithal JJ, 13.12.2024; ad-interim relief in terms of prayers (i) and (ii)); Foundation for Media Professionals (W.P.(Crl.) 395/2022, order of 09.10.2023). No final decision located in either matter.</w:t>
+      </w:r>
+    </w:p>
+    <w:p>
+      <w:r>
+        <w:rPr>
+          <w:sz w:val="18"/>
+          <w:szCs w:val="18"/>
+        </w:rPr>
+        <w:t xml:space="preserve">[P] Future Gaming order, 13.12.2024: https://api.sci.gov.in/supremecourt/2024/57510/57510_2024_5_86_58074_Order_13-Dec-2024.pdf</w:t>
+      </w:r>
+    </w:p>
+    <w:p>
+      <w:r>
+        <w:rPr>
+          <w:sz w:val="18"/>
+          <w:szCs w:val="18"/>
+        </w:rPr>
+        <w:t xml:space="preserve">[P] FMP order, 09.10.2023: https://main.sci.gov.in/supremecourt/2022/29892/29892_2022_2_802_47504_Order_09-Oct-2023.pdf</w:t>
+      </w:r>
+    </w:p>
+    <w:p>
+      <w:r>
+        <w:rPr>
+          <w:sz w:val="18"/>
+          <w:szCs w:val="18"/>
+        </w:rPr>
+        <w:t xml:space="preserve">[P] FMP writ petition (SC Observer-hosted copy): https://www.scobserver.in/wp-content/uploads/2023/11/Petition-filed-by-Foundation-for-Media-Professionals.pdf</w:t>
+      </w:r>
+    </w:p>
+    <w:p>
+      <w:r>
+        <w:rPr>
+          <w:sz w:val="18"/>
+          <w:szCs w:val="18"/>
+        </w:rPr>
+        <w:t xml:space="preserve">[S] SC Observer case page: https://www.scobserver.in/cases/guidelines-for-search-and-seizure-of-digital-devices-foundation-for-media-professionals-v-union-of-india/</w:t>
+      </w:r>
+    </w:p>
+  </w:comment>
+  <w:comment w:id="42" w:initials="CL" w:author="Claude" w:date="2026-10-28T00:00:00.000Z">
+    <w:p>
+      <w:r>
+        <w:rPr>
+          <w:sz w:val="18"/>
+          <w:szCs w:val="18"/>
+        </w:rPr>
+        <w:t xml:space="preserve">Added: qualifies "regardless of their citizenship". Verified against the judgment (M. Nagaprasanna J., pronounced 24.09.2025), para 17.2 ("citizen centric and not person centric"). Appeal: announced by X Corp; status not verified.</w:t>
+      </w:r>
+    </w:p>
+    <w:p>
+      <w:r>
+        <w:rPr>
+          <w:sz w:val="18"/>
+          <w:szCs w:val="18"/>
+        </w:rPr>
+        <w:t xml:space="preserve">[P] Judgment (Bar &amp; Bench-hosted copy): https://images.assettype.com/barandbench/2025-09-27/zm5a4acm/X_corp_Vs_Union_of_India.pdf</w:t>
+      </w:r>
+    </w:p>
+    <w:p>
+      <w:r>
+        <w:rPr>
+          <w:sz w:val="18"/>
+          <w:szCs w:val="18"/>
+        </w:rPr>
+        <w:t xml:space="preserve">[S] LiveLaw: https://www.livelaw.in/high-court/karnataka-high-court/x-corp-karnataka-high-court-article-19-indian-laws-regulating-social-media-305375</w:t>
+      </w:r>
+    </w:p>
+  </w:comment>
+  <w:comment w:id="43" w:initials="CL" w:author="Claude" w:date="2026-10-28T00:00:00.000Z">
+    <w:p>
+      <w:r>
+        <w:rPr>
+          <w:sz w:val="18"/>
+          <w:szCs w:val="18"/>
+        </w:rPr>
+        <w:t xml:space="preserve">Added. Anuradha Bhasin v. Union of India, W.P.(C) 1031 of 2019, decided 10 January 2020; (2020) 3 SCC 637.</w:t>
+      </w:r>
+    </w:p>
+    <w:p>
+      <w:r>
+        <w:rPr>
+          <w:sz w:val="18"/>
+          <w:szCs w:val="18"/>
+        </w:rPr>
+        <w:t xml:space="preserve">[P] Judgment: https://api.sci.gov.in/supremecourt/2019/28817/28817_2019_2_1501_19350_Judgement_10-Jan-2020.pdf</w:t>
+      </w:r>
+    </w:p>
+  </w:comment>
+  <w:comment w:id="44" w:initials="CL" w:author="Claude" w:date="2026-10-28T00:00:00.000Z">
+    <w:p>
+      <w:r>
+        <w:rPr>
+          <w:sz w:val="18"/>
+          <w:szCs w:val="18"/>
+        </w:rPr>
+        <w:t xml:space="preserve">Added for completeness (US onward transfers only). General Court judgment of 3 September 2025 in T-553/23 (action dismissed), published in OJ C/2025/5446. Appeal C-703/25 P lodged 31 October 2025. The EUR-Lex and CURIA pages could not be retrieved automatically during verification; please check them directly.</w:t>
+      </w:r>
+    </w:p>
+    <w:p>
+      <w:r>
+        <w:rPr>
+          <w:sz w:val="18"/>
+          <w:szCs w:val="18"/>
+        </w:rPr>
+        <w:t xml:space="preserve">[P] EUR-Lex (CELEX 62023TJ0553): https://eur-lex.europa.eu/legal-content/EN/TXT/?uri=CELEX:62023TJ0553</w:t>
+      </w:r>
+    </w:p>
+    <w:p>
+      <w:r>
+        <w:rPr>
+          <w:sz w:val="18"/>
+          <w:szCs w:val="18"/>
+        </w:rPr>
+        <w:t xml:space="preserve">[P] CURIA case search: https://curia.europa.eu/juris/liste.jsf?num=C-703/25</w:t>
+      </w:r>
+    </w:p>
+    <w:p>
+      <w:r>
+        <w:rPr>
+          <w:sz w:val="18"/>
+          <w:szCs w:val="18"/>
+        </w:rPr>
+        <w:t xml:space="preserve">[S] WilmerHale (1 December 2025): https://www.wilmerhale.com/en/insights/blogs/wilmerhale-privacy-and-cybersecurity-law/20251201-european-court-of-justice-to-review-challenge-to-eu-us-data-privacy-framework</w:t>
+      </w:r>
+    </w:p>
+  </w:comment>
+  <w:comment w:id="45" w:initials="CL" w:author="Claude" w:date="2026-10-28T00:00:00.000Z">
+    <w:p>
+      <w:r>
+        <w:rPr>
+          <w:sz w:val="18"/>
+          <w:szCs w:val="18"/>
+        </w:rPr>
+        <w:t xml:space="preserve">Added: the original refers to UK law. Verified: Data (Use and Access) Act 2025, Schedule 7 (transfers; "not materially lower" test). Commencement on 5 February 2026 by S.I. 2026/82, reg. 2.</w:t>
+      </w:r>
+    </w:p>
+    <w:p>
+      <w:r>
+        <w:rPr>
+          <w:sz w:val="18"/>
+          <w:szCs w:val="18"/>
+        </w:rPr>
+        <w:t xml:space="preserve">[P] Data (Use and Access) Act 2025, Schedule 7: https://www.legislation.gov.uk/ukpga/2025/18/schedule/7</w:t>
+      </w:r>
+    </w:p>
+    <w:p>
+      <w:r>
+        <w:rPr>
+          <w:sz w:val="18"/>
+          <w:szCs w:val="18"/>
+        </w:rPr>
+        <w:t xml:space="preserve">[P] Commencement No. 6 Regulations 2026 (S.I. 2026/82): https://www.legislation.gov.uk/uksi/2026/82/contents/made</w:t>
+      </w:r>
+    </w:p>
+  </w:comment>
+  <w:comment w:id="46" w:initials="CL" w:author="Claude" w:date="2026-10-28T00:00:00.000Z">
     <w:p>
       <w:r>
         <w:rPr>

</xml_diff>

<commit_message>
Add verified case-law table and correct redline after cross-checking court records
Case-law table lists every case in the DTIA paragraph and those added during verification, with pinpoint paragraphs and PDF pages cross-checked against official PDFs and Indian Kanoon, current status and free links.

Redline corrections from the cross-check: CPIL transfer petition allowed on 19.03.2025 (number confirmed); CBI appeal pending against Vinit Kumar; DPDP challenges still before a three-judge bench with no stay; Pegasus hearing details attributed to press reports; WhatsApp and FMP/Future Gaming listing updates; K.L.D. Nagasree SLP dismissed leaving question of law open.

Co-Authored-By: Claude Opus 5.5 <noreply@anthropic.com>
Claude-Session: https://claude.ai/code/session_01Ne9FcuM3um21sC2rt3Q8um
</commit_message>
<xml_diff>
--- a/DTIA India - Surveillance Law Redline (28 Oct 2026).docx
+++ b/DTIA India - Surveillance Law Redline (28 Oct 2026).docx
@@ -525,7 +525,7 @@
             <w:b w:val="false"/>
             <w:bCs w:val="false"/>
           </w:rPr>
-          <w:t xml:space="preserve">The Information Technology (Intermediary Guidelines and Digital Media Ethics Code) Rules, 2021 (the Intermediary Rules), made under the IT Act, also facilitate government access to data held by intermediaries, which include the email, messaging, cloud and hosting providers that the data importer may use. Under rule 3(1)(j), an intermediary must, as soon as possible and not later than seventy-two hours after receiving an order, provide information under its control or possession, or assistance, to a government agency lawfully authorised for investigative, protective or cyber security activities, for verification of identity, for the prevention, detection, investigation or prosecution of offences, or for cyber security incidents. Under rule 4(2), a significant social media intermediary providing messaging services must enable identification of the first originator of information when required by a court order or by an order of the competent authority under Section 69 of the IT Act; WhatsApp's challenge to this traceability requirement remains pending before the Delhi High Court. The Intermediary Rules were last amended with effect from 20 February 2026 (G.S.R. 120(E), dated 10 February 2026), principally to regulate synthetically generated information and to shorten takedown timelines (for example, to three hours for unlawful content notified by a court or the government under rule 3(1)(d)); the access obligations in rules 3(1)(j) and 4(2) continue to apply.</w:t>
+          <w:t xml:space="preserve">The Information Technology (Intermediary Guidelines and Digital Media Ethics Code) Rules, 2021 (the Intermediary Rules), made under the IT Act, also facilitate government access to data held by intermediaries, which include the email, messaging, cloud and hosting providers that the data importer may use. Under rule 3(1)(j), an intermediary must, as soon as possible and not later than seventy-two hours after receiving an order, provide information under its control or possession, or assistance, to a government agency lawfully authorised for investigative, protective or cyber security activities, for verification of identity, for the prevention, detection, investigation or prosecution of offences, or for cyber security incidents. Under rule 4(2), a significant social media intermediary providing messaging services must enable identification of the first originator of information when required by a court order or by an order of the competent authority under Section 69 of the IT Act; WhatsApp's challenge to this traceability requirement remains pending before the Delhi High Court (next listed on 17 November 2026). The Intermediary Rules were last amended with effect from 20 February 2026 (G.S.R. 120(E), dated 10 February 2026), principally to regulate synthetically generated information and to shorten takedown timelines (for example, to three hours for unlawful content notified by a court or the government under rule 3(1)(d)); the access obligations in rules 3(1)(j) and 4(2) continue to apply.</w:t>
         </w:r>
       </w:ins>
       <w:commentRangeEnd w:id="32"/>
@@ -1975,7 +1975,7 @@
             <w:b w:val="false"/>
             <w:bCs w:val="false"/>
           </w:rPr>
-          <w:t xml:space="preserve">The DPDP is under constitutional challenge before the Supreme Court. On 16 February 2026, the Court issued notice in Venkatesh Nayak v. Union of India (W.P.(C) No. 177 of 2026) and connected petitions (W.P.(C) Nos. 211 and 212 of 2026). Among other provisions, these petitions challenge sections 17(1)(c), 17(2), 33(1), 36 and 44(3) of the DPDP and rule 23(2) of the DPDP Rules, on grounds including the absence of safeguards against State access to personal data. According to press reports, the Court also referred the matter to a larger bench and declined to stay the DPDP. On 27 October 2026, the Court issued notice, returnable on 17 November 2026, on a further petition by the Digital News Publishers Association, which also challenges section 36 and rule 23. No notification exempting any State instrumentality under section 17(2)(a) has been located.</w:t>
+          <w:t xml:space="preserve">The DPDP is under constitutional challenge before the Supreme Court. On 16 February 2026, the Court issued notice in Venkatesh Nayak v. Union of India (W.P.(C) No. 177 of 2026) and connected petitions (W.P.(C) Nos. 211 and 212 of 2026). Among other provisions, these petitions challenge sections 17(1)(c), 17(2), 33(1), 36 and 44(3) of the DPDP and rule 23(2) of the DPDP Rules, on grounds including the absence of safeguards against State access to personal data. By later orders of 23 March 2026 and 7 August 2026, the Court directed the Union of India to file its counter affidavit, impleaded the Ministry of Electronics and Information Technology and listed the matters on 17 November 2026; no stay of the DPDP has been granted. On 27 October 2026, the Court issued notice, returnable on 17 November 2026, on a further petition by the Digital News Publishers Association, which reportedly also challenges section 36 and rule 23, and tagged it with these matters. No notification exempting any State instrumentality under section 17(2)(a) has been located.</w:t>
         </w:r>
       </w:ins>
       <w:commentRangeEnd w:id="36"/>
@@ -2125,7 +2125,7 @@
             <w:b w:val="false"/>
             <w:bCs w:val="false"/>
           </w:rPr>
-          <w:t xml:space="preserve">: the writ petition was filed in the Delhi High Court in 2020, the petitioners applied to the Supreme Court in 2023 to transfer it there, and the Supreme Court issued notice on the transfer petition on 10 October 2023; no final decision has been located</w:t>
+          <w:t xml:space="preserve">: the writ petition was filed in the Delhi High Court in 2020, the petitioners applied to the Supreme Court in 2023 to transfer it there, and the Supreme Court issued notice on the transfer petition on 10 October 2023 and allowed it on 19 March 2025, so that the writ petition is now pending before the Supreme Court together with W.P.(C) Nos. 61 and 13 of 2019</w:t>
         </w:r>
       </w:ins>
       <w:r>
@@ -3135,6 +3135,15 @@
         </w:rPr>
         <w:t xml:space="preserve"> against the petitioner on the grounds of violation of the right to privacy, and also ordered the destruction of intercepted records.</w:t>
       </w:r>
+      <w:ins w:id="193" w:author="Claude" w:date="2026-10-28T00:00:00Z">
+        <w:r>
+          <w:rPr>
+            <w:b w:val="false"/>
+            <w:bCs w:val="false"/>
+          </w:rPr>
+          <w:t xml:space="preserve"> The CBI's special leave petition against this judgment (SLP (Crl.) No. 902 of 2020) is pending before the Supreme Court, and the judgment is reported to have been stayed in the meantime; it should therefore be relied on with caution.</w:t>
+        </w:r>
+      </w:ins>
       <w:commentRangeEnd w:id="25"/>
       <w:r>
         <w:commentReference w:id="25"/>
@@ -3146,7 +3155,7 @@
         <w:jc w:val="both"/>
       </w:pPr>
       <w:commentRangeStart w:id="38"/>
-      <w:ins w:id="193" w:author="Claude" w:date="2026-10-28T00:00:00Z">
+      <w:ins w:id="194" w:author="Claude" w:date="2026-10-28T00:00:00Z">
         <w:r>
           <w:rPr>
             <w:b w:val="false"/>
@@ -3159,7 +3168,7 @@
       <w:r>
         <w:commentReference w:id="38"/>
       </w:r>
-      <w:ins w:id="194" w:author="Claude" w:date="2026-10-28T00:00:00Z">
+      <w:ins w:id="195" w:author="Claude" w:date="2026-10-28T00:00:00Z">
         <w:r>
           <w:rPr>
             <w:b w:val="false"/>
@@ -3169,7 +3178,7 @@
         </w:r>
       </w:ins>
       <w:commentRangeStart w:id="39"/>
-      <w:ins w:id="195" w:author="Claude" w:date="2026-10-28T00:00:00Z">
+      <w:ins w:id="196" w:author="Claude" w:date="2026-10-28T00:00:00Z">
         <w:r>
           <w:rPr>
             <w:b w:val="false"/>
@@ -3182,7 +3191,7 @@
       <w:r>
         <w:commentReference w:id="39"/>
       </w:r>
-      <w:ins w:id="196" w:author="Claude" w:date="2026-10-28T00:00:00Z">
+      <w:ins w:id="197" w:author="Claude" w:date="2026-10-28T00:00:00Z">
         <w:r>
           <w:rPr>
             <w:b w:val="false"/>
@@ -3192,7 +3201,7 @@
         </w:r>
       </w:ins>
       <w:commentRangeStart w:id="40"/>
-      <w:ins w:id="197" w:author="Claude" w:date="2026-10-28T00:00:00Z">
+      <w:ins w:id="198" w:author="Claude" w:date="2026-10-28T00:00:00Z">
         <w:r>
           <w:rPr>
             <w:b w:val="false"/>
@@ -3219,7 +3228,7 @@
         </w:rPr>
         <w:t xml:space="preserve">While there are reports by Human Rights Watch </w:t>
       </w:r>
-      <w:del w:id="198" w:author="Claude" w:date="2026-10-28T00:00:00Z">
+      <w:del w:id="199" w:author="Claude" w:date="2026-10-28T00:00:00Z">
         <w:r>
           <w:rPr>
             <w:b w:val="false"/>
@@ -3228,7 +3237,7 @@
           <w:delText xml:space="preserve">on </w:delText>
         </w:r>
       </w:del>
-      <w:ins w:id="199" w:author="Claude" w:date="2026-10-28T00:00:00Z">
+      <w:ins w:id="200" w:author="Claude" w:date="2026-10-28T00:00:00Z">
         <w:r>
           <w:rPr>
             <w:b w:val="false"/>
@@ -3244,7 +3253,7 @@
         </w:rPr>
         <w:t xml:space="preserve">26</w:t>
       </w:r>
-      <w:del w:id="200" w:author="Claude" w:date="2026-10-28T00:00:00Z">
+      <w:del w:id="201" w:author="Claude" w:date="2026-10-28T00:00:00Z">
         <w:r>
           <w:rPr>
             <w:b w:val="false"/>
@@ -3260,7 +3269,7 @@
         </w:rPr>
         <w:t xml:space="preserve"> August 2021 and others that the Indian government has allegedly used advanced spyware to target activists and apparently its opponents in opposition, </w:t>
       </w:r>
-      <w:del w:id="201" w:author="Claude" w:date="2026-10-28T00:00:00Z">
+      <w:del w:id="202" w:author="Claude" w:date="2026-10-28T00:00:00Z">
         <w:r>
           <w:rPr>
             <w:b w:val="false"/>
@@ -3269,7 +3278,7 @@
           <w:delText xml:space="preserve">probably in the range of 300 people in India</w:delText>
         </w:r>
       </w:del>
-      <w:ins w:id="202" w:author="Claude" w:date="2026-10-28T00:00:00Z">
+      <w:ins w:id="203" w:author="Claude" w:date="2026-10-28T00:00:00Z">
         <w:r>
           <w:rPr>
             <w:b w:val="false"/>
@@ -3285,7 +3294,7 @@
         </w:rPr>
         <w:t xml:space="preserve">, there is </w:t>
       </w:r>
-      <w:del w:id="203" w:author="Claude" w:date="2026-10-28T00:00:00Z">
+      <w:del w:id="204" w:author="Claude" w:date="2026-10-28T00:00:00Z">
         <w:r>
           <w:rPr>
             <w:b w:val="false"/>
@@ -3294,7 +3303,7 @@
           <w:delText xml:space="preserve">and has been no</w:delText>
         </w:r>
       </w:del>
-      <w:ins w:id="204" w:author="Claude" w:date="2026-10-28T00:00:00Z">
+      <w:ins w:id="205" w:author="Claude" w:date="2026-10-28T00:00:00Z">
         <w:r>
           <w:rPr>
             <w:b w:val="false"/>
@@ -3310,7 +3319,7 @@
         </w:rPr>
         <w:t xml:space="preserve"> evidence in the public domain of </w:t>
       </w:r>
-      <w:del w:id="205" w:author="Claude" w:date="2026-10-28T00:00:00Z">
+      <w:del w:id="206" w:author="Claude" w:date="2026-10-28T00:00:00Z">
         <w:r>
           <w:rPr>
             <w:b w:val="false"/>
@@ -3326,7 +3335,7 @@
         </w:rPr>
         <w:t xml:space="preserve">bulk data collection or communication surveillance on a large scale by the Indian government.</w:t>
       </w:r>
-      <w:ins w:id="206" w:author="Claude" w:date="2026-10-28T00:00:00Z">
+      <w:ins w:id="207" w:author="Claude" w:date="2026-10-28T00:00:00Z">
         <w:r>
           <w:rPr>
             <w:b w:val="false"/>
@@ -3342,13 +3351,13 @@
         </w:rPr>
         <w:t xml:space="preserve"> Human Rights Watch states that hacking is illegal under Indian law, and thus far, the Indian government has not stated whether it used Israeli spyware Pegasus to hack into devices.</w:t>
       </w:r>
-      <w:ins w:id="207" w:author="Claude" w:date="2026-10-28T00:00:00Z">
-        <w:r>
-          <w:rPr>
-            <w:b w:val="false"/>
-            <w:bCs w:val="false"/>
-          </w:rPr>
-          <w:t xml:space="preserve"> A technical committee appointed by the Supreme Court found malware on 5 of the 29 phones it examined but could not conclusively attribute it to Pegasus, and reported that the government did not cooperate with its inquiry.</w:t>
+      <w:ins w:id="208" w:author="Claude" w:date="2026-10-28T00:00:00Z">
+        <w:r>
+          <w:rPr>
+            <w:b w:val="false"/>
+            <w:bCs w:val="false"/>
+          </w:rPr>
+          <w:t xml:space="preserve"> According to press reports of the hearing on 25 August 2022, at which the Supreme Court took the reports of its technical committee and overseeing judge on record in sealed cover, the committee found malware on 5 of the 29 phones it examined but could not conclusively attribute it to Pegasus, and reported that the government did not cooperate with its inquiry.</w:t>
         </w:r>
       </w:ins>
       <w:commentRangeEnd w:id="26"/>
@@ -3362,13 +3371,13 @@
         <w:jc w:val="both"/>
       </w:pPr>
       <w:commentRangeStart w:id="41"/>
-      <w:ins w:id="208" w:author="Claude" w:date="2026-10-28T00:00:00Z">
-        <w:r>
-          <w:rPr>
-            <w:b w:val="false"/>
-            <w:bCs w:val="false"/>
-          </w:rPr>
-          <w:t xml:space="preserve">The Supreme Court is also considering the limits of State access to data on seized digital devices. In Future Gaming and Hotels Services Pvt. Ltd. v. Directorate of Enforcement (W.P.(Crl.) No. 515 of 2024), the Court by an ad-interim order dated 13 December 2024 restrained the Directorate of Enforcement from accessing and copying the contents of seized mobile phones and other electronic devices, and directed that the matter be heard with W.P.(C) No. 1081 of 2022 and connected cases. In Foundation for Media Professionals v. Union of India (W.P.(Crl.) No. 395 of 2022), the petitioners seek guidelines for the search and seizure of digital devices, including prior judicial authorisation. Both matters remain pending.</w:t>
+      <w:ins w:id="209" w:author="Claude" w:date="2026-10-28T00:00:00Z">
+        <w:r>
+          <w:rPr>
+            <w:b w:val="false"/>
+            <w:bCs w:val="false"/>
+          </w:rPr>
+          <w:t xml:space="preserve">The Supreme Court is also considering the limits of State access to data on seized digital devices. In Future Gaming and Hotels Services Pvt. Ltd. v. Directorate of Enforcement (W.P.(Crl.) No. 515 of 2024), the Court by an ad-interim order dated 13 December 2024 restrained the Directorate of Enforcement from accessing and copying the contents of seized mobile phones and other electronic devices, and directed that the matter be heard with W.P.(C) No. 1081 of 2022 and connected cases. In Foundation for Media Professionals v. Union of India (W.P.(Crl.) No. 395 of 2022), the petitioners seek guidelines for the search and seizure of digital devices, including prior judicial authorisation. Both matters remain pending; by order of 6 February 2026, the Court directed that any interim order continue.</w:t>
         </w:r>
       </w:ins>
       <w:commentRangeEnd w:id="41"/>
@@ -3402,7 +3411,7 @@
         <w:t xml:space="preserve">The probability is very low that the extraordinary and exceptional authorities provided by certain narrowly targeted statutes allowing for broad and secret surveillance related to matters of national security, requiring authorization by a limited set of senior officials of the </w:t>
       </w:r>
       <w:commentRangeStart w:id="27"/>
-      <w:del w:id="209" w:author="Claude" w:date="2026-10-28T00:00:00Z">
+      <w:del w:id="210" w:author="Claude" w:date="2026-10-28T00:00:00Z">
         <w:r>
           <w:rPr>
             <w:b w:val="false"/>
@@ -3411,7 +3420,7 @@
           <w:delText xml:space="preserve">federal government</w:delText>
         </w:r>
       </w:del>
-      <w:ins w:id="210" w:author="Claude" w:date="2026-10-28T00:00:00Z">
+      <w:ins w:id="211" w:author="Claude" w:date="2026-10-28T00:00:00Z">
         <w:r>
           <w:rPr>
             <w:b w:val="false"/>
@@ -3439,7 +3448,7 @@
         </w:rPr>
         <w:t xml:space="preserve">Further, the data importer is a law firm and</w:t>
       </w:r>
-      <w:ins w:id="211" w:author="Claude" w:date="2026-10-28T00:00:00Z">
+      <w:ins w:id="212" w:author="Claude" w:date="2026-10-28T00:00:00Z">
         <w:r>
           <w:rPr>
             <w:b w:val="false"/>
@@ -3455,7 +3464,7 @@
         </w:rPr>
         <w:t xml:space="preserve"> </w:t>
       </w:r>
-      <w:del w:id="212" w:author="Claude" w:date="2026-10-28T00:00:00Z">
+      <w:del w:id="213" w:author="Claude" w:date="2026-10-28T00:00:00Z">
         <w:r>
           <w:rPr>
             <w:b w:val="false"/>
@@ -3464,7 +3473,7 @@
           <w:delText xml:space="preserve">is thus</w:delText>
         </w:r>
       </w:del>
-      <w:ins w:id="213" w:author="Claude" w:date="2026-10-28T00:00:00Z">
+      <w:ins w:id="214" w:author="Claude" w:date="2026-10-28T00:00:00Z">
         <w:r>
           <w:rPr>
             <w:b w:val="false"/>
@@ -3480,7 +3489,7 @@
         </w:rPr>
         <w:t xml:space="preserve"> protected by </w:t>
       </w:r>
-      <w:del w:id="214" w:author="Claude" w:date="2026-10-28T00:00:00Z">
+      <w:del w:id="215" w:author="Claude" w:date="2026-10-28T00:00:00Z">
         <w:r>
           <w:rPr>
             <w:b w:val="false"/>
@@ -3489,7 +3498,7 @@
           <w:delText xml:space="preserve">rules on attorney-client</w:delText>
         </w:r>
       </w:del>
-      <w:ins w:id="215" w:author="Claude" w:date="2026-10-28T00:00:00Z">
+      <w:ins w:id="216" w:author="Claude" w:date="2026-10-28T00:00:00Z">
         <w:r>
           <w:rPr>
             <w:b w:val="false"/>
@@ -3505,7 +3514,7 @@
         </w:rPr>
         <w:t xml:space="preserve"> privilege in India</w:t>
       </w:r>
-      <w:ins w:id="216" w:author="Claude" w:date="2026-10-28T00:00:00Z">
+      <w:ins w:id="217" w:author="Claude" w:date="2026-10-28T00:00:00Z">
         <w:r>
           <w:rPr>
             <w:b w:val="false"/>
@@ -3521,7 +3530,7 @@
         </w:rPr>
         <w:t xml:space="preserve">. In particular, professional communications between </w:t>
       </w:r>
-      <w:del w:id="217" w:author="Claude" w:date="2026-10-28T00:00:00Z">
+      <w:del w:id="218" w:author="Claude" w:date="2026-10-28T00:00:00Z">
         <w:r>
           <w:rPr>
             <w:b w:val="false"/>
@@ -3530,7 +3539,7 @@
           <w:delText xml:space="preserve">attorneys</w:delText>
         </w:r>
       </w:del>
-      <w:ins w:id="218" w:author="Claude" w:date="2026-10-28T00:00:00Z">
+      <w:ins w:id="219" w:author="Claude" w:date="2026-10-28T00:00:00Z">
         <w:r>
           <w:rPr>
             <w:b w:val="false"/>
@@ -3546,7 +3555,7 @@
         </w:rPr>
         <w:t xml:space="preserve"> and clients are protected in India as privileged communications under </w:t>
       </w:r>
-      <w:ins w:id="219" w:author="Claude" w:date="2026-10-28T00:00:00Z">
+      <w:ins w:id="220" w:author="Claude" w:date="2026-10-28T00:00:00Z">
         <w:r>
           <w:rPr>
             <w:b w:val="false"/>
@@ -3562,7 +3571,7 @@
         </w:rPr>
         <w:t xml:space="preserve">the Bharatiya </w:t>
       </w:r>
-      <w:del w:id="220" w:author="Claude" w:date="2026-10-28T00:00:00Z">
+      <w:del w:id="221" w:author="Claude" w:date="2026-10-28T00:00:00Z">
         <w:r>
           <w:rPr>
             <w:b w:val="false"/>
@@ -3571,7 +3580,7 @@
           <w:delText xml:space="preserve">Saksha</w:delText>
         </w:r>
       </w:del>
-      <w:ins w:id="221" w:author="Claude" w:date="2026-10-28T00:00:00Z">
+      <w:ins w:id="222" w:author="Claude" w:date="2026-10-28T00:00:00Z">
         <w:r>
           <w:rPr>
             <w:b w:val="false"/>
@@ -3587,7 +3596,7 @@
         </w:rPr>
         <w:t xml:space="preserve"> Adhiniyam</w:t>
       </w:r>
-      <w:ins w:id="222" w:author="Claude" w:date="2026-10-28T00:00:00Z">
+      <w:ins w:id="223" w:author="Claude" w:date="2026-10-28T00:00:00Z">
         <w:r>
           <w:rPr>
             <w:b w:val="false"/>
@@ -3603,7 +3612,7 @@
         </w:rPr>
         <w:t xml:space="preserve"> 2023</w:t>
       </w:r>
-      <w:ins w:id="223" w:author="Claude" w:date="2026-10-28T00:00:00Z">
+      <w:ins w:id="224" w:author="Claude" w:date="2026-10-28T00:00:00Z">
         <w:r>
           <w:rPr>
             <w:b w:val="false"/>
@@ -3619,7 +3628,7 @@
         </w:rPr>
         <w:t xml:space="preserve">, which replaced the Indian Evidence Act 1872 </w:t>
       </w:r>
-      <w:del w:id="224" w:author="Claude" w:date="2026-10-28T00:00:00Z">
+      <w:del w:id="225" w:author="Claude" w:date="2026-10-28T00:00:00Z">
         <w:r>
           <w:rPr>
             <w:b w:val="false"/>
@@ -3628,7 +3637,7 @@
           <w:delText xml:space="preserve">and is known as the BSA</w:delText>
         </w:r>
       </w:del>
-      <w:ins w:id="225" w:author="Claude" w:date="2026-10-28T00:00:00Z">
+      <w:ins w:id="226" w:author="Claude" w:date="2026-10-28T00:00:00Z">
         <w:r>
           <w:rPr>
             <w:b w:val="false"/>
@@ -3644,7 +3653,7 @@
         </w:rPr>
         <w:t xml:space="preserve">.</w:t>
       </w:r>
-      <w:ins w:id="226" w:author="Claude" w:date="2026-10-28T00:00:00Z">
+      <w:ins w:id="227" w:author="Claude" w:date="2026-10-28T00:00:00Z">
         <w:r>
           <w:rPr>
             <w:b w:val="false"/>
@@ -3684,7 +3693,7 @@
         </w:rPr>
         <w:t xml:space="preserve">In India, judicial redress is available against illegal surveillance, so individuals, regardless of their citizenship, have a right to seek judicial and constitutional remedies before the Indian Supreme Court and High Courts</w:t>
       </w:r>
-      <w:ins w:id="227" w:author="Claude" w:date="2026-10-28T00:00:00Z">
+      <w:ins w:id="228" w:author="Claude" w:date="2026-10-28T00:00:00Z">
         <w:r>
           <w:rPr>
             <w:b w:val="false"/>
@@ -3700,7 +3709,7 @@
         </w:rPr>
         <w:t xml:space="preserve"> in case of breach of right to privacy. Individuals can challenge any action of the state that does not follow a procedure established by law and/or that is otherwise unreasonable, arbitrary, or disproportionate to the objectives that the action seeks to accomplish.</w:t>
       </w:r>
-      <w:ins w:id="228" w:author="Claude" w:date="2026-10-28T00:00:00Z">
+      <w:ins w:id="229" w:author="Claude" w:date="2026-10-28T00:00:00Z">
         <w:r>
           <w:rPr>
             <w:b w:val="false"/>
@@ -3728,7 +3737,7 @@
         </w:rPr>
         <w:t xml:space="preserve">Instead, the </w:t>
       </w:r>
-      <w:del w:id="229" w:author="Claude" w:date="2026-10-28T00:00:00Z">
+      <w:del w:id="230" w:author="Claude" w:date="2026-10-28T00:00:00Z">
         <w:r>
           <w:rPr>
             <w:b w:val="false"/>
@@ -3737,13 +3746,13 @@
           <w:delText xml:space="preserve">details would be revealed to a government-appointed committee of experts</w:delText>
         </w:r>
       </w:del>
-      <w:ins w:id="230" w:author="Claude" w:date="2026-10-28T00:00:00Z">
-        <w:r>
-          <w:rPr>
-            <w:b w:val="false"/>
-            <w:bCs w:val="false"/>
-          </w:rPr>
-          <w:t xml:space="preserve">government offered to disclose details to a committee of experts that it would itself appoint. In Manohar Lal Sharma v. Union of India (W.P.(Crl.) No. 314 of 2021, order dated 27 October 2021), the Supreme Court rejected that offer, held that the State does not get a free pass every time national security is raised, and appointed its own technical committee overseen by a retired Supreme Court judge, Justice R.V. Raveendran. On 29 April 2025, the Court indicated that the committee's report would not be made public; the proceedings remain pending</w:t>
+      <w:ins w:id="231" w:author="Claude" w:date="2026-10-28T00:00:00Z">
+        <w:r>
+          <w:rPr>
+            <w:b w:val="false"/>
+            <w:bCs w:val="false"/>
+          </w:rPr>
+          <w:t xml:space="preserve">government offered to disclose details to a committee of experts that it would itself appoint. In Manohar Lal Sharma v. Union of India (W.P.(Crl.) No. 314 of 2021, order dated 27 October 2021), the Supreme Court rejected that offer, held that the State does not get a free pass every time national security is raised, and appointed its own technical committee overseen by a retired Supreme Court judge, Justice R.V. Raveendran. According to press reports of the hearing on 29 April 2025, the Court indicated that the committee's report would not be made public; the proceedings remain pending</w:t>
         </w:r>
       </w:ins>
       <w:r>
@@ -3772,7 +3781,7 @@
         </w:rPr>
         <w:t xml:space="preserve">The </w:t>
       </w:r>
-      <w:del w:id="231" w:author="Claude" w:date="2026-10-28T00:00:00Z">
+      <w:del w:id="232" w:author="Claude" w:date="2026-10-28T00:00:00Z">
         <w:r>
           <w:rPr>
             <w:b w:val="false"/>
@@ -3781,7 +3790,7 @@
           <w:delText xml:space="preserve">Center</w:delText>
         </w:r>
       </w:del>
-      <w:ins w:id="232" w:author="Claude" w:date="2026-10-28T00:00:00Z">
+      <w:ins w:id="233" w:author="Claude" w:date="2026-10-28T00:00:00Z">
         <w:r>
           <w:rPr>
             <w:b w:val="false"/>
@@ -3797,7 +3806,7 @@
         </w:rPr>
         <w:t xml:space="preserve"> for Internet and Society, CIS, recommends that current national laws which regulate surveillance in India be amended in accordance with the national privacy principles and the international principles on the application of human rights to communication surveillance, and that a privacy law be enacted. </w:t>
       </w:r>
-      <w:ins w:id="233" w:author="Claude" w:date="2026-10-28T00:00:00Z">
+      <w:ins w:id="234" w:author="Claude" w:date="2026-10-28T00:00:00Z">
         <w:r>
           <w:rPr>
             <w:b w:val="false"/>
@@ -3806,7 +3815,7 @@
           <w:t xml:space="preserve">The latter recommendation has since been addressed in part by the enactment of the DPDP, but the</w:t>
         </w:r>
       </w:ins>
-      <w:del w:id="234" w:author="Claude" w:date="2026-10-28T00:00:00Z">
+      <w:del w:id="235" w:author="Claude" w:date="2026-10-28T00:00:00Z">
         <w:r>
           <w:rPr>
             <w:b w:val="false"/>
@@ -3822,7 +3831,7 @@
         </w:rPr>
         <w:t xml:space="preserve"> discussion</w:t>
       </w:r>
-      <w:ins w:id="235" w:author="Claude" w:date="2026-10-28T00:00:00Z">
+      <w:ins w:id="236" w:author="Claude" w:date="2026-10-28T00:00:00Z">
         <w:r>
           <w:rPr>
             <w:b w:val="false"/>
@@ -3838,7 +3847,7 @@
         </w:rPr>
         <w:t xml:space="preserve"> is ongoing in India</w:t>
       </w:r>
-      <w:ins w:id="236" w:author="Claude" w:date="2026-10-28T00:00:00Z">
+      <w:ins w:id="237" w:author="Claude" w:date="2026-10-28T00:00:00Z">
         <w:r>
           <w:rPr>
             <w:b w:val="false"/>
@@ -3854,7 +3863,7 @@
         </w:rPr>
         <w:t xml:space="preserve">. Legal experts and rights groups have underlined their concern about the </w:t>
       </w:r>
-      <w:del w:id="237" w:author="Claude" w:date="2026-10-28T00:00:00Z">
+      <w:del w:id="238" w:author="Claude" w:date="2026-10-28T00:00:00Z">
         <w:r>
           <w:rPr>
             <w:b w:val="false"/>
@@ -3863,7 +3872,7 @@
           <w:delText xml:space="preserve">Act</w:delText>
         </w:r>
       </w:del>
-      <w:ins w:id="238" w:author="Claude" w:date="2026-10-28T00:00:00Z">
+      <w:ins w:id="239" w:author="Claude" w:date="2026-10-28T00:00:00Z">
         <w:r>
           <w:rPr>
             <w:b w:val="false"/>
@@ -3879,7 +3888,7 @@
         </w:rPr>
         <w:t xml:space="preserve">, especially over the potential for unfettered government surveillance</w:t>
       </w:r>
-      <w:ins w:id="239" w:author="Claude" w:date="2026-10-28T00:00:00Z">
+      <w:ins w:id="240" w:author="Claude" w:date="2026-10-28T00:00:00Z">
         <w:r>
           <w:rPr>
             <w:b w:val="false"/>
@@ -3888,7 +3897,7 @@
           <w:t xml:space="preserve"> (see sections 17(2)(a) and 36 of the DPDP)</w:t>
         </w:r>
       </w:ins>
-      <w:del w:id="240" w:author="Claude" w:date="2026-10-28T00:00:00Z">
+      <w:del w:id="241" w:author="Claude" w:date="2026-10-28T00:00:00Z">
         <w:r>
           <w:rPr>
             <w:b w:val="false"/>
@@ -3897,7 +3906,7 @@
           <w:delText xml:space="preserve"> that</w:delText>
         </w:r>
       </w:del>
-      <w:ins w:id="241" w:author="Claude" w:date="2026-10-28T00:00:00Z">
+      <w:ins w:id="242" w:author="Claude" w:date="2026-10-28T00:00:00Z">
         <w:r>
           <w:rPr>
             <w:b w:val="false"/>
@@ -3924,7 +3933,7 @@
         <w:jc w:val="both"/>
       </w:pPr>
       <w:commentRangeStart w:id="42"/>
-      <w:ins w:id="242" w:author="Claude" w:date="2026-10-28T00:00:00Z">
+      <w:ins w:id="243" w:author="Claude" w:date="2026-10-28T00:00:00Z">
         <w:r>
           <w:rPr>
             <w:b w:val="false"/>
@@ -3937,7 +3946,7 @@
       <w:r>
         <w:commentReference w:id="42"/>
       </w:r>
-      <w:ins w:id="243" w:author="Claude" w:date="2026-10-28T00:00:00Z">
+      <w:ins w:id="244" w:author="Claude" w:date="2026-10-28T00:00:00Z">
         <w:r>
           <w:rPr>
             <w:b w:val="false"/>
@@ -3947,7 +3956,7 @@
         </w:r>
       </w:ins>
       <w:commentRangeStart w:id="43"/>
-      <w:ins w:id="244" w:author="Claude" w:date="2026-10-28T00:00:00Z">
+      <w:ins w:id="245" w:author="Claude" w:date="2026-10-28T00:00:00Z">
         <w:r>
           <w:rPr>
             <w:b w:val="false"/>
@@ -3969,7 +3978,7 @@
           <w:ins w:id="9003" w:author="Claude" w:date="2026-10-28T00:00:00Z"/>
         </w:rPr>
       </w:pPr>
-      <w:ins w:id="246" w:author="Claude" w:date="2026-10-28T00:00:00Z">
+      <w:ins w:id="247" w:author="Claude" w:date="2026-10-28T00:00:00Z">
         <w:r>
           <w:rPr>
             <w:b/>
@@ -3987,7 +3996,7 @@
           <w:ins w:id="9004" w:author="Claude" w:date="2026-10-28T00:00:00Z"/>
         </w:rPr>
       </w:pPr>
-      <w:ins w:id="247" w:author="Claude" w:date="2026-10-28T00:00:00Z">
+      <w:ins w:id="248" w:author="Claude" w:date="2026-10-28T00:00:00Z">
         <w:r>
           <w:rPr>
             <w:b/>
@@ -4010,7 +4019,7 @@
           <w:ins w:id="9005" w:author="Claude" w:date="2026-10-28T00:00:00Z"/>
         </w:rPr>
       </w:pPr>
-      <w:ins w:id="248" w:author="Claude" w:date="2026-10-28T00:00:00Z">
+      <w:ins w:id="249" w:author="Claude" w:date="2026-10-28T00:00:00Z">
         <w:r>
           <w:rPr>
             <w:b w:val="false"/>
@@ -4033,7 +4042,7 @@
           <w:ins w:id="9006" w:author="Claude" w:date="2026-10-28T00:00:00Z"/>
         </w:rPr>
       </w:pPr>
-      <w:ins w:id="249" w:author="Claude" w:date="2026-10-28T00:00:00Z">
+      <w:ins w:id="250" w:author="Claude" w:date="2026-10-28T00:00:00Z">
         <w:r>
           <w:rPr>
             <w:b w:val="false"/>
@@ -4056,7 +4065,7 @@
           <w:ins w:id="9007" w:author="Claude" w:date="2026-10-28T00:00:00Z"/>
         </w:rPr>
       </w:pPr>
-      <w:ins w:id="250" w:author="Claude" w:date="2026-10-28T00:00:00Z">
+      <w:ins w:id="251" w:author="Claude" w:date="2026-10-28T00:00:00Z">
         <w:r>
           <w:rPr>
             <w:b w:val="false"/>
@@ -4079,7 +4088,7 @@
           <w:ins w:id="9008" w:author="Claude" w:date="2026-10-28T00:00:00Z"/>
         </w:rPr>
       </w:pPr>
-      <w:ins w:id="251" w:author="Claude" w:date="2026-10-28T00:00:00Z">
+      <w:ins w:id="252" w:author="Claude" w:date="2026-10-28T00:00:00Z">
         <w:r>
           <w:rPr>
             <w:b w:val="false"/>
@@ -4102,7 +4111,7 @@
           <w:ins w:id="9009" w:author="Claude" w:date="2026-10-28T00:00:00Z"/>
         </w:rPr>
       </w:pPr>
-      <w:ins w:id="252" w:author="Claude" w:date="2026-10-28T00:00:00Z">
+      <w:ins w:id="253" w:author="Claude" w:date="2026-10-28T00:00:00Z">
         <w:r>
           <w:rPr>
             <w:b w:val="false"/>
@@ -4125,7 +4134,7 @@
           <w:ins w:id="9010" w:author="Claude" w:date="2026-10-28T00:00:00Z"/>
         </w:rPr>
       </w:pPr>
-      <w:ins w:id="253" w:author="Claude" w:date="2026-10-28T00:00:00Z">
+      <w:ins w:id="254" w:author="Claude" w:date="2026-10-28T00:00:00Z">
         <w:r>
           <w:rPr>
             <w:b w:val="false"/>
@@ -4148,7 +4157,7 @@
           <w:ins w:id="9011" w:author="Claude" w:date="2026-10-28T00:00:00Z"/>
         </w:rPr>
       </w:pPr>
-      <w:ins w:id="254" w:author="Claude" w:date="2026-10-28T00:00:00Z">
+      <w:ins w:id="255" w:author="Claude" w:date="2026-10-28T00:00:00Z">
         <w:r>
           <w:rPr>
             <w:b w:val="false"/>
@@ -4171,7 +4180,7 @@
           <w:ins w:id="9012" w:author="Claude" w:date="2026-10-28T00:00:00Z"/>
         </w:rPr>
       </w:pPr>
-      <w:ins w:id="255" w:author="Claude" w:date="2026-10-28T00:00:00Z">
+      <w:ins w:id="256" w:author="Claude" w:date="2026-10-28T00:00:00Z">
         <w:r>
           <w:rPr>
             <w:b w:val="false"/>
@@ -4194,7 +4203,7 @@
           <w:ins w:id="9013" w:author="Claude" w:date="2026-10-28T00:00:00Z"/>
         </w:rPr>
       </w:pPr>
-      <w:ins w:id="256" w:author="Claude" w:date="2026-10-28T00:00:00Z">
+      <w:ins w:id="257" w:author="Claude" w:date="2026-10-28T00:00:00Z">
         <w:r>
           <w:rPr>
             <w:b w:val="false"/>
@@ -4217,7 +4226,7 @@
           <w:ins w:id="9014" w:author="Claude" w:date="2026-10-28T00:00:00Z"/>
         </w:rPr>
       </w:pPr>
-      <w:ins w:id="257" w:author="Claude" w:date="2026-10-28T00:00:00Z">
+      <w:ins w:id="258" w:author="Claude" w:date="2026-10-28T00:00:00Z">
         <w:r>
           <w:rPr>
             <w:b w:val="false"/>
@@ -4240,7 +4249,7 @@
           <w:ins w:id="9015" w:author="Claude" w:date="2026-10-28T00:00:00Z"/>
         </w:rPr>
       </w:pPr>
-      <w:ins w:id="258" w:author="Claude" w:date="2026-10-28T00:00:00Z">
+      <w:ins w:id="259" w:author="Claude" w:date="2026-10-28T00:00:00Z">
         <w:r>
           <w:rPr>
             <w:b w:val="false"/>
@@ -4263,7 +4272,7 @@
           <w:ins w:id="9016" w:author="Claude" w:date="2026-10-28T00:00:00Z"/>
         </w:rPr>
       </w:pPr>
-      <w:ins w:id="259" w:author="Claude" w:date="2026-10-28T00:00:00Z">
+      <w:ins w:id="260" w:author="Claude" w:date="2026-10-28T00:00:00Z">
         <w:r>
           <w:rPr>
             <w:b w:val="false"/>
@@ -4286,7 +4295,7 @@
           <w:ins w:id="9017" w:author="Claude" w:date="2026-10-28T00:00:00Z"/>
         </w:rPr>
       </w:pPr>
-      <w:ins w:id="260" w:author="Claude" w:date="2026-10-28T00:00:00Z">
+      <w:ins w:id="261" w:author="Claude" w:date="2026-10-28T00:00:00Z">
         <w:r>
           <w:rPr>
             <w:b w:val="false"/>
@@ -4309,7 +4318,7 @@
           <w:ins w:id="9018" w:author="Claude" w:date="2026-10-28T00:00:00Z"/>
         </w:rPr>
       </w:pPr>
-      <w:ins w:id="261" w:author="Claude" w:date="2026-10-28T00:00:00Z">
+      <w:ins w:id="262" w:author="Claude" w:date="2026-10-28T00:00:00Z">
         <w:r>
           <w:rPr>
             <w:b w:val="false"/>
@@ -4332,7 +4341,7 @@
           <w:ins w:id="9019" w:author="Claude" w:date="2026-10-28T00:00:00Z"/>
         </w:rPr>
       </w:pPr>
-      <w:ins w:id="262" w:author="Claude" w:date="2026-10-28T00:00:00Z">
+      <w:ins w:id="263" w:author="Claude" w:date="2026-10-28T00:00:00Z">
         <w:r>
           <w:rPr>
             <w:b w:val="false"/>
@@ -4355,7 +4364,7 @@
           <w:ins w:id="9020" w:author="Claude" w:date="2026-10-28T00:00:00Z"/>
         </w:rPr>
       </w:pPr>
-      <w:ins w:id="263" w:author="Claude" w:date="2026-10-28T00:00:00Z">
+      <w:ins w:id="264" w:author="Claude" w:date="2026-10-28T00:00:00Z">
         <w:r>
           <w:rPr>
             <w:b w:val="false"/>
@@ -4378,7 +4387,7 @@
           <w:ins w:id="9021" w:author="Claude" w:date="2026-10-28T00:00:00Z"/>
         </w:rPr>
       </w:pPr>
-      <w:ins w:id="264" w:author="Claude" w:date="2026-10-28T00:00:00Z">
+      <w:ins w:id="265" w:author="Claude" w:date="2026-10-28T00:00:00Z">
         <w:r>
           <w:rPr>
             <w:b w:val="false"/>
@@ -4401,7 +4410,7 @@
           <w:ins w:id="9022" w:author="Claude" w:date="2026-10-28T00:00:00Z"/>
         </w:rPr>
       </w:pPr>
-      <w:ins w:id="265" w:author="Claude" w:date="2026-10-28T00:00:00Z">
+      <w:ins w:id="266" w:author="Claude" w:date="2026-10-28T00:00:00Z">
         <w:r>
           <w:rPr>
             <w:b w:val="false"/>
@@ -4424,7 +4433,7 @@
           <w:ins w:id="9023" w:author="Claude" w:date="2026-10-28T00:00:00Z"/>
         </w:rPr>
       </w:pPr>
-      <w:ins w:id="266" w:author="Claude" w:date="2026-10-28T00:00:00Z">
+      <w:ins w:id="267" w:author="Claude" w:date="2026-10-28T00:00:00Z">
         <w:r>
           <w:rPr>
             <w:b w:val="false"/>
@@ -4447,7 +4456,7 @@
           <w:ins w:id="9024" w:author="Claude" w:date="2026-10-28T00:00:00Z"/>
         </w:rPr>
       </w:pPr>
-      <w:ins w:id="267" w:author="Claude" w:date="2026-10-28T00:00:00Z">
+      <w:ins w:id="268" w:author="Claude" w:date="2026-10-28T00:00:00Z">
         <w:r>
           <w:rPr>
             <w:b w:val="false"/>
@@ -4470,7 +4479,7 @@
           <w:ins w:id="9025" w:author="Claude" w:date="2026-10-28T00:00:00Z"/>
         </w:rPr>
       </w:pPr>
-      <w:ins w:id="268" w:author="Claude" w:date="2026-10-28T00:00:00Z">
+      <w:ins w:id="269" w:author="Claude" w:date="2026-10-28T00:00:00Z">
         <w:r>
           <w:rPr>
             <w:b w:val="false"/>
@@ -4493,7 +4502,7 @@
           <w:ins w:id="9026" w:author="Claude" w:date="2026-10-28T00:00:00Z"/>
         </w:rPr>
       </w:pPr>
-      <w:ins w:id="269" w:author="Claude" w:date="2026-10-28T00:00:00Z">
+      <w:ins w:id="270" w:author="Claude" w:date="2026-10-28T00:00:00Z">
         <w:r>
           <w:rPr>
             <w:b w:val="false"/>
@@ -4516,7 +4525,7 @@
           <w:ins w:id="9027" w:author="Claude" w:date="2026-10-28T00:00:00Z"/>
         </w:rPr>
       </w:pPr>
-      <w:ins w:id="270" w:author="Claude" w:date="2026-10-28T00:00:00Z">
+      <w:ins w:id="271" w:author="Claude" w:date="2026-10-28T00:00:00Z">
         <w:r>
           <w:rPr>
             <w:b w:val="false"/>
@@ -4539,7 +4548,7 @@
           <w:ins w:id="9028" w:author="Claude" w:date="2026-10-28T00:00:00Z"/>
         </w:rPr>
       </w:pPr>
-      <w:ins w:id="271" w:author="Claude" w:date="2026-10-28T00:00:00Z">
+      <w:ins w:id="272" w:author="Claude" w:date="2026-10-28T00:00:00Z">
         <w:r>
           <w:rPr>
             <w:b w:val="false"/>
@@ -4562,7 +4571,7 @@
           <w:ins w:id="9029" w:author="Claude" w:date="2026-10-28T00:00:00Z"/>
         </w:rPr>
       </w:pPr>
-      <w:ins w:id="272" w:author="Claude" w:date="2026-10-28T00:00:00Z">
+      <w:ins w:id="273" w:author="Claude" w:date="2026-10-28T00:00:00Z">
         <w:r>
           <w:rPr>
             <w:b w:val="false"/>
@@ -4580,7 +4589,7 @@
           <w:ins w:id="9030" w:author="Claude" w:date="2026-10-28T00:00:00Z"/>
         </w:rPr>
       </w:pPr>
-      <w:ins w:id="273" w:author="Claude" w:date="2026-10-28T00:00:00Z">
+      <w:ins w:id="274" w:author="Claude" w:date="2026-10-28T00:00:00Z">
         <w:r>
           <w:rPr>
             <w:b/>
@@ -4603,7 +4612,7 @@
           <w:ins w:id="9031" w:author="Claude" w:date="2026-10-28T00:00:00Z"/>
         </w:rPr>
       </w:pPr>
-      <w:ins w:id="274" w:author="Claude" w:date="2026-10-28T00:00:00Z">
+      <w:ins w:id="275" w:author="Claude" w:date="2026-10-28T00:00:00Z">
         <w:r>
           <w:rPr>
             <w:b w:val="false"/>
@@ -4626,7 +4635,7 @@
           <w:ins w:id="9032" w:author="Claude" w:date="2026-10-28T00:00:00Z"/>
         </w:rPr>
       </w:pPr>
-      <w:ins w:id="275" w:author="Claude" w:date="2026-10-28T00:00:00Z">
+      <w:ins w:id="276" w:author="Claude" w:date="2026-10-28T00:00:00Z">
         <w:r>
           <w:rPr>
             <w:b w:val="false"/>
@@ -4649,7 +4658,7 @@
           <w:ins w:id="9033" w:author="Claude" w:date="2026-10-28T00:00:00Z"/>
         </w:rPr>
       </w:pPr>
-      <w:ins w:id="276" w:author="Claude" w:date="2026-10-28T00:00:00Z">
+      <w:ins w:id="277" w:author="Claude" w:date="2026-10-28T00:00:00Z">
         <w:r>
           <w:rPr>
             <w:b w:val="false"/>
@@ -4672,7 +4681,7 @@
           <w:ins w:id="9034" w:author="Claude" w:date="2026-10-28T00:00:00Z"/>
         </w:rPr>
       </w:pPr>
-      <w:ins w:id="277" w:author="Claude" w:date="2026-10-28T00:00:00Z">
+      <w:ins w:id="278" w:author="Claude" w:date="2026-10-28T00:00:00Z">
         <w:r>
           <w:rPr>
             <w:b w:val="false"/>
@@ -4695,7 +4704,7 @@
           <w:ins w:id="9035" w:author="Claude" w:date="2026-10-28T00:00:00Z"/>
         </w:rPr>
       </w:pPr>
-      <w:ins w:id="278" w:author="Claude" w:date="2026-10-28T00:00:00Z">
+      <w:ins w:id="279" w:author="Claude" w:date="2026-10-28T00:00:00Z">
         <w:r>
           <w:rPr>
             <w:b w:val="false"/>
@@ -4718,7 +4727,7 @@
           <w:ins w:id="9036" w:author="Claude" w:date="2026-10-28T00:00:00Z"/>
         </w:rPr>
       </w:pPr>
-      <w:ins w:id="279" w:author="Claude" w:date="2026-10-28T00:00:00Z">
+      <w:ins w:id="280" w:author="Claude" w:date="2026-10-28T00:00:00Z">
         <w:r>
           <w:rPr>
             <w:b w:val="false"/>
@@ -4741,7 +4750,7 @@
           <w:ins w:id="9037" w:author="Claude" w:date="2026-10-28T00:00:00Z"/>
         </w:rPr>
       </w:pPr>
-      <w:ins w:id="280" w:author="Claude" w:date="2026-10-28T00:00:00Z">
+      <w:ins w:id="281" w:author="Claude" w:date="2026-10-28T00:00:00Z">
         <w:r>
           <w:rPr>
             <w:b w:val="false"/>
@@ -4764,7 +4773,7 @@
           <w:ins w:id="9038" w:author="Claude" w:date="2026-10-28T00:00:00Z"/>
         </w:rPr>
       </w:pPr>
-      <w:ins w:id="281" w:author="Claude" w:date="2026-10-28T00:00:00Z">
+      <w:ins w:id="282" w:author="Claude" w:date="2026-10-28T00:00:00Z">
         <w:r>
           <w:rPr>
             <w:b w:val="false"/>
@@ -4787,7 +4796,7 @@
           <w:ins w:id="9039" w:author="Claude" w:date="2026-10-28T00:00:00Z"/>
         </w:rPr>
       </w:pPr>
-      <w:ins w:id="282" w:author="Claude" w:date="2026-10-28T00:00:00Z">
+      <w:ins w:id="283" w:author="Claude" w:date="2026-10-28T00:00:00Z">
         <w:r>
           <w:rPr>
             <w:b w:val="false"/>
@@ -4810,7 +4819,7 @@
           <w:ins w:id="9040" w:author="Claude" w:date="2026-10-28T00:00:00Z"/>
         </w:rPr>
       </w:pPr>
-      <w:ins w:id="283" w:author="Claude" w:date="2026-10-28T00:00:00Z">
+      <w:ins w:id="284" w:author="Claude" w:date="2026-10-28T00:00:00Z">
         <w:r>
           <w:rPr>
             <w:b w:val="false"/>
@@ -4833,7 +4842,7 @@
           <w:ins w:id="9041" w:author="Claude" w:date="2026-10-28T00:00:00Z"/>
         </w:rPr>
       </w:pPr>
-      <w:ins w:id="284" w:author="Claude" w:date="2026-10-28T00:00:00Z">
+      <w:ins w:id="285" w:author="Claude" w:date="2026-10-28T00:00:00Z">
         <w:r>
           <w:rPr>
             <w:b w:val="false"/>
@@ -4856,7 +4865,7 @@
           <w:ins w:id="9042" w:author="Claude" w:date="2026-10-28T00:00:00Z"/>
         </w:rPr>
       </w:pPr>
-      <w:ins w:id="285" w:author="Claude" w:date="2026-10-28T00:00:00Z">
+      <w:ins w:id="286" w:author="Claude" w:date="2026-10-28T00:00:00Z">
         <w:r>
           <w:rPr>
             <w:b w:val="false"/>
@@ -4879,7 +4888,7 @@
           <w:ins w:id="9043" w:author="Claude" w:date="2026-10-28T00:00:00Z"/>
         </w:rPr>
       </w:pPr>
-      <w:ins w:id="286" w:author="Claude" w:date="2026-10-28T00:00:00Z">
+      <w:ins w:id="287" w:author="Claude" w:date="2026-10-28T00:00:00Z">
         <w:r>
           <w:rPr>
             <w:b w:val="false"/>
@@ -4902,7 +4911,7 @@
           <w:ins w:id="9044" w:author="Claude" w:date="2026-10-28T00:00:00Z"/>
         </w:rPr>
       </w:pPr>
-      <w:ins w:id="287" w:author="Claude" w:date="2026-10-28T00:00:00Z">
+      <w:ins w:id="288" w:author="Claude" w:date="2026-10-28T00:00:00Z">
         <w:r>
           <w:rPr>
             <w:b w:val="false"/>
@@ -4920,7 +4929,7 @@
           <w:ins w:id="9045" w:author="Claude" w:date="2026-10-28T00:00:00Z"/>
         </w:rPr>
       </w:pPr>
-      <w:ins w:id="288" w:author="Claude" w:date="2026-10-28T00:00:00Z">
+      <w:ins w:id="289" w:author="Claude" w:date="2026-10-28T00:00:00Z">
         <w:r>
           <w:rPr>
             <w:b/>
@@ -4943,7 +4952,7 @@
           <w:ins w:id="9046" w:author="Claude" w:date="2026-10-28T00:00:00Z"/>
         </w:rPr>
       </w:pPr>
-      <w:ins w:id="289" w:author="Claude" w:date="2026-10-28T00:00:00Z">
+      <w:ins w:id="290" w:author="Claude" w:date="2026-10-28T00:00:00Z">
         <w:r>
           <w:rPr>
             <w:b w:val="false"/>
@@ -4966,7 +4975,7 @@
           <w:ins w:id="9047" w:author="Claude" w:date="2026-10-28T00:00:00Z"/>
         </w:rPr>
       </w:pPr>
-      <w:ins w:id="290" w:author="Claude" w:date="2026-10-28T00:00:00Z">
+      <w:ins w:id="291" w:author="Claude" w:date="2026-10-28T00:00:00Z">
         <w:r>
           <w:rPr>
             <w:b w:val="false"/>
@@ -4989,7 +4998,7 @@
           <w:ins w:id="9048" w:author="Claude" w:date="2026-10-28T00:00:00Z"/>
         </w:rPr>
       </w:pPr>
-      <w:ins w:id="291" w:author="Claude" w:date="2026-10-28T00:00:00Z">
+      <w:ins w:id="292" w:author="Claude" w:date="2026-10-28T00:00:00Z">
         <w:r>
           <w:rPr>
             <w:b w:val="false"/>
@@ -5012,7 +5021,7 @@
           <w:ins w:id="9049" w:author="Claude" w:date="2026-10-28T00:00:00Z"/>
         </w:rPr>
       </w:pPr>
-      <w:ins w:id="292" w:author="Claude" w:date="2026-10-28T00:00:00Z">
+      <w:ins w:id="293" w:author="Claude" w:date="2026-10-28T00:00:00Z">
         <w:r>
           <w:rPr>
             <w:b w:val="false"/>
@@ -5035,7 +5044,7 @@
           <w:ins w:id="9050" w:author="Claude" w:date="2026-10-28T00:00:00Z"/>
         </w:rPr>
       </w:pPr>
-      <w:ins w:id="293" w:author="Claude" w:date="2026-10-28T00:00:00Z">
+      <w:ins w:id="294" w:author="Claude" w:date="2026-10-28T00:00:00Z">
         <w:r>
           <w:rPr>
             <w:b w:val="false"/>
@@ -5058,7 +5067,7 @@
           <w:ins w:id="9051" w:author="Claude" w:date="2026-10-28T00:00:00Z"/>
         </w:rPr>
       </w:pPr>
-      <w:ins w:id="294" w:author="Claude" w:date="2026-10-28T00:00:00Z">
+      <w:ins w:id="295" w:author="Claude" w:date="2026-10-28T00:00:00Z">
         <w:r>
           <w:rPr>
             <w:b w:val="false"/>
@@ -5081,7 +5090,7 @@
           <w:ins w:id="9052" w:author="Claude" w:date="2026-10-28T00:00:00Z"/>
         </w:rPr>
       </w:pPr>
-      <w:ins w:id="295" w:author="Claude" w:date="2026-10-28T00:00:00Z">
+      <w:ins w:id="296" w:author="Claude" w:date="2026-10-28T00:00:00Z">
         <w:r>
           <w:rPr>
             <w:b w:val="false"/>
@@ -5104,7 +5113,7 @@
           <w:ins w:id="9053" w:author="Claude" w:date="2026-10-28T00:00:00Z"/>
         </w:rPr>
       </w:pPr>
-      <w:ins w:id="296" w:author="Claude" w:date="2026-10-28T00:00:00Z">
+      <w:ins w:id="297" w:author="Claude" w:date="2026-10-28T00:00:00Z">
         <w:r>
           <w:rPr>
             <w:b w:val="false"/>
@@ -5127,7 +5136,7 @@
           <w:ins w:id="9054" w:author="Claude" w:date="2026-10-28T00:00:00Z"/>
         </w:rPr>
       </w:pPr>
-      <w:ins w:id="297" w:author="Claude" w:date="2026-10-28T00:00:00Z">
+      <w:ins w:id="298" w:author="Claude" w:date="2026-10-28T00:00:00Z">
         <w:r>
           <w:rPr>
             <w:b w:val="false"/>
@@ -5150,7 +5159,7 @@
           <w:ins w:id="9055" w:author="Claude" w:date="2026-10-28T00:00:00Z"/>
         </w:rPr>
       </w:pPr>
-      <w:ins w:id="298" w:author="Claude" w:date="2026-10-28T00:00:00Z">
+      <w:ins w:id="299" w:author="Claude" w:date="2026-10-28T00:00:00Z">
         <w:r>
           <w:rPr>
             <w:b w:val="false"/>
@@ -5173,7 +5182,7 @@
           <w:ins w:id="9056" w:author="Claude" w:date="2026-10-28T00:00:00Z"/>
         </w:rPr>
       </w:pPr>
-      <w:ins w:id="299" w:author="Claude" w:date="2026-10-28T00:00:00Z">
+      <w:ins w:id="300" w:author="Claude" w:date="2026-10-28T00:00:00Z">
         <w:r>
           <w:rPr>
             <w:b w:val="false"/>
@@ -5196,7 +5205,7 @@
           <w:ins w:id="9057" w:author="Claude" w:date="2026-10-28T00:00:00Z"/>
         </w:rPr>
       </w:pPr>
-      <w:ins w:id="300" w:author="Claude" w:date="2026-10-28T00:00:00Z">
+      <w:ins w:id="301" w:author="Claude" w:date="2026-10-28T00:00:00Z">
         <w:r>
           <w:rPr>
             <w:b w:val="false"/>
@@ -5219,7 +5228,7 @@
           <w:ins w:id="9058" w:author="Claude" w:date="2026-10-28T00:00:00Z"/>
         </w:rPr>
       </w:pPr>
-      <w:ins w:id="301" w:author="Claude" w:date="2026-10-28T00:00:00Z">
+      <w:ins w:id="302" w:author="Claude" w:date="2026-10-28T00:00:00Z">
         <w:r>
           <w:rPr>
             <w:b w:val="false"/>
@@ -5827,7 +5836,7 @@
           <w:sz w:val="18"/>
           <w:szCs w:val="18"/>
         </w:rPr>
-        <w:t xml:space="preserve">Citation corrected and status added. Delhi High Court W.P.(C) 8998 of 2020 confirmed (notice issued 2 December 2020). Supreme Court transfer petition: notice issued 10 October 2023 (Gavai and P.K. Mishra JJ). PLEASE VERIFY: the number "T.P.(C) No. 2567 of 2023" could not be confirmed from public sources; check https://www.sci.gov.in/case-status-case-no/. No statute authorising CMS, NATGRID or NETRA was located.</w:t>
+        <w:t xml:space="preserve">Citation corrected and status added. Delhi High Court W.P.(C) 8998 of 2020 confirmed (notice issued 2 December 2020). Supreme Court transfer petition: notice issued 10 October 2023 (Gavai and P.K. Mishra JJ). No statute authorising CMS, NATGRID or NETRA was located.</w:t>
       </w:r>
     </w:p>
     <w:p>
@@ -5846,6 +5855,24 @@
           <w:szCs w:val="18"/>
         </w:rPr>
         <w:t xml:space="preserve">[S] Outlook/PTI: https://www.outlookindia.com/national/sc-seeks-centre-s-stand-on-plea-for-transfer-of-pil-against-netra-natgrid-surveillance-systems-news-326396</w:t>
+      </w:r>
+    </w:p>
+    <w:p>
+      <w:r>
+        <w:rPr>
+          <w:sz w:val="18"/>
+          <w:szCs w:val="18"/>
+        </w:rPr>
+        <w:t xml:space="preserve">UPDATED 30 Oct 2026 (verified): the number T.P.(C) No. 2567 of 2023 is CORRECT. The Supreme Court allowed the transfer petition on 19.03.2025 (Gavai and Masih JJ), directing that W.P.(C) 8998/2020 be heard with W.P.(C) Nos. 61/2019 and 13/2019; the Delhi HC recorded this on 01.04.2025.</w:t>
+      </w:r>
+    </w:p>
+    <w:p>
+      <w:r>
+        <w:rPr>
+          <w:sz w:val="18"/>
+          <w:szCs w:val="18"/>
+        </w:rPr>
+        <w:t xml:space="preserve">[P] SC order 19.03.2025 (Indian Kanoon): https://indiankanoon.org/doc/20444095/ ; SC ROP 10.10.2023: https://indiankanoon.org/doc/61475422/ ; DHC order 01.04.2025: https://indiankanoon.org/doc/31142618/</w:t>
       </w:r>
     </w:p>
   </w:comment>
@@ -5983,7 +6010,7 @@
           <w:sz w:val="18"/>
           <w:szCs w:val="18"/>
         </w:rPr>
-        <w:t xml:space="preserve">Corrected spelling and citation: Vinit Kumar v. CBI, Bombay High Court, Criminal Writ Petition No. 2367 of 2019, decided 22 October 2019 (Ranjit More and N.J. Jamdar JJ). No reported reversal located.</w:t>
+        <w:t xml:space="preserve">Corrected spelling and citation: Vinit Kumar v. CBI, Bombay High Court, Criminal Writ Petition No. 2367 of 2019, decided 22 October 2019 (Ranjit More and N.J. Jamdar JJ). See the update below on the pending appeal.</w:t>
       </w:r>
     </w:p>
     <w:p>
@@ -5993,6 +6020,24 @@
           <w:szCs w:val="18"/>
         </w:rPr>
         <w:t xml:space="preserve">[P] Signed judgment (hosted by Columbia Global Freedom of Expression): https://globalfreedomofexpression.columbia.edu/wp-content/uploads/2019/12/Official-Judgment.pdf</w:t>
+      </w:r>
+    </w:p>
+    <w:p>
+      <w:r>
+        <w:rPr>
+          <w:sz w:val="18"/>
+          <w:szCs w:val="18"/>
+        </w:rPr>
+        <w:t xml:space="preserve">UPDATED 30 Oct 2026: the CBI's SLP (Crl.) No. 902/2020 against this judgment is pending (SC records of proceedings of 06.12.2021 and 05.01.2024). A June 2020 commentary reports a stay; the stay order itself was not located.</w:t>
+      </w:r>
+    </w:p>
+    <w:p>
+      <w:r>
+        <w:rPr>
+          <w:sz w:val="18"/>
+          <w:szCs w:val="18"/>
+        </w:rPr>
+        <w:t xml:space="preserve">[P] SC ROP 05.01.2024 (Indian Kanoon): https://indiankanoon.org/doc/162808939/ ; [P] SC office report: https://api.sci.gov.in/officereport/2020/1353/1353_2020_2020-02-10_195.html</w:t>
       </w:r>
     </w:p>
   </w:comment>
@@ -6024,6 +6069,24 @@
         <w:t xml:space="preserve">[S] Business Standard (29 April 2025): https://business-standard.com/india-news/supreme-court-says-technical-report-on-pegasus-will-not-be-made-public-125042900434_1.html</w:t>
       </w:r>
     </w:p>
+    <w:p>
+      <w:r>
+        <w:rPr>
+          <w:sz w:val="18"/>
+          <w:szCs w:val="18"/>
+        </w:rPr>
+        <w:t xml:space="preserve">UPDATED 30 Oct 2026: the SC record of proceedings of 25.08.2022 confirms that the reports were taken on record in sealed cover and portions were read out; the '5 of 29 phones' finding comes from press reports of that hearing, not from the signed order.</w:t>
+      </w:r>
+    </w:p>
+    <w:p>
+      <w:r>
+        <w:rPr>
+          <w:sz w:val="18"/>
+          <w:szCs w:val="18"/>
+        </w:rPr>
+        <w:t xml:space="preserve">[P] ROP 25.08.2022 (Indian Kanoon): https://indiankanoon.org/doc/117902715/</w:t>
+      </w:r>
+    </w:p>
   </w:comment>
   <w:comment w:id="27" w:initials="CL" w:author="Claude" w:date="2026-10-28T00:00:00.000Z">
     <w:p>
@@ -6122,6 +6185,24 @@
         <w:t xml:space="preserve">[S] Business Standard (29 April 2025): https://business-standard.com/india-news/supreme-court-says-technical-report-on-pegasus-will-not-be-made-public-125042900434_1.html</w:t>
       </w:r>
     </w:p>
+    <w:p>
+      <w:r>
+        <w:rPr>
+          <w:sz w:val="18"/>
+          <w:szCs w:val="18"/>
+        </w:rPr>
+        <w:t xml:space="preserve">UPDATED 30 Oct 2026: the ROP of 22.04.2025 lists the matter for 29.04.2025; no signed order recording the non-disclosure statement was located, so it is attributed to press reports.</w:t>
+      </w:r>
+    </w:p>
+    <w:p>
+      <w:r>
+        <w:rPr>
+          <w:sz w:val="18"/>
+          <w:szCs w:val="18"/>
+        </w:rPr>
+        <w:t xml:space="preserve">[P] ROP 22.04.2025 (Indian Kanoon): https://indiankanoon.org/doc/96841127/</w:t>
+      </w:r>
+    </w:p>
   </w:comment>
   <w:comment w:id="31" w:initials="CL" w:author="Claude" w:date="2026-10-28T00:00:00.000Z">
     <w:p>
@@ -6180,6 +6261,24 @@
         <w:t xml:space="preserve">[S] LiveLaw (WhatsApp challenge): https://www.livelaw.in/top-stories/delhi-high-court-notice-centre-whatsapps-plea-challenging-traceability-clause-under-it-rules-2021-180387</w:t>
       </w:r>
     </w:p>
+    <w:p>
+      <w:r>
+        <w:rPr>
+          <w:sz w:val="18"/>
+          <w:szCs w:val="18"/>
+        </w:rPr>
+        <w:t xml:space="preserve">UPDATED 30 Oct 2026: Delhi HC order of 14.07.2026 in the batch including W.P.(C) 7284/2021 (WhatsApp) records that the subject is 'in active consideration before the Government' and re-lists the matters on 17.11.2026.</w:t>
+      </w:r>
+    </w:p>
+    <w:p>
+      <w:r>
+        <w:rPr>
+          <w:sz w:val="18"/>
+          <w:szCs w:val="18"/>
+        </w:rPr>
+        <w:t xml:space="preserve">[P] DHC order 14.07.2026 (Indian Kanoon): https://indiankanoon.org/doc/62459562/</w:t>
+      </w:r>
+    </w:p>
   </w:comment>
   <w:comment w:id="33" w:initials="CL" w:author="Claude" w:date="2026-10-28T00:00:00.000Z">
     <w:p>
@@ -6341,6 +6440,24 @@
         <w:t xml:space="preserve">[S] LiveLaw (DNPA, 27.10.2026): https://www.livelaw.in/top-stories/newsrooms-will-shutdown-digital-wings-of-legacy-media-move-supreme-court-challenging-personal-data-protection-law-556103</w:t>
       </w:r>
     </w:p>
+    <w:p>
+      <w:r>
+        <w:rPr>
+          <w:sz w:val="18"/>
+          <w:szCs w:val="18"/>
+        </w:rPr>
+        <w:t xml:space="preserve">UPDATED 30 Oct 2026 (CORRECTION): the signed ROPs of 23.03.2026 and 07.08.2026 show the matters still before a three-judge bench (CJI, Bagchi J, and Pancholi J / V. Mohana J), with W.P.(C) Nos. 211, 212, 275, 286, 447, 655 and 722 of 2026 tagged. The earlier press report of a reference to a larger bench is not reflected in these orders. DNPA ROP 27.10.2026: notice issued; tagged with W.P.(C) 177/2026.</w:t>
+      </w:r>
+    </w:p>
+    <w:p>
+      <w:r>
+        <w:rPr>
+          <w:sz w:val="18"/>
+          <w:szCs w:val="18"/>
+        </w:rPr>
+        <w:t xml:space="preserve">[P] ROP 23.03.2026: https://indiankanoon.org/doc/15439728/ ; ROP 07.08.2026: https://indiankanoon.org/doc/168596788/ ; DNPA ROP 27.10.2026: https://indiankanoon.org/doc/140217908/</w:t>
+      </w:r>
+    </w:p>
   </w:comment>
   <w:comment w:id="37" w:initials="CL" w:author="Claude" w:date="2026-10-28T00:00:00.000Z">
     <w:p>
@@ -6416,7 +6533,7 @@
           <w:sz w:val="18"/>
           <w:szCs w:val="18"/>
         </w:rPr>
-        <w:t xml:space="preserve">Added. Verified against the signed judgment (Ramesh Sinha CJ and Ravindra Kumar Agrawal J., 03.08.2026; 2026:CGHC:33468-DB). The judgment also records counsel's reliance on Jatinder Pal Singh v. CBI (Del HC, 2022), Dr. S.M. Mannan v. CBI (Kar HC, 2024) and K.L.D. Nagasree v. Government of India (AP HC, said to have been affirmed by the Supreme Court on 15.04.2025 in SLP (Crl.) 5584/2025). These were not independently verified.</w:t>
+        <w:t xml:space="preserve">Added. Verified against the signed judgment (Ramesh Sinha CJ and Ravindra Kumar Agrawal J., 03.08.2026; 2026:CGHC:33468-DB). The judgment also records counsel's reliance on Jatinder Pal Singh v. CBI (Del HC, 2022), Dr. S.M. Mannan v. CBI (Kar HC, 2024) and K.L.D. Nagasree v. Government of India (AP HC, said to have been affirmed by the Supreme Court on 15.04.2025 in SLP (Crl.) 5584/2025). Nagasree and Mannan were later verified (see update below); Jatinder Pal Singh is at https://indiankanoon.org/doc/183922940/.</w:t>
       </w:r>
     </w:p>
     <w:p>
@@ -6435,6 +6552,24 @@
           <w:szCs w:val="18"/>
         </w:rPr>
         <w:t xml:space="preserve">[S] Verdictum: https://www.verdictum.in/chhattisgarh-high-court/shri-ravi-shankar-ji-maharaj-v-central-bureau-of-investigation-2026cghc33468-d-phone-tapping-home-ministry-nor-review-committee-1619442</w:t>
+      </w:r>
+    </w:p>
+    <w:p>
+      <w:r>
+        <w:rPr>
+          <w:sz w:val="18"/>
+          <w:szCs w:val="18"/>
+        </w:rPr>
+        <w:t xml:space="preserve">UPDATED 30 Oct 2026 (verified): K.L.D. Nagasree (AP HC, 11.12.2006) was affirmed by an AP Division Bench on 20.07.2023 (W.A. 70/2007). The CBI's SLP (Crl.) 5584/2025 was dismissed on 15.04.2025 'leaving the question of law open', and the review was dismissed on 21.01.2026, so the Supreme Court has not decided the point. Dr S.M. Mannan v. CBI (Kar HC, 22.04.2024) is under appeal in SLP (Crl.) 15787/2024 (pending).</w:t>
+      </w:r>
+    </w:p>
+    <w:p>
+      <w:r>
+        <w:rPr>
+          <w:sz w:val="18"/>
+          <w:szCs w:val="18"/>
+        </w:rPr>
+        <w:t xml:space="preserve">[P] SC ROP 15.04.2025: https://indiankanoon.org/doc/125457235/ ; review 21.01.2026: https://indiankanoon.org/doc/153628091/ ; Mannan SLP ROP 23.04.2025: https://indiankanoon.org/doc/54916922/</w:t>
       </w:r>
     </w:p>
   </w:comment>
@@ -6520,6 +6655,24 @@
           <w:szCs w:val="18"/>
         </w:rPr>
         <w:t xml:space="preserve">[S] SC Observer case page: https://www.scobserver.in/cases/guidelines-for-search-and-seizure-of-digital-devices-foundation-for-media-professionals-v-union-of-india/</w:t>
+      </w:r>
+    </w:p>
+    <w:p>
+      <w:r>
+        <w:rPr>
+          <w:sz w:val="18"/>
+          <w:szCs w:val="18"/>
+        </w:rPr>
+        <w:t xml:space="preserve">UPDATED 30 Oct 2026: both matters are in the same batch; ROP of 06.02.2026 (CJI Surya Kant and Bagchi J) continues interim orders and lists the batch on 14.04.2026; no later order located.</w:t>
+      </w:r>
+    </w:p>
+    <w:p>
+      <w:r>
+        <w:rPr>
+          <w:sz w:val="18"/>
+          <w:szCs w:val="18"/>
+        </w:rPr>
+        <w:t xml:space="preserve">[P] ROP 06.02.2026 (Indian Kanoon): https://indiankanoon.org/doc/25058995/ ; FMP ROP 07.11.2023: https://indiankanoon.org/doc/89801401/</w:t>
       </w:r>
     </w:p>
   </w:comment>

</xml_diff>